<commit_message>
Redesign Pages instruction with right-aligned downloads and TD PDF.
Tighten the guide UX (facts, progress, mobile nav), ship Word+PDF for the labor contract, put employer/employee requisites side-by-side, and give each worker scan its own download button.
</commit_message>
<xml_diff>
--- a/docs/трудовой-договор/трудовой-договор-Ходжиматов-бессрочный-01.08.2026.docx
+++ b/docs/трудовой-договор/трудовой-договор-Ходжиматов-бессрочный-01.08.2026.docx
@@ -1080,968 +1080,1118 @@
         <w:t>10. РЕКВИЗИТЫ И ПОДПИСИ СТОРОН</w:t>
       </w:r>
     </w:p>
-    <w:p>
-      <w:pPr>
-        <w:spacing w:after="80"/>
-        <w:jc w:val="left"/>
-      </w:pPr>
-      <w:r>
-        <w:rPr>
-          <w:rFonts w:ascii="Calibri" w:hAnsi="Calibri" w:eastAsia="Calibri"/>
-          <w:b/>
-          <w:color w:val="1A1A1A"/>
-          <w:sz w:val="22"/>
-        </w:rPr>
-        <w:t>РАБОТОДАТЕЛЬ</w:t>
-      </w:r>
-    </w:p>
     <w:tbl>
       <w:tblPr>
-        <w:tblW w:type="auto" w:w="0"/>
-        <w:jc w:val="left"/>
+        <w:tblW w:type="dxa" w:w="6480810"/>
         <w:tblLook w:firstColumn="1" w:firstRow="1" w:lastColumn="0" w:lastRow="0" w:noHBand="0" w:noVBand="1" w:val="04A0"/>
         <w:tblBorders>
-          <w:top w:val="single" w:sz="4" w:space="0" w:color="AAAAAA"/>
-          <w:left w:val="single" w:sz="4" w:space="0" w:color="AAAAAA"/>
-          <w:bottom w:val="single" w:sz="4" w:space="0" w:color="AAAAAA"/>
-          <w:right w:val="single" w:sz="4" w:space="0" w:color="AAAAAA"/>
-          <w:insideH w:val="single" w:sz="4" w:space="0" w:color="AAAAAA"/>
-          <w:insideV w:val="single" w:sz="4" w:space="0" w:color="AAAAAA"/>
+          <w:top w:val="nil" w:sz="0" w:space="0" w:color="auto"/>
+          <w:left w:val="nil" w:sz="0" w:space="0" w:color="auto"/>
+          <w:bottom w:val="nil" w:sz="0" w:space="0" w:color="auto"/>
+          <w:right w:val="nil" w:sz="0" w:space="0" w:color="auto"/>
+          <w:insideH w:val="nil" w:sz="0" w:space="0" w:color="auto"/>
+          <w:insideV w:val="nil" w:sz="0" w:space="0" w:color="auto"/>
         </w:tblBorders>
+        <w:tblLayout w:type="fixed"/>
       </w:tblPr>
       <w:tblGrid>
-        <w:gridCol w:w="4844"/>
-        <w:gridCol w:w="4844"/>
+        <w:gridCol w:w="5270"/>
+        <w:gridCol w:w="5270"/>
       </w:tblGrid>
       <w:tr>
         <w:tc>
           <w:tcPr>
-            <w:tcW w:type="dxa" w:w="1814"/>
-            <w:shd w:fill="F5F5F5" w:val="clear"/>
+            <w:tcW w:type="dxa" w:w="5103"/>
+            <w:tcMar>
+              <w:top w:w="40" w:type="dxa"/>
+              <w:left w:w="40" w:type="dxa"/>
+              <w:bottom w:w="40" w:type="dxa"/>
+              <w:right w:w="80" w:type="dxa"/>
+            </w:tcMar>
           </w:tcPr>
+          <w:p/>
           <w:p>
             <w:pPr>
-              <w:spacing w:after="0"/>
-              <w:jc w:val="left"/>
+              <w:spacing w:before="0" w:after="120" w:line="252" w:lineRule="auto"/>
+              <w:jc w:val="center"/>
             </w:pPr>
-            <w:r/>
             <w:r>
               <w:rPr>
-                <w:rFonts w:ascii="Calibri" w:hAnsi="Calibri" w:eastAsia="Calibri"/>
+                <w:rFonts w:ascii="Times New Roman" w:hAnsi="Times New Roman" w:cs="Times New Roman" w:eastAsia="Times New Roman"/>
                 <w:b/>
-                <w:color w:val="1A1A1A"/>
                 <w:sz w:val="20"/>
               </w:rPr>
-              <w:t>Статус</w:t>
+              <w:t>РАБОТОДАТЕЛЬ</w:t>
+            </w:r>
+          </w:p>
+          <w:tbl>
+            <w:tblPr>
+              <w:tblStyle w:val="TableGrid"/>
+              <w:tblW w:type="auto" w:w="0"/>
+              <w:tblLook w:firstColumn="1" w:firstRow="1" w:lastColumn="0" w:lastRow="0" w:noHBand="0" w:noVBand="1" w:val="04A0"/>
+            </w:tblPr>
+            <w:tblGrid>
+              <w:gridCol w:w="2551"/>
+              <w:gridCol w:w="2551"/>
+            </w:tblGrid>
+            <w:tr>
+              <w:tc>
+                <w:tcPr>
+                  <w:tcW w:type="dxa" w:w="1247"/>
+                  <w:tcMar>
+                    <w:top w:w="30" w:type="dxa"/>
+                    <w:left w:w="40" w:type="dxa"/>
+                    <w:bottom w:w="30" w:type="dxa"/>
+                    <w:right w:w="40" w:type="dxa"/>
+                  </w:tcMar>
+                </w:tcPr>
+                <w:p>
+                  <w:pPr>
+                    <w:spacing w:before="0" w:after="0"/>
+                  </w:pPr>
+                  <w:r>
+                    <w:rPr>
+                      <w:rFonts w:ascii="Times New Roman" w:hAnsi="Times New Roman" w:cs="Times New Roman" w:eastAsia="Times New Roman"/>
+                      <w:b/>
+                      <w:sz w:val="16"/>
+                    </w:rPr>
+                    <w:t>Статус</w:t>
+                  </w:r>
+                </w:p>
+              </w:tc>
+              <w:tc>
+                <w:tcPr>
+                  <w:tcW w:type="dxa" w:w="3629"/>
+                  <w:tcMar>
+                    <w:top w:w="30" w:type="dxa"/>
+                    <w:left w:w="40" w:type="dxa"/>
+                    <w:bottom w:w="30" w:type="dxa"/>
+                    <w:right w:w="40" w:type="dxa"/>
+                  </w:tcMar>
+                </w:tcPr>
+                <w:p>
+                  <w:pPr>
+                    <w:spacing w:before="0" w:after="0"/>
+                  </w:pPr>
+                  <w:r>
+                    <w:rPr>
+                      <w:rFonts w:ascii="Times New Roman" w:hAnsi="Times New Roman" w:cs="Times New Roman" w:eastAsia="Times New Roman"/>
+                      <w:b w:val="0"/>
+                      <w:sz w:val="16"/>
+                    </w:rPr>
+                    <w:t>Индивидуальный предприниматель Сорванова Анна Александровна</w:t>
+                  </w:r>
+                </w:p>
+              </w:tc>
+            </w:tr>
+            <w:tr>
+              <w:tc>
+                <w:tcPr>
+                  <w:tcW w:type="dxa" w:w="1247"/>
+                  <w:tcMar>
+                    <w:top w:w="30" w:type="dxa"/>
+                    <w:left w:w="40" w:type="dxa"/>
+                    <w:bottom w:w="30" w:type="dxa"/>
+                    <w:right w:w="40" w:type="dxa"/>
+                  </w:tcMar>
+                </w:tcPr>
+                <w:p>
+                  <w:pPr>
+                    <w:spacing w:before="0" w:after="0"/>
+                  </w:pPr>
+                  <w:r>
+                    <w:rPr>
+                      <w:rFonts w:ascii="Times New Roman" w:hAnsi="Times New Roman" w:cs="Times New Roman" w:eastAsia="Times New Roman"/>
+                      <w:b/>
+                      <w:sz w:val="16"/>
+                    </w:rPr>
+                    <w:t>ОГРНИП</w:t>
+                  </w:r>
+                </w:p>
+              </w:tc>
+              <w:tc>
+                <w:tcPr>
+                  <w:tcW w:type="dxa" w:w="3629"/>
+                  <w:tcMar>
+                    <w:top w:w="30" w:type="dxa"/>
+                    <w:left w:w="40" w:type="dxa"/>
+                    <w:bottom w:w="30" w:type="dxa"/>
+                    <w:right w:w="40" w:type="dxa"/>
+                  </w:tcMar>
+                </w:tcPr>
+                <w:p>
+                  <w:pPr>
+                    <w:spacing w:before="0" w:after="0"/>
+                  </w:pPr>
+                  <w:r>
+                    <w:rPr>
+                      <w:rFonts w:ascii="Times New Roman" w:hAnsi="Times New Roman" w:cs="Times New Roman" w:eastAsia="Times New Roman"/>
+                      <w:b w:val="0"/>
+                      <w:sz w:val="16"/>
+                    </w:rPr>
+                    <w:t>322774600583080</w:t>
+                  </w:r>
+                </w:p>
+              </w:tc>
+            </w:tr>
+            <w:tr>
+              <w:tc>
+                <w:tcPr>
+                  <w:tcW w:type="dxa" w:w="1247"/>
+                  <w:tcMar>
+                    <w:top w:w="30" w:type="dxa"/>
+                    <w:left w:w="40" w:type="dxa"/>
+                    <w:bottom w:w="30" w:type="dxa"/>
+                    <w:right w:w="40" w:type="dxa"/>
+                  </w:tcMar>
+                </w:tcPr>
+                <w:p>
+                  <w:pPr>
+                    <w:spacing w:before="0" w:after="0"/>
+                  </w:pPr>
+                  <w:r>
+                    <w:rPr>
+                      <w:rFonts w:ascii="Times New Roman" w:hAnsi="Times New Roman" w:cs="Times New Roman" w:eastAsia="Times New Roman"/>
+                      <w:b/>
+                      <w:sz w:val="16"/>
+                    </w:rPr>
+                    <w:t>ИНН</w:t>
+                  </w:r>
+                </w:p>
+              </w:tc>
+              <w:tc>
+                <w:tcPr>
+                  <w:tcW w:type="dxa" w:w="3629"/>
+                  <w:tcMar>
+                    <w:top w:w="30" w:type="dxa"/>
+                    <w:left w:w="40" w:type="dxa"/>
+                    <w:bottom w:w="30" w:type="dxa"/>
+                    <w:right w:w="40" w:type="dxa"/>
+                  </w:tcMar>
+                </w:tcPr>
+                <w:p>
+                  <w:pPr>
+                    <w:spacing w:before="0" w:after="0"/>
+                  </w:pPr>
+                  <w:r>
+                    <w:rPr>
+                      <w:rFonts w:ascii="Times New Roman" w:hAnsi="Times New Roman" w:cs="Times New Roman" w:eastAsia="Times New Roman"/>
+                      <w:b w:val="0"/>
+                      <w:sz w:val="16"/>
+                    </w:rPr>
+                    <w:t>772973703990</w:t>
+                  </w:r>
+                </w:p>
+              </w:tc>
+            </w:tr>
+            <w:tr>
+              <w:tc>
+                <w:tcPr>
+                  <w:tcW w:type="dxa" w:w="1247"/>
+                  <w:tcMar>
+                    <w:top w:w="30" w:type="dxa"/>
+                    <w:left w:w="40" w:type="dxa"/>
+                    <w:bottom w:w="30" w:type="dxa"/>
+                    <w:right w:w="40" w:type="dxa"/>
+                  </w:tcMar>
+                </w:tcPr>
+                <w:p>
+                  <w:pPr>
+                    <w:spacing w:before="0" w:after="0"/>
+                  </w:pPr>
+                  <w:r>
+                    <w:rPr>
+                      <w:rFonts w:ascii="Times New Roman" w:hAnsi="Times New Roman" w:cs="Times New Roman" w:eastAsia="Times New Roman"/>
+                      <w:b/>
+                      <w:sz w:val="16"/>
+                    </w:rPr>
+                    <w:t>Адрес</w:t>
+                  </w:r>
+                </w:p>
+              </w:tc>
+              <w:tc>
+                <w:tcPr>
+                  <w:tcW w:type="dxa" w:w="3629"/>
+                  <w:tcMar>
+                    <w:top w:w="30" w:type="dxa"/>
+                    <w:left w:w="40" w:type="dxa"/>
+                    <w:bottom w:w="30" w:type="dxa"/>
+                    <w:right w:w="40" w:type="dxa"/>
+                  </w:tcMar>
+                </w:tcPr>
+                <w:p>
+                  <w:pPr>
+                    <w:spacing w:before="0" w:after="0"/>
+                  </w:pPr>
+                  <w:r>
+                    <w:rPr>
+                      <w:rFonts w:ascii="Times New Roman" w:hAnsi="Times New Roman" w:cs="Times New Roman" w:eastAsia="Times New Roman"/>
+                      <w:b w:val="0"/>
+                      <w:sz w:val="16"/>
+                    </w:rPr>
+                    <w:t>г. Москва, ул. Василия Ланового, д. 3, кв. 243</w:t>
+                  </w:r>
+                </w:p>
+              </w:tc>
+            </w:tr>
+            <w:tr>
+              <w:tc>
+                <w:tcPr>
+                  <w:tcW w:type="dxa" w:w="1247"/>
+                  <w:tcMar>
+                    <w:top w:w="30" w:type="dxa"/>
+                    <w:left w:w="40" w:type="dxa"/>
+                    <w:bottom w:w="30" w:type="dxa"/>
+                    <w:right w:w="40" w:type="dxa"/>
+                  </w:tcMar>
+                </w:tcPr>
+                <w:p>
+                  <w:pPr>
+                    <w:spacing w:before="0" w:after="0"/>
+                  </w:pPr>
+                  <w:r>
+                    <w:rPr>
+                      <w:rFonts w:ascii="Times New Roman" w:hAnsi="Times New Roman" w:cs="Times New Roman" w:eastAsia="Times New Roman"/>
+                      <w:b/>
+                      <w:sz w:val="16"/>
+                    </w:rPr>
+                    <w:t>р/с</w:t>
+                  </w:r>
+                </w:p>
+              </w:tc>
+              <w:tc>
+                <w:tcPr>
+                  <w:tcW w:type="dxa" w:w="3629"/>
+                  <w:tcMar>
+                    <w:top w:w="30" w:type="dxa"/>
+                    <w:left w:w="40" w:type="dxa"/>
+                    <w:bottom w:w="30" w:type="dxa"/>
+                    <w:right w:w="40" w:type="dxa"/>
+                  </w:tcMar>
+                </w:tcPr>
+                <w:p>
+                  <w:pPr>
+                    <w:spacing w:before="0" w:after="0"/>
+                  </w:pPr>
+                  <w:r>
+                    <w:rPr>
+                      <w:rFonts w:ascii="Times New Roman" w:hAnsi="Times New Roman" w:cs="Times New Roman" w:eastAsia="Times New Roman"/>
+                      <w:b w:val="0"/>
+                      <w:sz w:val="16"/>
+                    </w:rPr>
+                    <w:t>40802810370010393644</w:t>
+                  </w:r>
+                </w:p>
+              </w:tc>
+            </w:tr>
+            <w:tr>
+              <w:tc>
+                <w:tcPr>
+                  <w:tcW w:type="dxa" w:w="1247"/>
+                  <w:tcMar>
+                    <w:top w:w="30" w:type="dxa"/>
+                    <w:left w:w="40" w:type="dxa"/>
+                    <w:bottom w:w="30" w:type="dxa"/>
+                    <w:right w:w="40" w:type="dxa"/>
+                  </w:tcMar>
+                </w:tcPr>
+                <w:p>
+                  <w:pPr>
+                    <w:spacing w:before="0" w:after="0"/>
+                  </w:pPr>
+                  <w:r>
+                    <w:rPr>
+                      <w:rFonts w:ascii="Times New Roman" w:hAnsi="Times New Roman" w:cs="Times New Roman" w:eastAsia="Times New Roman"/>
+                      <w:b/>
+                      <w:sz w:val="16"/>
+                    </w:rPr>
+                    <w:t>Банк</w:t>
+                  </w:r>
+                </w:p>
+              </w:tc>
+              <w:tc>
+                <w:tcPr>
+                  <w:tcW w:type="dxa" w:w="3629"/>
+                  <w:tcMar>
+                    <w:top w:w="30" w:type="dxa"/>
+                    <w:left w:w="40" w:type="dxa"/>
+                    <w:bottom w:w="30" w:type="dxa"/>
+                    <w:right w:w="40" w:type="dxa"/>
+                  </w:tcMar>
+                </w:tcPr>
+                <w:p>
+                  <w:pPr>
+                    <w:spacing w:before="0" w:after="0"/>
+                  </w:pPr>
+                  <w:r>
+                    <w:rPr>
+                      <w:rFonts w:ascii="Times New Roman" w:hAnsi="Times New Roman" w:cs="Times New Roman" w:eastAsia="Times New Roman"/>
+                      <w:b w:val="0"/>
+                      <w:sz w:val="16"/>
+                    </w:rPr>
+                    <w:t>МОСКОВСКИЙ ФИЛИАЛ АО КБ "МОДУЛЬБАНК"</w:t>
+                  </w:r>
+                </w:p>
+              </w:tc>
+            </w:tr>
+            <w:tr>
+              <w:tc>
+                <w:tcPr>
+                  <w:tcW w:type="dxa" w:w="1247"/>
+                  <w:tcMar>
+                    <w:top w:w="30" w:type="dxa"/>
+                    <w:left w:w="40" w:type="dxa"/>
+                    <w:bottom w:w="30" w:type="dxa"/>
+                    <w:right w:w="40" w:type="dxa"/>
+                  </w:tcMar>
+                </w:tcPr>
+                <w:p>
+                  <w:pPr>
+                    <w:spacing w:before="0" w:after="0"/>
+                  </w:pPr>
+                  <w:r>
+                    <w:rPr>
+                      <w:rFonts w:ascii="Times New Roman" w:hAnsi="Times New Roman" w:cs="Times New Roman" w:eastAsia="Times New Roman"/>
+                      <w:b/>
+                      <w:sz w:val="16"/>
+                    </w:rPr>
+                    <w:t>БИК</w:t>
+                  </w:r>
+                </w:p>
+              </w:tc>
+              <w:tc>
+                <w:tcPr>
+                  <w:tcW w:type="dxa" w:w="3629"/>
+                  <w:tcMar>
+                    <w:top w:w="30" w:type="dxa"/>
+                    <w:left w:w="40" w:type="dxa"/>
+                    <w:bottom w:w="30" w:type="dxa"/>
+                    <w:right w:w="40" w:type="dxa"/>
+                  </w:tcMar>
+                </w:tcPr>
+                <w:p>
+                  <w:pPr>
+                    <w:spacing w:before="0" w:after="0"/>
+                  </w:pPr>
+                  <w:r>
+                    <w:rPr>
+                      <w:rFonts w:ascii="Times New Roman" w:hAnsi="Times New Roman" w:cs="Times New Roman" w:eastAsia="Times New Roman"/>
+                      <w:b w:val="0"/>
+                      <w:sz w:val="16"/>
+                    </w:rPr>
+                    <w:t>044525092</w:t>
+                  </w:r>
+                </w:p>
+              </w:tc>
+            </w:tr>
+            <w:tr>
+              <w:tc>
+                <w:tcPr>
+                  <w:tcW w:type="dxa" w:w="1247"/>
+                  <w:tcMar>
+                    <w:top w:w="30" w:type="dxa"/>
+                    <w:left w:w="40" w:type="dxa"/>
+                    <w:bottom w:w="30" w:type="dxa"/>
+                    <w:right w:w="40" w:type="dxa"/>
+                  </w:tcMar>
+                </w:tcPr>
+                <w:p>
+                  <w:pPr>
+                    <w:spacing w:before="0" w:after="0"/>
+                  </w:pPr>
+                  <w:r>
+                    <w:rPr>
+                      <w:rFonts w:ascii="Times New Roman" w:hAnsi="Times New Roman" w:cs="Times New Roman" w:eastAsia="Times New Roman"/>
+                      <w:b/>
+                      <w:sz w:val="16"/>
+                    </w:rPr>
+                    <w:t>к/с</w:t>
+                  </w:r>
+                </w:p>
+              </w:tc>
+              <w:tc>
+                <w:tcPr>
+                  <w:tcW w:type="dxa" w:w="3629"/>
+                  <w:tcMar>
+                    <w:top w:w="30" w:type="dxa"/>
+                    <w:left w:w="40" w:type="dxa"/>
+                    <w:bottom w:w="30" w:type="dxa"/>
+                    <w:right w:w="40" w:type="dxa"/>
+                  </w:tcMar>
+                </w:tcPr>
+                <w:p>
+                  <w:pPr>
+                    <w:spacing w:before="0" w:after="0"/>
+                  </w:pPr>
+                  <w:r>
+                    <w:rPr>
+                      <w:rFonts w:ascii="Times New Roman" w:hAnsi="Times New Roman" w:cs="Times New Roman" w:eastAsia="Times New Roman"/>
+                      <w:b w:val="0"/>
+                      <w:sz w:val="16"/>
+                    </w:rPr>
+                    <w:t>30101810645250000092</w:t>
+                  </w:r>
+                </w:p>
+              </w:tc>
+            </w:tr>
+            <w:tr>
+              <w:tc>
+                <w:tcPr>
+                  <w:tcW w:type="dxa" w:w="1247"/>
+                  <w:tcMar>
+                    <w:top w:w="30" w:type="dxa"/>
+                    <w:left w:w="40" w:type="dxa"/>
+                    <w:bottom w:w="30" w:type="dxa"/>
+                    <w:right w:w="40" w:type="dxa"/>
+                  </w:tcMar>
+                </w:tcPr>
+                <w:p>
+                  <w:pPr>
+                    <w:spacing w:before="0" w:after="0"/>
+                  </w:pPr>
+                  <w:r>
+                    <w:rPr>
+                      <w:rFonts w:ascii="Times New Roman" w:hAnsi="Times New Roman" w:cs="Times New Roman" w:eastAsia="Times New Roman"/>
+                      <w:b/>
+                      <w:sz w:val="16"/>
+                    </w:rPr>
+                    <w:t>E-mail</w:t>
+                  </w:r>
+                </w:p>
+              </w:tc>
+              <w:tc>
+                <w:tcPr>
+                  <w:tcW w:type="dxa" w:w="3629"/>
+                  <w:tcMar>
+                    <w:top w:w="30" w:type="dxa"/>
+                    <w:left w:w="40" w:type="dxa"/>
+                    <w:bottom w:w="30" w:type="dxa"/>
+                    <w:right w:w="40" w:type="dxa"/>
+                  </w:tcMar>
+                </w:tcPr>
+                <w:p>
+                  <w:pPr>
+                    <w:spacing w:before="0" w:after="0"/>
+                  </w:pPr>
+                  <w:r>
+                    <w:rPr>
+                      <w:rFonts w:ascii="Times New Roman" w:hAnsi="Times New Roman" w:cs="Times New Roman" w:eastAsia="Times New Roman"/>
+                      <w:b w:val="0"/>
+                      <w:sz w:val="16"/>
+                    </w:rPr>
+                    <w:t>SORVANOVAAA@GMAIL.COM</w:t>
+                  </w:r>
+                </w:p>
+              </w:tc>
+            </w:tr>
+          </w:tbl>
+          <w:p/>
+          <w:p>
+            <w:pPr>
+              <w:spacing w:before="160" w:after="40" w:line="252" w:lineRule="auto"/>
+            </w:pPr>
+            <w:r>
+              <w:rPr>
+                <w:rFonts w:ascii="Times New Roman" w:hAnsi="Times New Roman" w:cs="Times New Roman" w:eastAsia="Times New Roman"/>
+                <w:b w:val="0"/>
+                <w:sz w:val="16"/>
+              </w:rPr>
+              <w:t>_________________ / Сорванова А. А. /</w:t>
+            </w:r>
+          </w:p>
+          <w:p>
+            <w:pPr>
+              <w:spacing w:before="0" w:after="0" w:line="252" w:lineRule="auto"/>
+            </w:pPr>
+            <w:r>
+              <w:rPr>
+                <w:rFonts w:ascii="Times New Roman" w:hAnsi="Times New Roman" w:cs="Times New Roman" w:eastAsia="Times New Roman"/>
+                <w:b w:val="0"/>
+                <w:sz w:val="16"/>
+              </w:rPr>
+              <w:t>М.П. (при наличии)     Дата: 01.08.2026</w:t>
             </w:r>
           </w:p>
         </w:tc>
         <w:tc>
           <w:tcPr>
-            <w:tcW w:type="dxa" w:w="6520"/>
+            <w:tcW w:type="dxa" w:w="5103"/>
+            <w:tcMar>
+              <w:top w:w="40" w:type="dxa"/>
+              <w:left w:w="80" w:type="dxa"/>
+              <w:bottom w:w="40" w:type="dxa"/>
+              <w:right w:w="40" w:type="dxa"/>
+            </w:tcMar>
           </w:tcPr>
+          <w:p/>
           <w:p>
             <w:pPr>
-              <w:spacing w:after="0"/>
-              <w:jc w:val="left"/>
+              <w:spacing w:before="0" w:after="120" w:line="252" w:lineRule="auto"/>
+              <w:jc w:val="center"/>
             </w:pPr>
-            <w:r/>
             <w:r>
               <w:rPr>
-                <w:rFonts w:ascii="Calibri" w:hAnsi="Calibri" w:eastAsia="Calibri"/>
-                <w:b w:val="0"/>
-                <w:color w:val="333333"/>
+                <w:rFonts w:ascii="Times New Roman" w:hAnsi="Times New Roman" w:cs="Times New Roman" w:eastAsia="Times New Roman"/>
+                <w:b/>
                 <w:sz w:val="20"/>
               </w:rPr>
-              <w:t>Индивидуальный предприниматель Сорванова Анна Александровна</w:t>
+              <w:t>РАБОТНИК</w:t>
             </w:r>
           </w:p>
-        </w:tc>
-      </w:tr>
-      <w:tr>
-        <w:tc>
-          <w:tcPr>
-            <w:tcW w:type="dxa" w:w="1814"/>
-            <w:shd w:fill="F5F5F5" w:val="clear"/>
-          </w:tcPr>
+          <w:tbl>
+            <w:tblPr>
+              <w:tblStyle w:val="TableGrid"/>
+              <w:tblW w:type="auto" w:w="0"/>
+              <w:tblLook w:firstColumn="1" w:firstRow="1" w:lastColumn="0" w:lastRow="0" w:noHBand="0" w:noVBand="1" w:val="04A0"/>
+            </w:tblPr>
+            <w:tblGrid>
+              <w:gridCol w:w="2551"/>
+              <w:gridCol w:w="2551"/>
+            </w:tblGrid>
+            <w:tr>
+              <w:tc>
+                <w:tcPr>
+                  <w:tcW w:type="dxa" w:w="1474"/>
+                  <w:tcMar>
+                    <w:top w:w="30" w:type="dxa"/>
+                    <w:left w:w="40" w:type="dxa"/>
+                    <w:bottom w:w="30" w:type="dxa"/>
+                    <w:right w:w="40" w:type="dxa"/>
+                  </w:tcMar>
+                </w:tcPr>
+                <w:p>
+                  <w:pPr>
+                    <w:spacing w:before="0" w:after="0"/>
+                  </w:pPr>
+                  <w:r>
+                    <w:rPr>
+                      <w:rFonts w:ascii="Times New Roman" w:hAnsi="Times New Roman" w:cs="Times New Roman" w:eastAsia="Times New Roman"/>
+                      <w:b/>
+                      <w:sz w:val="16"/>
+                    </w:rPr>
+                    <w:t>ФИО</w:t>
+                  </w:r>
+                </w:p>
+              </w:tc>
+              <w:tc>
+                <w:tcPr>
+                  <w:tcW w:type="dxa" w:w="3402"/>
+                  <w:tcMar>
+                    <w:top w:w="30" w:type="dxa"/>
+                    <w:left w:w="40" w:type="dxa"/>
+                    <w:bottom w:w="30" w:type="dxa"/>
+                    <w:right w:w="40" w:type="dxa"/>
+                  </w:tcMar>
+                </w:tcPr>
+                <w:p>
+                  <w:pPr>
+                    <w:spacing w:before="0" w:after="0"/>
+                  </w:pPr>
+                  <w:r>
+                    <w:rPr>
+                      <w:rFonts w:ascii="Times New Roman" w:hAnsi="Times New Roman" w:cs="Times New Roman" w:eastAsia="Times New Roman"/>
+                      <w:b w:val="0"/>
+                      <w:sz w:val="16"/>
+                    </w:rPr>
+                    <w:t>Ходжиматов Фуркатжон Махамаджонович</w:t>
+                  </w:r>
+                </w:p>
+              </w:tc>
+            </w:tr>
+            <w:tr>
+              <w:tc>
+                <w:tcPr>
+                  <w:tcW w:type="dxa" w:w="1474"/>
+                  <w:tcMar>
+                    <w:top w:w="30" w:type="dxa"/>
+                    <w:left w:w="40" w:type="dxa"/>
+                    <w:bottom w:w="30" w:type="dxa"/>
+                    <w:right w:w="40" w:type="dxa"/>
+                  </w:tcMar>
+                </w:tcPr>
+                <w:p>
+                  <w:pPr>
+                    <w:spacing w:before="0" w:after="0"/>
+                  </w:pPr>
+                  <w:r>
+                    <w:rPr>
+                      <w:rFonts w:ascii="Times New Roman" w:hAnsi="Times New Roman" w:cs="Times New Roman" w:eastAsia="Times New Roman"/>
+                      <w:b/>
+                      <w:sz w:val="16"/>
+                    </w:rPr>
+                    <w:t>Гражданство</w:t>
+                  </w:r>
+                </w:p>
+              </w:tc>
+              <w:tc>
+                <w:tcPr>
+                  <w:tcW w:type="dxa" w:w="3402"/>
+                  <w:tcMar>
+                    <w:top w:w="30" w:type="dxa"/>
+                    <w:left w:w="40" w:type="dxa"/>
+                    <w:bottom w:w="30" w:type="dxa"/>
+                    <w:right w:w="40" w:type="dxa"/>
+                  </w:tcMar>
+                </w:tcPr>
+                <w:p>
+                  <w:pPr>
+                    <w:spacing w:before="0" w:after="0"/>
+                  </w:pPr>
+                  <w:r>
+                    <w:rPr>
+                      <w:rFonts w:ascii="Times New Roman" w:hAnsi="Times New Roman" w:cs="Times New Roman" w:eastAsia="Times New Roman"/>
+                      <w:b w:val="0"/>
+                      <w:sz w:val="16"/>
+                    </w:rPr>
+                    <w:t>Республика Узбекистан</w:t>
+                  </w:r>
+                </w:p>
+              </w:tc>
+            </w:tr>
+            <w:tr>
+              <w:tc>
+                <w:tcPr>
+                  <w:tcW w:type="dxa" w:w="1474"/>
+                  <w:tcMar>
+                    <w:top w:w="30" w:type="dxa"/>
+                    <w:left w:w="40" w:type="dxa"/>
+                    <w:bottom w:w="30" w:type="dxa"/>
+                    <w:right w:w="40" w:type="dxa"/>
+                  </w:tcMar>
+                </w:tcPr>
+                <w:p>
+                  <w:pPr>
+                    <w:spacing w:before="0" w:after="0"/>
+                  </w:pPr>
+                  <w:r>
+                    <w:rPr>
+                      <w:rFonts w:ascii="Times New Roman" w:hAnsi="Times New Roman" w:cs="Times New Roman" w:eastAsia="Times New Roman"/>
+                      <w:b/>
+                      <w:sz w:val="16"/>
+                    </w:rPr>
+                    <w:t>Паспорт</w:t>
+                  </w:r>
+                </w:p>
+              </w:tc>
+              <w:tc>
+                <w:tcPr>
+                  <w:tcW w:type="dxa" w:w="3402"/>
+                  <w:tcMar>
+                    <w:top w:w="30" w:type="dxa"/>
+                    <w:left w:w="40" w:type="dxa"/>
+                    <w:bottom w:w="30" w:type="dxa"/>
+                    <w:right w:w="40" w:type="dxa"/>
+                  </w:tcMar>
+                </w:tcPr>
+                <w:p>
+                  <w:pPr>
+                    <w:spacing w:before="0" w:after="0"/>
+                  </w:pPr>
+                  <w:r>
+                    <w:rPr>
+                      <w:rFonts w:ascii="Times New Roman" w:hAnsi="Times New Roman" w:cs="Times New Roman" w:eastAsia="Times New Roman"/>
+                      <w:b w:val="0"/>
+                      <w:sz w:val="16"/>
+                    </w:rPr>
+                    <w:t>№ FA6253664, выдан 29.08.2022, MIA 18227 (Узбекистан), до 28.08.2027</w:t>
+                  </w:r>
+                </w:p>
+              </w:tc>
+            </w:tr>
+            <w:tr>
+              <w:tc>
+                <w:tcPr>
+                  <w:tcW w:type="dxa" w:w="1474"/>
+                  <w:tcMar>
+                    <w:top w:w="30" w:type="dxa"/>
+                    <w:left w:w="40" w:type="dxa"/>
+                    <w:bottom w:w="30" w:type="dxa"/>
+                    <w:right w:w="40" w:type="dxa"/>
+                  </w:tcMar>
+                </w:tcPr>
+                <w:p>
+                  <w:pPr>
+                    <w:spacing w:before="0" w:after="0"/>
+                  </w:pPr>
+                  <w:r>
+                    <w:rPr>
+                      <w:rFonts w:ascii="Times New Roman" w:hAnsi="Times New Roman" w:cs="Times New Roman" w:eastAsia="Times New Roman"/>
+                      <w:b/>
+                      <w:sz w:val="16"/>
+                    </w:rPr>
+                    <w:t>Адрес пребывания</w:t>
+                  </w:r>
+                </w:p>
+              </w:tc>
+              <w:tc>
+                <w:tcPr>
+                  <w:tcW w:type="dxa" w:w="3402"/>
+                  <w:tcMar>
+                    <w:top w:w="30" w:type="dxa"/>
+                    <w:left w:w="40" w:type="dxa"/>
+                    <w:bottom w:w="30" w:type="dxa"/>
+                    <w:right w:w="40" w:type="dxa"/>
+                  </w:tcMar>
+                </w:tcPr>
+                <w:p>
+                  <w:pPr>
+                    <w:spacing w:before="0" w:after="0"/>
+                  </w:pPr>
+                  <w:r>
+                    <w:rPr>
+                      <w:rFonts w:ascii="Times New Roman" w:hAnsi="Times New Roman" w:cs="Times New Roman" w:eastAsia="Times New Roman"/>
+                      <w:b w:val="0"/>
+                      <w:sz w:val="16"/>
+                    </w:rPr>
+                    <w:t>г. Москва, поселение Вороновское, Варшавское ш. 64-й км, домовладение 1, строение 47</w:t>
+                  </w:r>
+                </w:p>
+              </w:tc>
+            </w:tr>
+            <w:tr>
+              <w:tc>
+                <w:tcPr>
+                  <w:tcW w:type="dxa" w:w="1474"/>
+                  <w:tcMar>
+                    <w:top w:w="30" w:type="dxa"/>
+                    <w:left w:w="40" w:type="dxa"/>
+                    <w:bottom w:w="30" w:type="dxa"/>
+                    <w:right w:w="40" w:type="dxa"/>
+                  </w:tcMar>
+                </w:tcPr>
+                <w:p>
+                  <w:pPr>
+                    <w:spacing w:before="0" w:after="0"/>
+                  </w:pPr>
+                  <w:r>
+                    <w:rPr>
+                      <w:rFonts w:ascii="Times New Roman" w:hAnsi="Times New Roman" w:cs="Times New Roman" w:eastAsia="Times New Roman"/>
+                      <w:b/>
+                      <w:sz w:val="16"/>
+                    </w:rPr>
+                    <w:t>Миграционная карта</w:t>
+                  </w:r>
+                </w:p>
+              </w:tc>
+              <w:tc>
+                <w:tcPr>
+                  <w:tcW w:type="dxa" w:w="3402"/>
+                  <w:tcMar>
+                    <w:top w:w="30" w:type="dxa"/>
+                    <w:left w:w="40" w:type="dxa"/>
+                    <w:bottom w:w="30" w:type="dxa"/>
+                    <w:right w:w="40" w:type="dxa"/>
+                  </w:tcMar>
+                </w:tcPr>
+                <w:p>
+                  <w:pPr>
+                    <w:spacing w:before="0" w:after="0"/>
+                  </w:pPr>
+                  <w:r>
+                    <w:rPr>
+                      <w:rFonts w:ascii="Times New Roman" w:hAnsi="Times New Roman" w:cs="Times New Roman" w:eastAsia="Times New Roman"/>
+                      <w:b w:val="0"/>
+                      <w:sz w:val="16"/>
+                    </w:rPr>
+                    <w:t>серия 45 26 № 0767385</w:t>
+                  </w:r>
+                </w:p>
+              </w:tc>
+            </w:tr>
+            <w:tr>
+              <w:tc>
+                <w:tcPr>
+                  <w:tcW w:type="dxa" w:w="1474"/>
+                  <w:tcMar>
+                    <w:top w:w="30" w:type="dxa"/>
+                    <w:left w:w="40" w:type="dxa"/>
+                    <w:bottom w:w="30" w:type="dxa"/>
+                    <w:right w:w="40" w:type="dxa"/>
+                  </w:tcMar>
+                </w:tcPr>
+                <w:p>
+                  <w:pPr>
+                    <w:spacing w:before="0" w:after="0"/>
+                  </w:pPr>
+                  <w:r>
+                    <w:rPr>
+                      <w:rFonts w:ascii="Times New Roman" w:hAnsi="Times New Roman" w:cs="Times New Roman" w:eastAsia="Times New Roman"/>
+                      <w:b/>
+                      <w:sz w:val="16"/>
+                    </w:rPr>
+                    <w:t>Патент</w:t>
+                  </w:r>
+                </w:p>
+              </w:tc>
+              <w:tc>
+                <w:tcPr>
+                  <w:tcW w:type="dxa" w:w="3402"/>
+                  <w:tcMar>
+                    <w:top w:w="30" w:type="dxa"/>
+                    <w:left w:w="40" w:type="dxa"/>
+                    <w:bottom w:w="30" w:type="dxa"/>
+                    <w:right w:w="40" w:type="dxa"/>
+                  </w:tcMar>
+                </w:tcPr>
+                <w:p>
+                  <w:pPr>
+                    <w:spacing w:before="0" w:after="0"/>
+                  </w:pPr>
+                  <w:r>
+                    <w:rPr>
+                      <w:rFonts w:ascii="Times New Roman" w:hAnsi="Times New Roman" w:cs="Times New Roman" w:eastAsia="Times New Roman"/>
+                      <w:b w:val="0"/>
+                      <w:sz w:val="16"/>
+                    </w:rPr>
+                    <w:t>серия 77 № 2600347821, профессия: Бармен, территория: г. Москва</w:t>
+                  </w:r>
+                </w:p>
+              </w:tc>
+            </w:tr>
+            <w:tr>
+              <w:tc>
+                <w:tcPr>
+                  <w:tcW w:type="dxa" w:w="1474"/>
+                  <w:tcMar>
+                    <w:top w:w="30" w:type="dxa"/>
+                    <w:left w:w="40" w:type="dxa"/>
+                    <w:bottom w:w="30" w:type="dxa"/>
+                    <w:right w:w="40" w:type="dxa"/>
+                  </w:tcMar>
+                </w:tcPr>
+                <w:p>
+                  <w:pPr>
+                    <w:spacing w:before="0" w:after="0"/>
+                  </w:pPr>
+                  <w:r>
+                    <w:rPr>
+                      <w:rFonts w:ascii="Times New Roman" w:hAnsi="Times New Roman" w:cs="Times New Roman" w:eastAsia="Times New Roman"/>
+                      <w:b/>
+                      <w:sz w:val="16"/>
+                    </w:rPr>
+                    <w:t>СНИЛС</w:t>
+                  </w:r>
+                </w:p>
+              </w:tc>
+              <w:tc>
+                <w:tcPr>
+                  <w:tcW w:type="dxa" w:w="3402"/>
+                  <w:tcMar>
+                    <w:top w:w="30" w:type="dxa"/>
+                    <w:left w:w="40" w:type="dxa"/>
+                    <w:bottom w:w="30" w:type="dxa"/>
+                    <w:right w:w="40" w:type="dxa"/>
+                  </w:tcMar>
+                </w:tcPr>
+                <w:p>
+                  <w:pPr>
+                    <w:spacing w:before="0" w:after="0"/>
+                  </w:pPr>
+                  <w:r>
+                    <w:rPr>
+                      <w:rFonts w:ascii="Times New Roman" w:hAnsi="Times New Roman" w:cs="Times New Roman" w:eastAsia="Times New Roman"/>
+                      <w:b w:val="0"/>
+                      <w:sz w:val="16"/>
+                    </w:rPr>
+                    <w:t>229-173-224 63</w:t>
+                  </w:r>
+                </w:p>
+              </w:tc>
+            </w:tr>
+            <w:tr>
+              <w:tc>
+                <w:tcPr>
+                  <w:tcW w:type="dxa" w:w="1474"/>
+                  <w:tcMar>
+                    <w:top w:w="30" w:type="dxa"/>
+                    <w:left w:w="40" w:type="dxa"/>
+                    <w:bottom w:w="30" w:type="dxa"/>
+                    <w:right w:w="40" w:type="dxa"/>
+                  </w:tcMar>
+                </w:tcPr>
+                <w:p>
+                  <w:pPr>
+                    <w:spacing w:before="0" w:after="0"/>
+                  </w:pPr>
+                  <w:r>
+                    <w:rPr>
+                      <w:rFonts w:ascii="Times New Roman" w:hAnsi="Times New Roman" w:cs="Times New Roman" w:eastAsia="Times New Roman"/>
+                      <w:b/>
+                      <w:sz w:val="16"/>
+                    </w:rPr>
+                    <w:t>ИНН</w:t>
+                  </w:r>
+                </w:p>
+              </w:tc>
+              <w:tc>
+                <w:tcPr>
+                  <w:tcW w:type="dxa" w:w="3402"/>
+                  <w:tcMar>
+                    <w:top w:w="30" w:type="dxa"/>
+                    <w:left w:w="40" w:type="dxa"/>
+                    <w:bottom w:w="30" w:type="dxa"/>
+                    <w:right w:w="40" w:type="dxa"/>
+                  </w:tcMar>
+                </w:tcPr>
+                <w:p>
+                  <w:pPr>
+                    <w:spacing w:before="0" w:after="0"/>
+                  </w:pPr>
+                  <w:r>
+                    <w:rPr>
+                      <w:rFonts w:ascii="Times New Roman" w:hAnsi="Times New Roman" w:cs="Times New Roman" w:eastAsia="Times New Roman"/>
+                      <w:b w:val="0"/>
+                      <w:sz w:val="16"/>
+                    </w:rPr>
+                    <w:t>772430430429</w:t>
+                  </w:r>
+                </w:p>
+              </w:tc>
+            </w:tr>
+            <w:tr>
+              <w:tc>
+                <w:tcPr>
+                  <w:tcW w:type="dxa" w:w="1474"/>
+                  <w:tcMar>
+                    <w:top w:w="30" w:type="dxa"/>
+                    <w:left w:w="40" w:type="dxa"/>
+                    <w:bottom w:w="30" w:type="dxa"/>
+                    <w:right w:w="40" w:type="dxa"/>
+                  </w:tcMar>
+                </w:tcPr>
+                <w:p>
+                  <w:pPr>
+                    <w:spacing w:before="0" w:after="0"/>
+                  </w:pPr>
+                  <w:r>
+                    <w:rPr>
+                      <w:rFonts w:ascii="Times New Roman" w:hAnsi="Times New Roman" w:cs="Times New Roman" w:eastAsia="Times New Roman"/>
+                      <w:b/>
+                      <w:sz w:val="16"/>
+                    </w:rPr>
+                    <w:t>Телефон</w:t>
+                  </w:r>
+                </w:p>
+              </w:tc>
+              <w:tc>
+                <w:tcPr>
+                  <w:tcW w:type="dxa" w:w="3402"/>
+                  <w:tcMar>
+                    <w:top w:w="30" w:type="dxa"/>
+                    <w:left w:w="40" w:type="dxa"/>
+                    <w:bottom w:w="30" w:type="dxa"/>
+                    <w:right w:w="40" w:type="dxa"/>
+                  </w:tcMar>
+                </w:tcPr>
+                <w:p>
+                  <w:pPr>
+                    <w:spacing w:before="0" w:after="0"/>
+                  </w:pPr>
+                  <w:r>
+                    <w:rPr>
+                      <w:rFonts w:ascii="Times New Roman" w:hAnsi="Times New Roman" w:cs="Times New Roman" w:eastAsia="Times New Roman"/>
+                      <w:b w:val="0"/>
+                      <w:sz w:val="16"/>
+                    </w:rPr>
+                    <w:t>8 (901) 797-57-53</w:t>
+                  </w:r>
+                </w:p>
+              </w:tc>
+            </w:tr>
+            <w:tr>
+              <w:tc>
+                <w:tcPr>
+                  <w:tcW w:type="dxa" w:w="1474"/>
+                  <w:tcMar>
+                    <w:top w:w="30" w:type="dxa"/>
+                    <w:left w:w="40" w:type="dxa"/>
+                    <w:bottom w:w="30" w:type="dxa"/>
+                    <w:right w:w="40" w:type="dxa"/>
+                  </w:tcMar>
+                </w:tcPr>
+                <w:p>
+                  <w:pPr>
+                    <w:spacing w:before="0" w:after="0"/>
+                  </w:pPr>
+                  <w:r>
+                    <w:rPr>
+                      <w:rFonts w:ascii="Times New Roman" w:hAnsi="Times New Roman" w:cs="Times New Roman" w:eastAsia="Times New Roman"/>
+                      <w:b/>
+                      <w:sz w:val="16"/>
+                    </w:rPr>
+                    <w:t>Зарплатный счёт (безнал)</w:t>
+                  </w:r>
+                </w:p>
+              </w:tc>
+              <w:tc>
+                <w:tcPr>
+                  <w:tcW w:type="dxa" w:w="3402"/>
+                  <w:tcMar>
+                    <w:top w:w="30" w:type="dxa"/>
+                    <w:left w:w="40" w:type="dxa"/>
+                    <w:bottom w:w="30" w:type="dxa"/>
+                    <w:right w:w="40" w:type="dxa"/>
+                  </w:tcMar>
+                </w:tcPr>
+                <w:p>
+                  <w:pPr>
+                    <w:spacing w:before="0" w:after="0"/>
+                  </w:pPr>
+                  <w:r>
+                    <w:rPr>
+                      <w:rFonts w:ascii="Times New Roman" w:hAnsi="Times New Roman" w:cs="Times New Roman" w:eastAsia="Times New Roman"/>
+                      <w:b w:val="0"/>
+                      <w:sz w:val="16"/>
+                    </w:rPr>
+                    <w:t>валюта RUB; получатель — ХОДЖИМАТОВ ФУРКАТЖОН МАХАМАДЖОНОВИЧ; счёт 40820810338110973759; банк — ПАО Сбербанк; БИК 044525225; к/с 30101810400000000225; ИНН банка 7707083893; КПП 773643001; ОКПО 57972160; ОГРН 1027700132195; SWIFT SABRRUMM; адрес банка — 109544, МОСКВА, УЛ.Б.АНДРОНЬЕВСКАЯ,6</w:t>
+                  </w:r>
+                </w:p>
+              </w:tc>
+            </w:tr>
+          </w:tbl>
+          <w:p/>
           <w:p>
             <w:pPr>
-              <w:spacing w:after="0"/>
-              <w:jc w:val="left"/>
+              <w:spacing w:before="160" w:after="40" w:line="252" w:lineRule="auto"/>
             </w:pPr>
-            <w:r/>
             <w:r>
               <w:rPr>
-                <w:rFonts w:ascii="Calibri" w:hAnsi="Calibri" w:eastAsia="Calibri"/>
-                <w:b/>
-                <w:color w:val="1A1A1A"/>
-                <w:sz w:val="20"/>
+                <w:rFonts w:ascii="Times New Roman" w:hAnsi="Times New Roman" w:cs="Times New Roman" w:eastAsia="Times New Roman"/>
+                <w:b w:val="0"/>
+                <w:sz w:val="16"/>
               </w:rPr>
-              <w:t>ОГРНИП</w:t>
+              <w:t>Экземпляр Договора получил:</w:t>
             </w:r>
           </w:p>
-        </w:tc>
-        <w:tc>
-          <w:tcPr>
-            <w:tcW w:type="dxa" w:w="6520"/>
-            <w:shd w:fill="FAFAFA" w:val="clear"/>
-          </w:tcPr>
           <w:p>
             <w:pPr>
-              <w:spacing w:after="0"/>
-              <w:jc w:val="left"/>
+              <w:spacing w:before="0" w:after="40" w:line="252" w:lineRule="auto"/>
             </w:pPr>
-            <w:r/>
             <w:r>
               <w:rPr>
-                <w:rFonts w:ascii="Calibri" w:hAnsi="Calibri" w:eastAsia="Calibri"/>
+                <w:rFonts w:ascii="Times New Roman" w:hAnsi="Times New Roman" w:cs="Times New Roman" w:eastAsia="Times New Roman"/>
                 <w:b w:val="0"/>
-                <w:color w:val="333333"/>
-                <w:sz w:val="20"/>
+                <w:sz w:val="16"/>
               </w:rPr>
-              <w:t>322774600583080</w:t>
+              <w:t>_________________ / Ходжиматов Ф. М. /</w:t>
             </w:r>
           </w:p>
-        </w:tc>
-      </w:tr>
-      <w:tr>
-        <w:tc>
-          <w:tcPr>
-            <w:tcW w:type="dxa" w:w="1814"/>
-            <w:shd w:fill="F5F5F5" w:val="clear"/>
-          </w:tcPr>
           <w:p>
             <w:pPr>
-              <w:spacing w:after="0"/>
-              <w:jc w:val="left"/>
+              <w:spacing w:before="0" w:after="0" w:line="252" w:lineRule="auto"/>
             </w:pPr>
-            <w:r/>
             <w:r>
               <w:rPr>
-                <w:rFonts w:ascii="Calibri" w:hAnsi="Calibri" w:eastAsia="Calibri"/>
-                <w:b/>
-                <w:color w:val="1A1A1A"/>
-                <w:sz w:val="20"/>
+                <w:rFonts w:ascii="Times New Roman" w:hAnsi="Times New Roman" w:cs="Times New Roman" w:eastAsia="Times New Roman"/>
+                <w:b w:val="0"/>
+                <w:sz w:val="16"/>
               </w:rPr>
-              <w:t>ИНН</w:t>
-            </w:r>
-          </w:p>
-        </w:tc>
-        <w:tc>
-          <w:tcPr>
-            <w:tcW w:type="dxa" w:w="6520"/>
-          </w:tcPr>
-          <w:p>
-            <w:pPr>
-              <w:spacing w:after="0"/>
-              <w:jc w:val="left"/>
-            </w:pPr>
-            <w:r/>
-            <w:r>
-              <w:rPr>
-                <w:rFonts w:ascii="Calibri" w:hAnsi="Calibri" w:eastAsia="Calibri"/>
-                <w:b w:val="0"/>
-                <w:color w:val="333333"/>
-                <w:sz w:val="20"/>
-              </w:rPr>
-              <w:t>772973703990</w:t>
-            </w:r>
-          </w:p>
-        </w:tc>
-      </w:tr>
-      <w:tr>
-        <w:tc>
-          <w:tcPr>
-            <w:tcW w:type="dxa" w:w="1814"/>
-            <w:shd w:fill="F5F5F5" w:val="clear"/>
-          </w:tcPr>
-          <w:p>
-            <w:pPr>
-              <w:spacing w:after="0"/>
-              <w:jc w:val="left"/>
-            </w:pPr>
-            <w:r/>
-            <w:r>
-              <w:rPr>
-                <w:rFonts w:ascii="Calibri" w:hAnsi="Calibri" w:eastAsia="Calibri"/>
-                <w:b/>
-                <w:color w:val="1A1A1A"/>
-                <w:sz w:val="20"/>
-              </w:rPr>
-              <w:t>Адрес</w:t>
-            </w:r>
-          </w:p>
-        </w:tc>
-        <w:tc>
-          <w:tcPr>
-            <w:tcW w:type="dxa" w:w="6520"/>
-            <w:shd w:fill="FAFAFA" w:val="clear"/>
-          </w:tcPr>
-          <w:p>
-            <w:pPr>
-              <w:spacing w:after="0"/>
-              <w:jc w:val="left"/>
-            </w:pPr>
-            <w:r/>
-            <w:r>
-              <w:rPr>
-                <w:rFonts w:ascii="Calibri" w:hAnsi="Calibri" w:eastAsia="Calibri"/>
-                <w:b w:val="0"/>
-                <w:color w:val="333333"/>
-                <w:sz w:val="20"/>
-              </w:rPr>
-              <w:t>г. Москва, ул. Василия Ланового, д. 3, кв. 243</w:t>
-            </w:r>
-          </w:p>
-        </w:tc>
-      </w:tr>
-      <w:tr>
-        <w:tc>
-          <w:tcPr>
-            <w:tcW w:type="dxa" w:w="1814"/>
-            <w:shd w:fill="F5F5F5" w:val="clear"/>
-          </w:tcPr>
-          <w:p>
-            <w:pPr>
-              <w:spacing w:after="0"/>
-              <w:jc w:val="left"/>
-            </w:pPr>
-            <w:r/>
-            <w:r>
-              <w:rPr>
-                <w:rFonts w:ascii="Calibri" w:hAnsi="Calibri" w:eastAsia="Calibri"/>
-                <w:b/>
-                <w:color w:val="1A1A1A"/>
-                <w:sz w:val="20"/>
-              </w:rPr>
-              <w:t>р/с</w:t>
-            </w:r>
-          </w:p>
-        </w:tc>
-        <w:tc>
-          <w:tcPr>
-            <w:tcW w:type="dxa" w:w="6520"/>
-          </w:tcPr>
-          <w:p>
-            <w:pPr>
-              <w:spacing w:after="0"/>
-              <w:jc w:val="left"/>
-            </w:pPr>
-            <w:r/>
-            <w:r>
-              <w:rPr>
-                <w:rFonts w:ascii="Calibri" w:hAnsi="Calibri" w:eastAsia="Calibri"/>
-                <w:b w:val="0"/>
-                <w:color w:val="333333"/>
-                <w:sz w:val="20"/>
-              </w:rPr>
-              <w:t>40802810370010393644</w:t>
-            </w:r>
-          </w:p>
-        </w:tc>
-      </w:tr>
-      <w:tr>
-        <w:tc>
-          <w:tcPr>
-            <w:tcW w:type="dxa" w:w="1814"/>
-            <w:shd w:fill="F5F5F5" w:val="clear"/>
-          </w:tcPr>
-          <w:p>
-            <w:pPr>
-              <w:spacing w:after="0"/>
-              <w:jc w:val="left"/>
-            </w:pPr>
-            <w:r/>
-            <w:r>
-              <w:rPr>
-                <w:rFonts w:ascii="Calibri" w:hAnsi="Calibri" w:eastAsia="Calibri"/>
-                <w:b/>
-                <w:color w:val="1A1A1A"/>
-                <w:sz w:val="20"/>
-              </w:rPr>
-              <w:t>Банк</w:t>
-            </w:r>
-          </w:p>
-        </w:tc>
-        <w:tc>
-          <w:tcPr>
-            <w:tcW w:type="dxa" w:w="6520"/>
-            <w:shd w:fill="FAFAFA" w:val="clear"/>
-          </w:tcPr>
-          <w:p>
-            <w:pPr>
-              <w:spacing w:after="0"/>
-              <w:jc w:val="left"/>
-            </w:pPr>
-            <w:r/>
-            <w:r>
-              <w:rPr>
-                <w:rFonts w:ascii="Calibri" w:hAnsi="Calibri" w:eastAsia="Calibri"/>
-                <w:b w:val="0"/>
-                <w:color w:val="333333"/>
-                <w:sz w:val="20"/>
-              </w:rPr>
-              <w:t>МОСКОВСКИЙ ФИЛИАЛ АО КБ "МОДУЛЬБАНК"</w:t>
-            </w:r>
-          </w:p>
-        </w:tc>
-      </w:tr>
-      <w:tr>
-        <w:tc>
-          <w:tcPr>
-            <w:tcW w:type="dxa" w:w="1814"/>
-            <w:shd w:fill="F5F5F5" w:val="clear"/>
-          </w:tcPr>
-          <w:p>
-            <w:pPr>
-              <w:spacing w:after="0"/>
-              <w:jc w:val="left"/>
-            </w:pPr>
-            <w:r/>
-            <w:r>
-              <w:rPr>
-                <w:rFonts w:ascii="Calibri" w:hAnsi="Calibri" w:eastAsia="Calibri"/>
-                <w:b/>
-                <w:color w:val="1A1A1A"/>
-                <w:sz w:val="20"/>
-              </w:rPr>
-              <w:t>БИК</w:t>
-            </w:r>
-          </w:p>
-        </w:tc>
-        <w:tc>
-          <w:tcPr>
-            <w:tcW w:type="dxa" w:w="6520"/>
-          </w:tcPr>
-          <w:p>
-            <w:pPr>
-              <w:spacing w:after="0"/>
-              <w:jc w:val="left"/>
-            </w:pPr>
-            <w:r/>
-            <w:r>
-              <w:rPr>
-                <w:rFonts w:ascii="Calibri" w:hAnsi="Calibri" w:eastAsia="Calibri"/>
-                <w:b w:val="0"/>
-                <w:color w:val="333333"/>
-                <w:sz w:val="20"/>
-              </w:rPr>
-              <w:t>044525092</w:t>
-            </w:r>
-          </w:p>
-        </w:tc>
-      </w:tr>
-      <w:tr>
-        <w:tc>
-          <w:tcPr>
-            <w:tcW w:type="dxa" w:w="1814"/>
-            <w:shd w:fill="F5F5F5" w:val="clear"/>
-          </w:tcPr>
-          <w:p>
-            <w:pPr>
-              <w:spacing w:after="0"/>
-              <w:jc w:val="left"/>
-            </w:pPr>
-            <w:r/>
-            <w:r>
-              <w:rPr>
-                <w:rFonts w:ascii="Calibri" w:hAnsi="Calibri" w:eastAsia="Calibri"/>
-                <w:b/>
-                <w:color w:val="1A1A1A"/>
-                <w:sz w:val="20"/>
-              </w:rPr>
-              <w:t>к/с</w:t>
-            </w:r>
-          </w:p>
-        </w:tc>
-        <w:tc>
-          <w:tcPr>
-            <w:tcW w:type="dxa" w:w="6520"/>
-            <w:shd w:fill="FAFAFA" w:val="clear"/>
-          </w:tcPr>
-          <w:p>
-            <w:pPr>
-              <w:spacing w:after="0"/>
-              <w:jc w:val="left"/>
-            </w:pPr>
-            <w:r/>
-            <w:r>
-              <w:rPr>
-                <w:rFonts w:ascii="Calibri" w:hAnsi="Calibri" w:eastAsia="Calibri"/>
-                <w:b w:val="0"/>
-                <w:color w:val="333333"/>
-                <w:sz w:val="20"/>
-              </w:rPr>
-              <w:t>30101810645250000092</w:t>
-            </w:r>
-          </w:p>
-        </w:tc>
-      </w:tr>
-      <w:tr>
-        <w:tc>
-          <w:tcPr>
-            <w:tcW w:type="dxa" w:w="1814"/>
-            <w:shd w:fill="F5F5F5" w:val="clear"/>
-          </w:tcPr>
-          <w:p>
-            <w:pPr>
-              <w:spacing w:after="0"/>
-              <w:jc w:val="left"/>
-            </w:pPr>
-            <w:r/>
-            <w:r>
-              <w:rPr>
-                <w:rFonts w:ascii="Calibri" w:hAnsi="Calibri" w:eastAsia="Calibri"/>
-                <w:b/>
-                <w:color w:val="1A1A1A"/>
-                <w:sz w:val="20"/>
-              </w:rPr>
-              <w:t>E-mail</w:t>
-            </w:r>
-          </w:p>
-        </w:tc>
-        <w:tc>
-          <w:tcPr>
-            <w:tcW w:type="dxa" w:w="6520"/>
-          </w:tcPr>
-          <w:p>
-            <w:pPr>
-              <w:spacing w:after="0"/>
-              <w:jc w:val="left"/>
-            </w:pPr>
-            <w:r/>
-            <w:r>
-              <w:rPr>
-                <w:rFonts w:ascii="Calibri" w:hAnsi="Calibri" w:eastAsia="Calibri"/>
-                <w:b w:val="0"/>
-                <w:color w:val="333333"/>
-                <w:sz w:val="20"/>
-              </w:rPr>
-              <w:t>SORVANOVAAA@GMAIL.COM</w:t>
+              <w:t>Дата: 01.08.2026</w:t>
             </w:r>
           </w:p>
         </w:tc>
       </w:tr>
     </w:tbl>
-    <w:p>
-      <w:pPr>
-        <w:spacing w:after="80"/>
-        <w:jc w:val="left"/>
-      </w:pPr>
-      <w:r>
-        <w:rPr>
-          <w:rFonts w:ascii="Calibri" w:hAnsi="Calibri" w:eastAsia="Calibri"/>
-          <w:b w:val="0"/>
-          <w:color w:val="333333"/>
-          <w:sz w:val="20"/>
-        </w:rPr>
-        <w:t>_________________ / Сорванова А. А. /     М.П. (при наличии)     Дата: 01.08.2026</w:t>
-      </w:r>
-    </w:p>
-    <w:p>
-      <w:pPr>
-        <w:spacing w:after="80"/>
-        <w:jc w:val="left"/>
-      </w:pPr>
-      <w:r>
-        <w:rPr>
-          <w:rFonts w:ascii="Calibri" w:hAnsi="Calibri" w:eastAsia="Calibri"/>
-          <w:b/>
-          <w:color w:val="1A1A1A"/>
-          <w:sz w:val="22"/>
-        </w:rPr>
-        <w:t>РАБОТНИК</w:t>
-      </w:r>
-    </w:p>
-    <w:tbl>
-      <w:tblPr>
-        <w:tblW w:type="auto" w:w="0"/>
-        <w:jc w:val="left"/>
-        <w:tblLook w:firstColumn="1" w:firstRow="1" w:lastColumn="0" w:lastRow="0" w:noHBand="0" w:noVBand="1" w:val="04A0"/>
-        <w:tblBorders>
-          <w:top w:val="single" w:sz="4" w:space="0" w:color="AAAAAA"/>
-          <w:left w:val="single" w:sz="4" w:space="0" w:color="AAAAAA"/>
-          <w:bottom w:val="single" w:sz="4" w:space="0" w:color="AAAAAA"/>
-          <w:right w:val="single" w:sz="4" w:space="0" w:color="AAAAAA"/>
-          <w:insideH w:val="single" w:sz="4" w:space="0" w:color="AAAAAA"/>
-          <w:insideV w:val="single" w:sz="4" w:space="0" w:color="AAAAAA"/>
-        </w:tblBorders>
-      </w:tblPr>
-      <w:tblGrid>
-        <w:gridCol w:w="4844"/>
-        <w:gridCol w:w="4844"/>
-      </w:tblGrid>
-      <w:tr>
-        <w:tc>
-          <w:tcPr>
-            <w:tcW w:type="dxa" w:w="2381"/>
-            <w:shd w:fill="F5F5F5" w:val="clear"/>
-          </w:tcPr>
-          <w:p>
-            <w:pPr>
-              <w:spacing w:after="0"/>
-              <w:jc w:val="left"/>
-            </w:pPr>
-            <w:r/>
-            <w:r>
-              <w:rPr>
-                <w:rFonts w:ascii="Calibri" w:hAnsi="Calibri" w:eastAsia="Calibri"/>
-                <w:b/>
-                <w:color w:val="1A1A1A"/>
-                <w:sz w:val="20"/>
-              </w:rPr>
-              <w:t>ФИО</w:t>
-            </w:r>
-          </w:p>
-        </w:tc>
-        <w:tc>
-          <w:tcPr>
-            <w:tcW w:type="dxa" w:w="6520"/>
-          </w:tcPr>
-          <w:p>
-            <w:pPr>
-              <w:spacing w:after="0"/>
-              <w:jc w:val="left"/>
-            </w:pPr>
-            <w:r/>
-            <w:r>
-              <w:rPr>
-                <w:rFonts w:ascii="Calibri" w:hAnsi="Calibri" w:eastAsia="Calibri"/>
-                <w:b w:val="0"/>
-                <w:color w:val="333333"/>
-                <w:sz w:val="20"/>
-              </w:rPr>
-              <w:t>Ходжиматов Фуркатжон Махамаджонович</w:t>
-            </w:r>
-          </w:p>
-        </w:tc>
-      </w:tr>
-      <w:tr>
-        <w:tc>
-          <w:tcPr>
-            <w:tcW w:type="dxa" w:w="2381"/>
-            <w:shd w:fill="F5F5F5" w:val="clear"/>
-          </w:tcPr>
-          <w:p>
-            <w:pPr>
-              <w:spacing w:after="0"/>
-              <w:jc w:val="left"/>
-            </w:pPr>
-            <w:r/>
-            <w:r>
-              <w:rPr>
-                <w:rFonts w:ascii="Calibri" w:hAnsi="Calibri" w:eastAsia="Calibri"/>
-                <w:b/>
-                <w:color w:val="1A1A1A"/>
-                <w:sz w:val="20"/>
-              </w:rPr>
-              <w:t>Гражданство</w:t>
-            </w:r>
-          </w:p>
-        </w:tc>
-        <w:tc>
-          <w:tcPr>
-            <w:tcW w:type="dxa" w:w="6520"/>
-            <w:shd w:fill="FAFAFA" w:val="clear"/>
-          </w:tcPr>
-          <w:p>
-            <w:pPr>
-              <w:spacing w:after="0"/>
-              <w:jc w:val="left"/>
-            </w:pPr>
-            <w:r/>
-            <w:r>
-              <w:rPr>
-                <w:rFonts w:ascii="Calibri" w:hAnsi="Calibri" w:eastAsia="Calibri"/>
-                <w:b w:val="0"/>
-                <w:color w:val="333333"/>
-                <w:sz w:val="20"/>
-              </w:rPr>
-              <w:t>Республика Узбекистан</w:t>
-            </w:r>
-          </w:p>
-        </w:tc>
-      </w:tr>
-      <w:tr>
-        <w:tc>
-          <w:tcPr>
-            <w:tcW w:type="dxa" w:w="2381"/>
-            <w:shd w:fill="F5F5F5" w:val="clear"/>
-          </w:tcPr>
-          <w:p>
-            <w:pPr>
-              <w:spacing w:after="0"/>
-              <w:jc w:val="left"/>
-            </w:pPr>
-            <w:r/>
-            <w:r>
-              <w:rPr>
-                <w:rFonts w:ascii="Calibri" w:hAnsi="Calibri" w:eastAsia="Calibri"/>
-                <w:b/>
-                <w:color w:val="1A1A1A"/>
-                <w:sz w:val="20"/>
-              </w:rPr>
-              <w:t>Паспорт</w:t>
-            </w:r>
-          </w:p>
-        </w:tc>
-        <w:tc>
-          <w:tcPr>
-            <w:tcW w:type="dxa" w:w="6520"/>
-          </w:tcPr>
-          <w:p>
-            <w:pPr>
-              <w:spacing w:after="0"/>
-              <w:jc w:val="left"/>
-            </w:pPr>
-            <w:r/>
-            <w:r>
-              <w:rPr>
-                <w:rFonts w:ascii="Calibri" w:hAnsi="Calibri" w:eastAsia="Calibri"/>
-                <w:b w:val="0"/>
-                <w:color w:val="333333"/>
-                <w:sz w:val="20"/>
-              </w:rPr>
-              <w:t>№ FA6253664, выдан 29.08.2022, MIA 18227 (Узбекистан), до 28.08.2027</w:t>
-            </w:r>
-          </w:p>
-        </w:tc>
-      </w:tr>
-      <w:tr>
-        <w:tc>
-          <w:tcPr>
-            <w:tcW w:type="dxa" w:w="2381"/>
-            <w:shd w:fill="F5F5F5" w:val="clear"/>
-          </w:tcPr>
-          <w:p>
-            <w:pPr>
-              <w:spacing w:after="0"/>
-              <w:jc w:val="left"/>
-            </w:pPr>
-            <w:r/>
-            <w:r>
-              <w:rPr>
-                <w:rFonts w:ascii="Calibri" w:hAnsi="Calibri" w:eastAsia="Calibri"/>
-                <w:b/>
-                <w:color w:val="1A1A1A"/>
-                <w:sz w:val="20"/>
-              </w:rPr>
-              <w:t>Адрес пребывания</w:t>
-            </w:r>
-          </w:p>
-        </w:tc>
-        <w:tc>
-          <w:tcPr>
-            <w:tcW w:type="dxa" w:w="6520"/>
-            <w:shd w:fill="FAFAFA" w:val="clear"/>
-          </w:tcPr>
-          <w:p>
-            <w:pPr>
-              <w:spacing w:after="0"/>
-              <w:jc w:val="left"/>
-            </w:pPr>
-            <w:r/>
-            <w:r>
-              <w:rPr>
-                <w:rFonts w:ascii="Calibri" w:hAnsi="Calibri" w:eastAsia="Calibri"/>
-                <w:b w:val="0"/>
-                <w:color w:val="333333"/>
-                <w:sz w:val="20"/>
-              </w:rPr>
-              <w:t>г. Москва, поселение Вороновское, Варшавское ш. 64-й км, домовладение 1, строение 47</w:t>
-            </w:r>
-          </w:p>
-        </w:tc>
-      </w:tr>
-      <w:tr>
-        <w:tc>
-          <w:tcPr>
-            <w:tcW w:type="dxa" w:w="2381"/>
-            <w:shd w:fill="F5F5F5" w:val="clear"/>
-          </w:tcPr>
-          <w:p>
-            <w:pPr>
-              <w:spacing w:after="0"/>
-              <w:jc w:val="left"/>
-            </w:pPr>
-            <w:r/>
-            <w:r>
-              <w:rPr>
-                <w:rFonts w:ascii="Calibri" w:hAnsi="Calibri" w:eastAsia="Calibri"/>
-                <w:b/>
-                <w:color w:val="1A1A1A"/>
-                <w:sz w:val="20"/>
-              </w:rPr>
-              <w:t>Миграционная карта</w:t>
-            </w:r>
-          </w:p>
-        </w:tc>
-        <w:tc>
-          <w:tcPr>
-            <w:tcW w:type="dxa" w:w="6520"/>
-          </w:tcPr>
-          <w:p>
-            <w:pPr>
-              <w:spacing w:after="0"/>
-              <w:jc w:val="left"/>
-            </w:pPr>
-            <w:r/>
-            <w:r>
-              <w:rPr>
-                <w:rFonts w:ascii="Calibri" w:hAnsi="Calibri" w:eastAsia="Calibri"/>
-                <w:b w:val="0"/>
-                <w:color w:val="333333"/>
-                <w:sz w:val="20"/>
-              </w:rPr>
-              <w:t>серия 45 26 № 0767385</w:t>
-            </w:r>
-          </w:p>
-        </w:tc>
-      </w:tr>
-      <w:tr>
-        <w:tc>
-          <w:tcPr>
-            <w:tcW w:type="dxa" w:w="2381"/>
-            <w:shd w:fill="F5F5F5" w:val="clear"/>
-          </w:tcPr>
-          <w:p>
-            <w:pPr>
-              <w:spacing w:after="0"/>
-              <w:jc w:val="left"/>
-            </w:pPr>
-            <w:r/>
-            <w:r>
-              <w:rPr>
-                <w:rFonts w:ascii="Calibri" w:hAnsi="Calibri" w:eastAsia="Calibri"/>
-                <w:b/>
-                <w:color w:val="1A1A1A"/>
-                <w:sz w:val="20"/>
-              </w:rPr>
-              <w:t>Патент</w:t>
-            </w:r>
-          </w:p>
-        </w:tc>
-        <w:tc>
-          <w:tcPr>
-            <w:tcW w:type="dxa" w:w="6520"/>
-            <w:shd w:fill="FAFAFA" w:val="clear"/>
-          </w:tcPr>
-          <w:p>
-            <w:pPr>
-              <w:spacing w:after="0"/>
-              <w:jc w:val="left"/>
-            </w:pPr>
-            <w:r/>
-            <w:r>
-              <w:rPr>
-                <w:rFonts w:ascii="Calibri" w:hAnsi="Calibri" w:eastAsia="Calibri"/>
-                <w:b w:val="0"/>
-                <w:color w:val="333333"/>
-                <w:sz w:val="20"/>
-              </w:rPr>
-              <w:t>серия 77 № 2600347821, профессия: Бармен, территория: г. Москва</w:t>
-            </w:r>
-          </w:p>
-        </w:tc>
-      </w:tr>
-      <w:tr>
-        <w:tc>
-          <w:tcPr>
-            <w:tcW w:type="dxa" w:w="2381"/>
-            <w:shd w:fill="F5F5F5" w:val="clear"/>
-          </w:tcPr>
-          <w:p>
-            <w:pPr>
-              <w:spacing w:after="0"/>
-              <w:jc w:val="left"/>
-            </w:pPr>
-            <w:r/>
-            <w:r>
-              <w:rPr>
-                <w:rFonts w:ascii="Calibri" w:hAnsi="Calibri" w:eastAsia="Calibri"/>
-                <w:b/>
-                <w:color w:val="1A1A1A"/>
-                <w:sz w:val="20"/>
-              </w:rPr>
-              <w:t>СНИЛС</w:t>
-            </w:r>
-          </w:p>
-        </w:tc>
-        <w:tc>
-          <w:tcPr>
-            <w:tcW w:type="dxa" w:w="6520"/>
-          </w:tcPr>
-          <w:p>
-            <w:pPr>
-              <w:spacing w:after="0"/>
-              <w:jc w:val="left"/>
-            </w:pPr>
-            <w:r/>
-            <w:r>
-              <w:rPr>
-                <w:rFonts w:ascii="Calibri" w:hAnsi="Calibri" w:eastAsia="Calibri"/>
-                <w:b w:val="0"/>
-                <w:color w:val="333333"/>
-                <w:sz w:val="20"/>
-              </w:rPr>
-              <w:t>229-173-224 63</w:t>
-            </w:r>
-          </w:p>
-        </w:tc>
-      </w:tr>
-      <w:tr>
-        <w:tc>
-          <w:tcPr>
-            <w:tcW w:type="dxa" w:w="2381"/>
-            <w:shd w:fill="F5F5F5" w:val="clear"/>
-          </w:tcPr>
-          <w:p>
-            <w:pPr>
-              <w:spacing w:after="0"/>
-              <w:jc w:val="left"/>
-            </w:pPr>
-            <w:r/>
-            <w:r>
-              <w:rPr>
-                <w:rFonts w:ascii="Calibri" w:hAnsi="Calibri" w:eastAsia="Calibri"/>
-                <w:b/>
-                <w:color w:val="1A1A1A"/>
-                <w:sz w:val="20"/>
-              </w:rPr>
-              <w:t>ИНН</w:t>
-            </w:r>
-          </w:p>
-        </w:tc>
-        <w:tc>
-          <w:tcPr>
-            <w:tcW w:type="dxa" w:w="6520"/>
-            <w:shd w:fill="FAFAFA" w:val="clear"/>
-          </w:tcPr>
-          <w:p>
-            <w:pPr>
-              <w:spacing w:after="0"/>
-              <w:jc w:val="left"/>
-            </w:pPr>
-            <w:r/>
-            <w:r>
-              <w:rPr>
-                <w:rFonts w:ascii="Calibri" w:hAnsi="Calibri" w:eastAsia="Calibri"/>
-                <w:b w:val="0"/>
-                <w:color w:val="333333"/>
-                <w:sz w:val="20"/>
-              </w:rPr>
-              <w:t>772430430429</w:t>
-            </w:r>
-          </w:p>
-        </w:tc>
-      </w:tr>
-      <w:tr>
-        <w:tc>
-          <w:tcPr>
-            <w:tcW w:type="dxa" w:w="2381"/>
-            <w:shd w:fill="F5F5F5" w:val="clear"/>
-          </w:tcPr>
-          <w:p>
-            <w:pPr>
-              <w:spacing w:after="0"/>
-              <w:jc w:val="left"/>
-            </w:pPr>
-            <w:r/>
-            <w:r>
-              <w:rPr>
-                <w:rFonts w:ascii="Calibri" w:hAnsi="Calibri" w:eastAsia="Calibri"/>
-                <w:b/>
-                <w:color w:val="1A1A1A"/>
-                <w:sz w:val="20"/>
-              </w:rPr>
-              <w:t>Телефон</w:t>
-            </w:r>
-          </w:p>
-        </w:tc>
-        <w:tc>
-          <w:tcPr>
-            <w:tcW w:type="dxa" w:w="6520"/>
-          </w:tcPr>
-          <w:p>
-            <w:pPr>
-              <w:spacing w:after="0"/>
-              <w:jc w:val="left"/>
-            </w:pPr>
-            <w:r/>
-            <w:r>
-              <w:rPr>
-                <w:rFonts w:ascii="Calibri" w:hAnsi="Calibri" w:eastAsia="Calibri"/>
-                <w:b w:val="0"/>
-                <w:color w:val="333333"/>
-                <w:sz w:val="20"/>
-              </w:rPr>
-              <w:t>8 (901) 797-57-53</w:t>
-            </w:r>
-          </w:p>
-        </w:tc>
-      </w:tr>
-      <w:tr>
-        <w:tc>
-          <w:tcPr>
-            <w:tcW w:type="dxa" w:w="2381"/>
-            <w:shd w:fill="F5F5F5" w:val="clear"/>
-          </w:tcPr>
-          <w:p>
-            <w:pPr>
-              <w:spacing w:after="0"/>
-              <w:jc w:val="left"/>
-            </w:pPr>
-            <w:r/>
-            <w:r>
-              <w:rPr>
-                <w:rFonts w:ascii="Calibri" w:hAnsi="Calibri" w:eastAsia="Calibri"/>
-                <w:b/>
-                <w:color w:val="1A1A1A"/>
-                <w:sz w:val="20"/>
-              </w:rPr>
-              <w:t>Зарплатный счёт (безнал)</w:t>
-            </w:r>
-          </w:p>
-        </w:tc>
-        <w:tc>
-          <w:tcPr>
-            <w:tcW w:type="dxa" w:w="6520"/>
-            <w:shd w:fill="FAFAFA" w:val="clear"/>
-          </w:tcPr>
-          <w:p>
-            <w:pPr>
-              <w:spacing w:after="0"/>
-              <w:jc w:val="left"/>
-            </w:pPr>
-            <w:r/>
-            <w:r>
-              <w:rPr>
-                <w:rFonts w:ascii="Calibri" w:hAnsi="Calibri" w:eastAsia="Calibri"/>
-                <w:b w:val="0"/>
-                <w:color w:val="333333"/>
-                <w:sz w:val="20"/>
-              </w:rPr>
-              <w:t>валюта RUB; получатель — ХОДЖИМАТОВ ФУРКАТЖОН МАХАМАДЖОНОВИЧ; счёт 40820810338110973759; банк — ПАО Сбербанк; БИК 044525225; к/с 30101810400000000225; ИНН банка 7707083893; КПП 773643001; ОКПО 57972160; ОГРН 1027700132195; SWIFT SABRRUMM; адрес банка — 109544, МОСКВА, УЛ.Б.АНДРОНЬЕВСКАЯ,6</w:t>
-            </w:r>
-          </w:p>
-        </w:tc>
-      </w:tr>
-    </w:tbl>
-    <w:p>
-      <w:pPr>
-        <w:spacing w:after="80"/>
-        <w:jc w:val="left"/>
-      </w:pPr>
-      <w:r>
-        <w:rPr>
-          <w:rFonts w:ascii="Calibri" w:hAnsi="Calibri" w:eastAsia="Calibri"/>
-          <w:b w:val="0"/>
-          <w:color w:val="333333"/>
-          <w:sz w:val="20"/>
-        </w:rPr>
-        <w:t>Экземпляр Договора получил: _________________ / Ходжиматов Ф. М. /     Дата: 01.08.2026</w:t>
-      </w:r>
-    </w:p>
     <w:p>
       <w:pPr>
         <w:spacing w:before="240"/>
@@ -2057,8 +2207,8 @@
       </w:r>
     </w:p>
     <w:sectPr>
-      <w:pgSz w:w="12240" w:h="15840"/>
-      <w:pgMar w:top="1134" w:right="1134" w:bottom="1134" w:left="1417" w:header="720" w:footer="720" w:gutter="0"/>
+      <w:pgSz w:w="11906" w:h="16838"/>
+      <w:pgMar w:top="850" w:right="850" w:bottom="850" w:left="850" w:header="720" w:footer="720" w:gutter="0"/>
       <w:cols w:space="720"/>
       <w:docGrid w:linePitch="360"/>
     </w:sectPr>

</xml_diff>

<commit_message>
Rebuild TD layout: bank table, section 10 page break, drop disclaimer.
Co-authored-by: Cursor <cursoragent@cursor.com>
</commit_message>
<xml_diff>
--- a/docs/трудовой-договор/трудовой-договор-Ходжиматов-бессрочный-01.08.2026.docx
+++ b/docs/трудовой-договор/трудовой-договор-Ходжиматов-бессрочный-01.08.2026.docx
@@ -4,6 +4,7 @@
   <w:body>
     <w:p>
       <w:pPr>
+        <w:spacing w:after="80"/>
         <w:jc w:val="center"/>
         <w:pBdr>
           <w:bottom w:val="single" w:sz="18" w:space="4" w:color="1A1A1A"/>
@@ -14,13 +15,14 @@
           <w:rFonts w:ascii="Calibri" w:hAnsi="Calibri" w:eastAsia="Calibri"/>
           <w:b/>
           <w:color w:val="1A1A1A"/>
-          <w:sz w:val="40"/>
+          <w:sz w:val="36"/>
         </w:rPr>
         <w:t>ТРУДОВОЙ ДОГОВОР</w:t>
       </w:r>
     </w:p>
     <w:p>
       <w:pPr>
+        <w:spacing w:after="160"/>
         <w:jc w:val="center"/>
       </w:pPr>
       <w:r>
@@ -28,7 +30,7 @@
           <w:rFonts w:ascii="Calibri" w:hAnsi="Calibri" w:eastAsia="Calibri"/>
           <w:b/>
           <w:color w:val="1A1A1A"/>
-          <w:sz w:val="22"/>
+          <w:sz w:val="20"/>
         </w:rPr>
         <w:t>с иностранным гражданином (Республика Узбекистан) · работа по патенту · на неопределённый срок</w:t>
       </w:r>
@@ -39,22 +41,28 @@
         <w:jc w:val="left"/>
         <w:tblLook w:firstColumn="1" w:firstRow="1" w:lastColumn="0" w:lastRow="0" w:noHBand="0" w:noVBand="1" w:val="04A0"/>
         <w:tblBorders>
-          <w:top w:val="single" w:sz="4" w:space="0" w:color="AAAAAA"/>
-          <w:left w:val="single" w:sz="4" w:space="0" w:color="AAAAAA"/>
-          <w:bottom w:val="single" w:sz="4" w:space="0" w:color="AAAAAA"/>
-          <w:right w:val="single" w:sz="4" w:space="0" w:color="AAAAAA"/>
-          <w:insideH w:val="single" w:sz="4" w:space="0" w:color="AAAAAA"/>
-          <w:insideV w:val="single" w:sz="4" w:space="0" w:color="AAAAAA"/>
+          <w:top w:val="single" w:sz="4" w:space="0" w:color="BBBBBB"/>
+          <w:left w:val="single" w:sz="4" w:space="0" w:color="BBBBBB"/>
+          <w:bottom w:val="single" w:sz="4" w:space="0" w:color="BBBBBB"/>
+          <w:right w:val="single" w:sz="4" w:space="0" w:color="BBBBBB"/>
+          <w:insideH w:val="single" w:sz="4" w:space="0" w:color="BBBBBB"/>
+          <w:insideV w:val="single" w:sz="4" w:space="0" w:color="BBBBBB"/>
         </w:tblBorders>
       </w:tblPr>
       <w:tblGrid>
-        <w:gridCol w:w="4844"/>
-        <w:gridCol w:w="4844"/>
+        <w:gridCol w:w="4876"/>
+        <w:gridCol w:w="4876"/>
       </w:tblGrid>
       <w:tr>
         <w:tc>
           <w:tcPr>
-            <w:tcW w:type="dxa" w:w="3118"/>
+            <w:tcW w:type="dxa" w:w="2948"/>
+            <w:tcMar>
+              <w:top w:w="30" w:type="dxa"/>
+              <w:left w:w="40" w:type="dxa"/>
+              <w:bottom w:w="30" w:type="dxa"/>
+              <w:right w:w="40" w:type="dxa"/>
+            </w:tcMar>
             <w:shd w:fill="F5F5F5" w:val="clear"/>
           </w:tcPr>
           <w:p>
@@ -62,7 +70,6 @@
               <w:spacing w:after="0"/>
               <w:jc w:val="left"/>
             </w:pPr>
-            <w:r/>
             <w:r>
               <w:rPr>
                 <w:rFonts w:ascii="Calibri" w:hAnsi="Calibri" w:eastAsia="Calibri"/>
@@ -76,19 +83,24 @@
         </w:tc>
         <w:tc>
           <w:tcPr>
-            <w:tcW w:type="dxa" w:w="6520"/>
+            <w:tcW w:type="dxa" w:w="6236"/>
+            <w:tcMar>
+              <w:top w:w="30" w:type="dxa"/>
+              <w:left w:w="40" w:type="dxa"/>
+              <w:bottom w:w="30" w:type="dxa"/>
+              <w:right w:w="40" w:type="dxa"/>
+            </w:tcMar>
           </w:tcPr>
           <w:p>
             <w:pPr>
               <w:spacing w:after="0"/>
               <w:jc w:val="left"/>
             </w:pPr>
-            <w:r/>
             <w:r>
               <w:rPr>
                 <w:rFonts w:ascii="Calibri" w:hAnsi="Calibri" w:eastAsia="Calibri"/>
                 <w:b w:val="0"/>
-                <w:color w:val="333333"/>
+                <w:color w:val="1A1A1A"/>
                 <w:sz w:val="20"/>
               </w:rPr>
               <w:t>01.08.2026</w:t>
@@ -99,7 +111,13 @@
       <w:tr>
         <w:tc>
           <w:tcPr>
-            <w:tcW w:type="dxa" w:w="3118"/>
+            <w:tcW w:type="dxa" w:w="2948"/>
+            <w:tcMar>
+              <w:top w:w="30" w:type="dxa"/>
+              <w:left w:w="40" w:type="dxa"/>
+              <w:bottom w:w="30" w:type="dxa"/>
+              <w:right w:w="40" w:type="dxa"/>
+            </w:tcMar>
             <w:shd w:fill="F5F5F5" w:val="clear"/>
           </w:tcPr>
           <w:p>
@@ -107,7 +125,6 @@
               <w:spacing w:after="0"/>
               <w:jc w:val="left"/>
             </w:pPr>
-            <w:r/>
             <w:r>
               <w:rPr>
                 <w:rFonts w:ascii="Calibri" w:hAnsi="Calibri" w:eastAsia="Calibri"/>
@@ -121,7 +138,13 @@
         </w:tc>
         <w:tc>
           <w:tcPr>
-            <w:tcW w:type="dxa" w:w="6520"/>
+            <w:tcW w:type="dxa" w:w="6236"/>
+            <w:tcMar>
+              <w:top w:w="30" w:type="dxa"/>
+              <w:left w:w="40" w:type="dxa"/>
+              <w:bottom w:w="30" w:type="dxa"/>
+              <w:right w:w="40" w:type="dxa"/>
+            </w:tcMar>
             <w:shd w:fill="FAFAFA" w:val="clear"/>
           </w:tcPr>
           <w:p>
@@ -129,12 +152,11 @@
               <w:spacing w:after="0"/>
               <w:jc w:val="left"/>
             </w:pPr>
-            <w:r/>
             <w:r>
               <w:rPr>
                 <w:rFonts w:ascii="Calibri" w:hAnsi="Calibri" w:eastAsia="Calibri"/>
                 <w:b w:val="0"/>
-                <w:color w:val="333333"/>
+                <w:color w:val="1A1A1A"/>
                 <w:sz w:val="20"/>
               </w:rPr>
               <w:t>г. Москва</w:t>
@@ -145,7 +167,13 @@
       <w:tr>
         <w:tc>
           <w:tcPr>
-            <w:tcW w:type="dxa" w:w="3118"/>
+            <w:tcW w:type="dxa" w:w="2948"/>
+            <w:tcMar>
+              <w:top w:w="30" w:type="dxa"/>
+              <w:left w:w="40" w:type="dxa"/>
+              <w:bottom w:w="30" w:type="dxa"/>
+              <w:right w:w="40" w:type="dxa"/>
+            </w:tcMar>
             <w:shd w:fill="F5F5F5" w:val="clear"/>
           </w:tcPr>
           <w:p>
@@ -153,7 +181,6 @@
               <w:spacing w:after="0"/>
               <w:jc w:val="left"/>
             </w:pPr>
-            <w:r/>
             <w:r>
               <w:rPr>
                 <w:rFonts w:ascii="Calibri" w:hAnsi="Calibri" w:eastAsia="Calibri"/>
@@ -167,19 +194,24 @@
         </w:tc>
         <w:tc>
           <w:tcPr>
-            <w:tcW w:type="dxa" w:w="6520"/>
+            <w:tcW w:type="dxa" w:w="6236"/>
+            <w:tcMar>
+              <w:top w:w="30" w:type="dxa"/>
+              <w:left w:w="40" w:type="dxa"/>
+              <w:bottom w:w="30" w:type="dxa"/>
+              <w:right w:w="40" w:type="dxa"/>
+            </w:tcMar>
           </w:tcPr>
           <w:p>
             <w:pPr>
               <w:spacing w:after="0"/>
               <w:jc w:val="left"/>
             </w:pPr>
-            <w:r/>
             <w:r>
               <w:rPr>
                 <w:rFonts w:ascii="Calibri" w:hAnsi="Calibri" w:eastAsia="Calibri"/>
                 <w:b w:val="0"/>
-                <w:color w:val="333333"/>
+                <w:color w:val="1A1A1A"/>
                 <w:sz w:val="20"/>
               </w:rPr>
               <w:t>Бессрочный (на неопределённый срок)</w:t>
@@ -190,7 +222,13 @@
       <w:tr>
         <w:tc>
           <w:tcPr>
-            <w:tcW w:type="dxa" w:w="3118"/>
+            <w:tcW w:type="dxa" w:w="2948"/>
+            <w:tcMar>
+              <w:top w:w="30" w:type="dxa"/>
+              <w:left w:w="40" w:type="dxa"/>
+              <w:bottom w:w="30" w:type="dxa"/>
+              <w:right w:w="40" w:type="dxa"/>
+            </w:tcMar>
             <w:shd w:fill="F5F5F5" w:val="clear"/>
           </w:tcPr>
           <w:p>
@@ -198,7 +236,6 @@
               <w:spacing w:after="0"/>
               <w:jc w:val="left"/>
             </w:pPr>
-            <w:r/>
             <w:r>
               <w:rPr>
                 <w:rFonts w:ascii="Calibri" w:hAnsi="Calibri" w:eastAsia="Calibri"/>
@@ -212,7 +249,13 @@
         </w:tc>
         <w:tc>
           <w:tcPr>
-            <w:tcW w:type="dxa" w:w="6520"/>
+            <w:tcW w:type="dxa" w:w="6236"/>
+            <w:tcMar>
+              <w:top w:w="30" w:type="dxa"/>
+              <w:left w:w="40" w:type="dxa"/>
+              <w:bottom w:w="30" w:type="dxa"/>
+              <w:right w:w="40" w:type="dxa"/>
+            </w:tcMar>
             <w:shd w:fill="FAFAFA" w:val="clear"/>
           </w:tcPr>
           <w:p>
@@ -220,12 +263,11 @@
               <w:spacing w:after="0"/>
               <w:jc w:val="left"/>
             </w:pPr>
-            <w:r/>
             <w:r>
               <w:rPr>
                 <w:rFonts w:ascii="Calibri" w:hAnsi="Calibri" w:eastAsia="Calibri"/>
                 <w:b w:val="0"/>
-                <w:color w:val="333333"/>
+                <w:color w:val="1A1A1A"/>
                 <w:sz w:val="20"/>
               </w:rPr>
               <w:t>01.08.2026</w:t>
@@ -236,7 +278,13 @@
       <w:tr>
         <w:tc>
           <w:tcPr>
-            <w:tcW w:type="dxa" w:w="3118"/>
+            <w:tcW w:type="dxa" w:w="2948"/>
+            <w:tcMar>
+              <w:top w:w="30" w:type="dxa"/>
+              <w:left w:w="40" w:type="dxa"/>
+              <w:bottom w:w="30" w:type="dxa"/>
+              <w:right w:w="40" w:type="dxa"/>
+            </w:tcMar>
             <w:shd w:fill="F5F5F5" w:val="clear"/>
           </w:tcPr>
           <w:p>
@@ -244,7 +292,6 @@
               <w:spacing w:after="0"/>
               <w:jc w:val="left"/>
             </w:pPr>
-            <w:r/>
             <w:r>
               <w:rPr>
                 <w:rFonts w:ascii="Calibri" w:hAnsi="Calibri" w:eastAsia="Calibri"/>
@@ -258,19 +305,24 @@
         </w:tc>
         <w:tc>
           <w:tcPr>
-            <w:tcW w:type="dxa" w:w="6520"/>
+            <w:tcW w:type="dxa" w:w="6236"/>
+            <w:tcMar>
+              <w:top w:w="30" w:type="dxa"/>
+              <w:left w:w="40" w:type="dxa"/>
+              <w:bottom w:w="30" w:type="dxa"/>
+              <w:right w:w="40" w:type="dxa"/>
+            </w:tcMar>
           </w:tcPr>
           <w:p>
             <w:pPr>
               <w:spacing w:after="0"/>
               <w:jc w:val="left"/>
             </w:pPr>
-            <w:r/>
             <w:r>
               <w:rPr>
                 <w:rFonts w:ascii="Calibri" w:hAnsi="Calibri" w:eastAsia="Calibri"/>
                 <w:b w:val="0"/>
-                <w:color w:val="333333"/>
+                <w:color w:val="1A1A1A"/>
                 <w:sz w:val="20"/>
               </w:rPr>
               <w:t>Бармен</w:t>
@@ -281,7 +333,13 @@
       <w:tr>
         <w:tc>
           <w:tcPr>
-            <w:tcW w:type="dxa" w:w="3118"/>
+            <w:tcW w:type="dxa" w:w="2948"/>
+            <w:tcMar>
+              <w:top w:w="30" w:type="dxa"/>
+              <w:left w:w="40" w:type="dxa"/>
+              <w:bottom w:w="30" w:type="dxa"/>
+              <w:right w:w="40" w:type="dxa"/>
+            </w:tcMar>
             <w:shd w:fill="F5F5F5" w:val="clear"/>
           </w:tcPr>
           <w:p>
@@ -289,7 +347,6 @@
               <w:spacing w:after="0"/>
               <w:jc w:val="left"/>
             </w:pPr>
-            <w:r/>
             <w:r>
               <w:rPr>
                 <w:rFonts w:ascii="Calibri" w:hAnsi="Calibri" w:eastAsia="Calibri"/>
@@ -303,7 +360,13 @@
         </w:tc>
         <w:tc>
           <w:tcPr>
-            <w:tcW w:type="dxa" w:w="6520"/>
+            <w:tcW w:type="dxa" w:w="6236"/>
+            <w:tcMar>
+              <w:top w:w="30" w:type="dxa"/>
+              <w:left w:w="40" w:type="dxa"/>
+              <w:bottom w:w="30" w:type="dxa"/>
+              <w:right w:w="40" w:type="dxa"/>
+            </w:tcMar>
             <w:shd w:fill="FAFAFA" w:val="clear"/>
           </w:tcPr>
           <w:p>
@@ -311,12 +374,11 @@
               <w:spacing w:after="0"/>
               <w:jc w:val="left"/>
             </w:pPr>
-            <w:r/>
             <w:r>
               <w:rPr>
                 <w:rFonts w:ascii="Calibri" w:hAnsi="Calibri" w:eastAsia="Calibri"/>
                 <w:b w:val="0"/>
-                <w:color w:val="333333"/>
+                <w:color w:val="1A1A1A"/>
                 <w:sz w:val="20"/>
               </w:rPr>
               <w:t>39 730 руб./мес.</w:t>
@@ -327,14 +389,14 @@
     </w:tbl>
     <w:p>
       <w:pPr>
-        <w:spacing w:after="80"/>
+        <w:spacing w:before="160" w:after="80"/>
         <w:jc w:val="both"/>
       </w:pPr>
       <w:r>
         <w:rPr>
           <w:rFonts w:ascii="Calibri" w:hAnsi="Calibri" w:eastAsia="Calibri"/>
           <w:b w:val="0"/>
-          <w:color w:val="333333"/>
+          <w:color w:val="1A1A1A"/>
           <w:sz w:val="22"/>
         </w:rPr>
         <w:t>Индивидуальный предприниматель Сорванова Анна Александровна, ОГРНИП 322774600583080, ИНН 772973703990, зарегистрированный по адресу: г. Москва, ул. Василия Ланового, д. 3, кв. 243, именуемый в дальнейшем «Работодатель», с одной стороны, и гражданин Республики Узбекистан Ходжиматов Фуркатжон Махамаджонович (KHODJIMATOV FURKATJON MAKHAMADJONOVICH), дата рождения 01.02.1998, паспорт № FA6253664, выдан 29.08.2022, MIA 18227 (Узбекистан), действует до 28.08.2027, адрес пребывания: г. Москва, поселение Вороновское, Варшавское ш. 64-й км, домовладение 1, строение 47, ИНН 772430430429, СНИЛС 229-173-224 63, телефон 8 (901) 797-57-53, именуемый в дальнейшем «Работник», с другой стороны, вместе именуемые «Стороны», заключили настоящий трудовой договор (далее — Договор) о нижеследующем.</w:t>
@@ -359,14 +421,14 @@
     </w:p>
     <w:p>
       <w:pPr>
-        <w:spacing w:after="80"/>
+        <w:spacing w:before="0" w:after="80"/>
         <w:jc w:val="both"/>
       </w:pPr>
       <w:r>
         <w:rPr>
           <w:rFonts w:ascii="Calibri" w:hAnsi="Calibri" w:eastAsia="Calibri"/>
           <w:b w:val="0"/>
-          <w:color w:val="333333"/>
+          <w:color w:val="1A1A1A"/>
           <w:sz w:val="22"/>
         </w:rPr>
         <w:t>1.1. Работодатель принимает Работника на работу на должность «Бармен», а Работник обязуется лично выполнять трудовую функцию, соблюдать правила внутреннего трудового распорядка и иные локальные акты Работодателя. Должность соответствует профессии (виду деятельности), указанной в патенте Работника.</w:t>
@@ -374,14 +436,14 @@
     </w:p>
     <w:p>
       <w:pPr>
-        <w:spacing w:after="80"/>
+        <w:spacing w:before="0" w:after="80"/>
         <w:jc w:val="both"/>
       </w:pPr>
       <w:r>
         <w:rPr>
           <w:rFonts w:ascii="Calibri" w:hAnsi="Calibri" w:eastAsia="Calibri"/>
           <w:b w:val="0"/>
-          <w:color w:val="333333"/>
+          <w:color w:val="1A1A1A"/>
           <w:sz w:val="22"/>
         </w:rPr>
         <w:t>1.2. Место работы: г. Москва, ул. Киевская, д. 7, к. 2 (место осуществления деятельности Работодателя — кофейня).</w:t>
@@ -389,14 +451,14 @@
     </w:p>
     <w:p>
       <w:pPr>
-        <w:spacing w:after="80"/>
+        <w:spacing w:before="0" w:after="80"/>
         <w:jc w:val="both"/>
       </w:pPr>
       <w:r>
         <w:rPr>
           <w:rFonts w:ascii="Calibri" w:hAnsi="Calibri" w:eastAsia="Calibri"/>
           <w:b w:val="0"/>
-          <w:color w:val="333333"/>
+          <w:color w:val="1A1A1A"/>
           <w:sz w:val="22"/>
         </w:rPr>
         <w:t>1.3. Работа по настоящему Договору является для Работника основной.</w:t>
@@ -404,14 +466,14 @@
     </w:p>
     <w:p>
       <w:pPr>
-        <w:spacing w:after="80"/>
+        <w:spacing w:before="0" w:after="80"/>
         <w:jc w:val="both"/>
       </w:pPr>
       <w:r>
         <w:rPr>
           <w:rFonts w:ascii="Calibri" w:hAnsi="Calibri" w:eastAsia="Calibri"/>
           <w:b w:val="0"/>
-          <w:color w:val="333333"/>
+          <w:color w:val="1A1A1A"/>
           <w:sz w:val="22"/>
         </w:rPr>
         <w:t>1.4. Правовым основанием трудовой деятельности Работника на территории Российской Федерации является патент (серия 77 № 2600347821), выданный 14.07.2026, Отдел внешней трудовой миграции УВМ ГУ МВД России по г. Москве. Территория действия патента: г. Москва. Учётный номер (ПР): ПР 8114303. Профессия / вид деятельности по патенту: Бармен.</w:t>
@@ -419,14 +481,14 @@
     </w:p>
     <w:p>
       <w:pPr>
-        <w:spacing w:after="80"/>
+        <w:spacing w:before="0" w:after="80"/>
         <w:jc w:val="both"/>
       </w:pPr>
       <w:r>
         <w:rPr>
           <w:rFonts w:ascii="Calibri" w:hAnsi="Calibri" w:eastAsia="Calibri"/>
           <w:b w:val="0"/>
-          <w:color w:val="333333"/>
+          <w:color w:val="1A1A1A"/>
           <w:sz w:val="22"/>
         </w:rPr>
         <w:t>1.5. Миграционная карта: серия 45 26 № 0767385, въезд 07.06.2026, КПП Внуково, срок пребывания до 04.09.2026, цель визита — работа.</w:t>
@@ -451,14 +513,14 @@
     </w:p>
     <w:p>
       <w:pPr>
-        <w:spacing w:after="80"/>
+        <w:spacing w:before="0" w:after="80"/>
         <w:jc w:val="both"/>
       </w:pPr>
       <w:r>
         <w:rPr>
           <w:rFonts w:ascii="Calibri" w:hAnsi="Calibri" w:eastAsia="Calibri"/>
           <w:b w:val="0"/>
-          <w:color w:val="333333"/>
+          <w:color w:val="1A1A1A"/>
           <w:sz w:val="22"/>
         </w:rPr>
         <w:t>2.1. Договор заключён на неопределённый срок. Дата начала работы: 01.08.2026. Срок действия патента сам по себе не является основанием срочности трудового договора (ч. 5 ст. 327.1 ТК РФ; письмо Роструда от 23.10.2013 № ПГ/9509-6-1).</w:t>
@@ -466,14 +528,14 @@
     </w:p>
     <w:p>
       <w:pPr>
-        <w:spacing w:after="80"/>
+        <w:spacing w:before="0" w:after="80"/>
         <w:jc w:val="both"/>
       </w:pPr>
       <w:r>
         <w:rPr>
           <w:rFonts w:ascii="Calibri" w:hAnsi="Calibri" w:eastAsia="Calibri"/>
           <w:b w:val="0"/>
-          <w:color w:val="333333"/>
+          <w:color w:val="1A1A1A"/>
           <w:sz w:val="22"/>
         </w:rPr>
         <w:t>2.2. Работнику устанавливается испытательный срок продолжительностью 1 (один) месяц с даты начала работы. В период испытания на Работника распространяются положения трудового законодательства и иных актов, содержащих нормы трудового права.</w:t>
@@ -498,14 +560,14 @@
     </w:p>
     <w:p>
       <w:pPr>
-        <w:spacing w:after="80"/>
+        <w:spacing w:before="0" w:after="80"/>
         <w:jc w:val="both"/>
       </w:pPr>
       <w:r>
         <w:rPr>
           <w:rFonts w:ascii="Calibri" w:hAnsi="Calibri" w:eastAsia="Calibri"/>
           <w:b w:val="0"/>
-          <w:color w:val="333333"/>
+          <w:color w:val="1A1A1A"/>
           <w:sz w:val="22"/>
         </w:rPr>
         <w:t>3.1. В рамках должности «Бармен» Работник обязан:</w:t>
@@ -513,14 +575,14 @@
     </w:p>
     <w:p>
       <w:pPr>
-        <w:spacing w:after="80"/>
+        <w:spacing w:before="0" w:after="80"/>
         <w:jc w:val="both"/>
       </w:pPr>
       <w:r>
         <w:rPr>
           <w:rFonts w:ascii="Calibri" w:hAnsi="Calibri" w:eastAsia="Calibri"/>
           <w:b w:val="0"/>
-          <w:color w:val="333333"/>
+          <w:color w:val="1A1A1A"/>
           <w:sz w:val="22"/>
         </w:rPr>
         <w:t>3.1.1. готовить кофейные, чайные и иные напитки на вынос по рецептурам и стандартам Работодателя;</w:t>
@@ -528,14 +590,14 @@
     </w:p>
     <w:p>
       <w:pPr>
-        <w:spacing w:after="80"/>
+        <w:spacing w:before="0" w:after="80"/>
         <w:jc w:val="both"/>
       </w:pPr>
       <w:r>
         <w:rPr>
           <w:rFonts w:ascii="Calibri" w:hAnsi="Calibri" w:eastAsia="Calibri"/>
           <w:b w:val="0"/>
-          <w:color w:val="333333"/>
+          <w:color w:val="1A1A1A"/>
           <w:sz w:val="22"/>
         </w:rPr>
         <w:t>3.1.2. осуществлять продажу готовой продукции и сопутствующих товаров;</w:t>
@@ -543,14 +605,14 @@
     </w:p>
     <w:p>
       <w:pPr>
-        <w:spacing w:after="80"/>
+        <w:spacing w:before="0" w:after="80"/>
         <w:jc w:val="both"/>
       </w:pPr>
       <w:r>
         <w:rPr>
           <w:rFonts w:ascii="Calibri" w:hAnsi="Calibri" w:eastAsia="Calibri"/>
           <w:b w:val="0"/>
-          <w:color w:val="333333"/>
+          <w:color w:val="1A1A1A"/>
           <w:sz w:val="22"/>
         </w:rPr>
         <w:t>3.1.3. принимать оплату от клиентов, соблюдать кассовую дисциплину и порядок учёта выручки по указанию Работодателя;</w:t>
@@ -558,14 +620,14 @@
     </w:p>
     <w:p>
       <w:pPr>
-        <w:spacing w:after="80"/>
+        <w:spacing w:before="0" w:after="80"/>
         <w:jc w:val="both"/>
       </w:pPr>
       <w:r>
         <w:rPr>
           <w:rFonts w:ascii="Calibri" w:hAnsi="Calibri" w:eastAsia="Calibri"/>
           <w:b w:val="0"/>
-          <w:color w:val="333333"/>
+          <w:color w:val="1A1A1A"/>
           <w:sz w:val="22"/>
         </w:rPr>
         <w:t>3.1.4. консультировать клиентов по ассортименту напитков и продукции;</w:t>
@@ -573,14 +635,14 @@
     </w:p>
     <w:p>
       <w:pPr>
-        <w:spacing w:after="80"/>
+        <w:spacing w:before="0" w:after="80"/>
         <w:jc w:val="both"/>
       </w:pPr>
       <w:r>
         <w:rPr>
           <w:rFonts w:ascii="Calibri" w:hAnsi="Calibri" w:eastAsia="Calibri"/>
           <w:b w:val="0"/>
-          <w:color w:val="333333"/>
+          <w:color w:val="1A1A1A"/>
           <w:sz w:val="22"/>
         </w:rPr>
         <w:t>3.1.5. поддерживать чистоту рабочей зоны, барной стойки, посуды и оборудования;</w:t>
@@ -588,14 +650,14 @@
     </w:p>
     <w:p>
       <w:pPr>
-        <w:spacing w:after="80"/>
+        <w:spacing w:before="0" w:after="80"/>
         <w:jc w:val="both"/>
       </w:pPr>
       <w:r>
         <w:rPr>
           <w:rFonts w:ascii="Calibri" w:hAnsi="Calibri" w:eastAsia="Calibri"/>
           <w:b w:val="0"/>
-          <w:color w:val="333333"/>
+          <w:color w:val="1A1A1A"/>
           <w:sz w:val="22"/>
         </w:rPr>
         <w:t>3.1.6. соблюдать санитарные нормы и правила гигиены на рабочем месте;</w:t>
@@ -603,14 +665,14 @@
     </w:p>
     <w:p>
       <w:pPr>
-        <w:spacing w:after="80"/>
+        <w:spacing w:before="0" w:after="80"/>
         <w:jc w:val="both"/>
       </w:pPr>
       <w:r>
         <w:rPr>
           <w:rFonts w:ascii="Calibri" w:hAnsi="Calibri" w:eastAsia="Calibri"/>
           <w:b w:val="0"/>
-          <w:color w:val="333333"/>
+          <w:color w:val="1A1A1A"/>
           <w:sz w:val="22"/>
         </w:rPr>
         <w:t>3.1.7. вести учёт расходных материалов, продуктов и инвентаря в объёме, определённом Работодателем;</w:t>
@@ -618,14 +680,14 @@
     </w:p>
     <w:p>
       <w:pPr>
-        <w:spacing w:after="80"/>
+        <w:spacing w:before="0" w:after="80"/>
         <w:jc w:val="both"/>
       </w:pPr>
       <w:r>
         <w:rPr>
           <w:rFonts w:ascii="Calibri" w:hAnsi="Calibri" w:eastAsia="Calibri"/>
           <w:b w:val="0"/>
-          <w:color w:val="333333"/>
+          <w:color w:val="1A1A1A"/>
           <w:sz w:val="22"/>
         </w:rPr>
         <w:t>3.1.8. бережно относиться к имуществу Работодателя и сообщать о неисправностях оборудования;</w:t>
@@ -633,14 +695,14 @@
     </w:p>
     <w:p>
       <w:pPr>
-        <w:spacing w:after="80"/>
+        <w:spacing w:before="0" w:after="80"/>
         <w:jc w:val="both"/>
       </w:pPr>
       <w:r>
         <w:rPr>
           <w:rFonts w:ascii="Calibri" w:hAnsi="Calibri" w:eastAsia="Calibri"/>
           <w:b w:val="0"/>
-          <w:color w:val="333333"/>
+          <w:color w:val="1A1A1A"/>
           <w:sz w:val="22"/>
         </w:rPr>
         <w:t>3.1.9. соблюдать требования охраны труда, пожарной безопасности и локальных актов Работодателя;</w:t>
@@ -648,14 +710,14 @@
     </w:p>
     <w:p>
       <w:pPr>
-        <w:spacing w:after="80"/>
+        <w:spacing w:before="0" w:after="80"/>
         <w:jc w:val="both"/>
       </w:pPr>
       <w:r>
         <w:rPr>
           <w:rFonts w:ascii="Calibri" w:hAnsi="Calibri" w:eastAsia="Calibri"/>
           <w:b w:val="0"/>
-          <w:color w:val="333333"/>
+          <w:color w:val="1A1A1A"/>
           <w:sz w:val="22"/>
         </w:rPr>
         <w:t>3.1.10. своевременно сообщать об изменении паспортных, миграционных данных, реквизитов патента, СНИЛС, ИНН и банковских реквизитов;</w:t>
@@ -663,14 +725,14 @@
     </w:p>
     <w:p>
       <w:pPr>
-        <w:spacing w:after="80"/>
+        <w:spacing w:before="0" w:after="80"/>
         <w:jc w:val="both"/>
       </w:pPr>
       <w:r>
         <w:rPr>
           <w:rFonts w:ascii="Calibri" w:hAnsi="Calibri" w:eastAsia="Calibri"/>
           <w:b w:val="0"/>
-          <w:color w:val="333333"/>
+          <w:color w:val="1A1A1A"/>
           <w:sz w:val="22"/>
         </w:rPr>
         <w:t>3.1.11. самостоятельно поддерживать действие патента (уплата фиксированных авансовых платежей по НДФЛ) и законность пребывания на территории РФ.</w:t>
@@ -678,14 +740,14 @@
     </w:p>
     <w:p>
       <w:pPr>
-        <w:spacing w:after="80"/>
+        <w:spacing w:before="0" w:after="80"/>
         <w:jc w:val="both"/>
       </w:pPr>
       <w:r>
         <w:rPr>
           <w:rFonts w:ascii="Calibri" w:hAnsi="Calibri" w:eastAsia="Calibri"/>
           <w:b w:val="0"/>
-          <w:color w:val="333333"/>
+          <w:color w:val="1A1A1A"/>
           <w:sz w:val="22"/>
         </w:rPr>
         <w:t>3.2. Работодатель обязан: предоставить работу, обусловленную Договором; обеспечить безопасные условия труда; своевременно и в полном объёме выплачивать заработную плату исключительно в безналичной форме; вести кадровый и налоговый учёт; уведомить территориальный орган МВД России о заключении и о расторжении настоящего Договора в срок не более 3 рабочих дней (п. 8 ст. 13 Федерального закона от 25.07.2002 № 115-ФЗ); соблюдать требования о персональных данных.</w:t>
@@ -693,14 +755,14 @@
     </w:p>
     <w:p>
       <w:pPr>
-        <w:spacing w:after="80"/>
+        <w:spacing w:before="0" w:after="80"/>
         <w:jc w:val="both"/>
       </w:pPr>
       <w:r>
         <w:rPr>
           <w:rFonts w:ascii="Calibri" w:hAnsi="Calibri" w:eastAsia="Calibri"/>
           <w:b w:val="0"/>
-          <w:color w:val="333333"/>
+          <w:color w:val="1A1A1A"/>
           <w:sz w:val="22"/>
         </w:rPr>
         <w:t>3.3. Стороны имеют иные права и обязанности, предусмотренные ТК РФ, Законом № 115-ФЗ и иными нормативными правовыми актами РФ.</w:t>
@@ -725,14 +787,14 @@
     </w:p>
     <w:p>
       <w:pPr>
-        <w:spacing w:after="80"/>
+        <w:spacing w:before="0" w:after="80"/>
         <w:jc w:val="both"/>
       </w:pPr>
       <w:r>
         <w:rPr>
           <w:rFonts w:ascii="Calibri" w:hAnsi="Calibri" w:eastAsia="Calibri"/>
           <w:b w:val="0"/>
-          <w:color w:val="333333"/>
+          <w:color w:val="1A1A1A"/>
           <w:sz w:val="22"/>
         </w:rPr>
         <w:t>4.1. Работнику устанавливается пятидневная рабочая неделя с двумя выходными днями — суббота и воскресенье. Нормальная продолжительность рабочего времени — 40 (сорок) часов в неделю.</w:t>
@@ -740,14 +802,14 @@
     </w:p>
     <w:p>
       <w:pPr>
-        <w:spacing w:after="80"/>
+        <w:spacing w:before="0" w:after="80"/>
         <w:jc w:val="both"/>
       </w:pPr>
       <w:r>
         <w:rPr>
           <w:rFonts w:ascii="Calibri" w:hAnsi="Calibri" w:eastAsia="Calibri"/>
           <w:b w:val="0"/>
-          <w:color w:val="333333"/>
+          <w:color w:val="1A1A1A"/>
           <w:sz w:val="22"/>
         </w:rPr>
         <w:t>4.2. Время присутствия на рабочем месте: с 08:00 до 18:00. В указанный интервал включается перерыв для отдыха и питания продолжительностью 2 (два) часа — с 12:00 до 14:00, который не включается в рабочее время. Таким образом, продолжительность ежедневной работы составляет 8 часов (10 часов присутствия минус 2 часа перерыва), что соответствует норме 40 часов в неделю.</w:t>
@@ -755,14 +817,14 @@
     </w:p>
     <w:p>
       <w:pPr>
-        <w:spacing w:after="80"/>
+        <w:spacing w:before="0" w:after="80"/>
         <w:jc w:val="both"/>
       </w:pPr>
       <w:r>
         <w:rPr>
           <w:rFonts w:ascii="Calibri" w:hAnsi="Calibri" w:eastAsia="Calibri"/>
           <w:b w:val="0"/>
-          <w:color w:val="333333"/>
+          <w:color w:val="1A1A1A"/>
           <w:sz w:val="22"/>
         </w:rPr>
         <w:t>4.3. Ежегодный оплачиваемый отпуск предоставляется продолжительностью 28 календарных дней в порядке, установленном ТК РФ.</w:t>
@@ -787,14 +849,14 @@
     </w:p>
     <w:p>
       <w:pPr>
-        <w:spacing w:after="80"/>
+        <w:spacing w:before="0" w:after="80"/>
         <w:jc w:val="both"/>
       </w:pPr>
       <w:r>
         <w:rPr>
           <w:rFonts w:ascii="Calibri" w:hAnsi="Calibri" w:eastAsia="Calibri"/>
           <w:b w:val="0"/>
-          <w:color w:val="333333"/>
+          <w:color w:val="1A1A1A"/>
           <w:sz w:val="22"/>
         </w:rPr>
         <w:t>5.1. Работнику устанавливается должностной оклад в размере 39 730 (тридцать девять тысяч семьсот тридцать) рублей в месяц до удержания НДФЛ. Сумма не ниже минимальной заработной платы в городе Москве на 2026 год (39 730 руб. за полную норму рабочего времени).</w:t>
@@ -802,14 +864,14 @@
     </w:p>
     <w:p>
       <w:pPr>
-        <w:spacing w:after="80"/>
+        <w:spacing w:before="0" w:after="80"/>
         <w:jc w:val="both"/>
       </w:pPr>
       <w:r>
         <w:rPr>
           <w:rFonts w:ascii="Calibri" w:hAnsi="Calibri" w:eastAsia="Calibri"/>
           <w:b w:val="0"/>
-          <w:color w:val="333333"/>
+          <w:color w:val="1A1A1A"/>
           <w:sz w:val="22"/>
         </w:rPr>
         <w:t>5.2. Заработная плата выплачивается исключительно в безналичном порядке путём перечисления на банковский счёт Работника. Выплата заработной платы наличными денежными средствами иностранному работнику — валютному нерезиденту не допускается (ст. 14 Федерального закона от 10.12.2003 № 173-ФЗ).</w:t>
@@ -817,29 +879,729 @@
     </w:p>
     <w:p>
       <w:pPr>
-        <w:spacing w:after="80"/>
+        <w:spacing w:before="0" w:after="40"/>
+        <w:jc w:val="left"/>
+      </w:pPr>
+      <w:r>
+        <w:rPr>
+          <w:rFonts w:ascii="Calibri" w:hAnsi="Calibri" w:eastAsia="Calibri"/>
+          <w:b w:val="0"/>
+          <w:color w:val="1A1A1A"/>
+          <w:sz w:val="22"/>
+        </w:rPr>
+        <w:t>5.3. Реквизиты для перечисления заработной платы:</w:t>
+      </w:r>
+    </w:p>
+    <w:tbl>
+      <w:tblPr>
+        <w:tblW w:type="auto" w:w="0"/>
+        <w:jc w:val="left"/>
+        <w:tblLook w:firstColumn="1" w:firstRow="1" w:lastColumn="0" w:lastRow="0" w:noHBand="0" w:noVBand="1" w:val="04A0"/>
+        <w:tblBorders>
+          <w:top w:val="single" w:sz="4" w:space="0" w:color="BBBBBB"/>
+          <w:left w:val="single" w:sz="4" w:space="0" w:color="BBBBBB"/>
+          <w:bottom w:val="single" w:sz="4" w:space="0" w:color="BBBBBB"/>
+          <w:right w:val="single" w:sz="4" w:space="0" w:color="BBBBBB"/>
+          <w:insideH w:val="single" w:sz="4" w:space="0" w:color="BBBBBB"/>
+          <w:insideV w:val="single" w:sz="4" w:space="0" w:color="BBBBBB"/>
+        </w:tblBorders>
+      </w:tblPr>
+      <w:tblGrid>
+        <w:gridCol w:w="4876"/>
+        <w:gridCol w:w="4876"/>
+      </w:tblGrid>
+      <w:tr>
+        <w:tc>
+          <w:tcPr>
+            <w:tcW w:type="dxa" w:w="1928"/>
+            <w:tcMar>
+              <w:top w:w="30" w:type="dxa"/>
+              <w:left w:w="40" w:type="dxa"/>
+              <w:bottom w:w="30" w:type="dxa"/>
+              <w:right w:w="40" w:type="dxa"/>
+            </w:tcMar>
+            <w:shd w:fill="F5F5F5" w:val="clear"/>
+          </w:tcPr>
+          <w:p>
+            <w:pPr>
+              <w:spacing w:after="0"/>
+              <w:jc w:val="left"/>
+            </w:pPr>
+            <w:r>
+              <w:rPr>
+                <w:rFonts w:ascii="Calibri" w:hAnsi="Calibri" w:eastAsia="Calibri"/>
+                <w:b/>
+                <w:color w:val="1A1A1A"/>
+                <w:sz w:val="18"/>
+              </w:rPr>
+              <w:t>Получатель</w:t>
+            </w:r>
+          </w:p>
+        </w:tc>
+        <w:tc>
+          <w:tcPr>
+            <w:tcW w:type="dxa" w:w="7257"/>
+            <w:tcMar>
+              <w:top w:w="30" w:type="dxa"/>
+              <w:left w:w="40" w:type="dxa"/>
+              <w:bottom w:w="30" w:type="dxa"/>
+              <w:right w:w="40" w:type="dxa"/>
+            </w:tcMar>
+          </w:tcPr>
+          <w:p>
+            <w:pPr>
+              <w:spacing w:after="0"/>
+              <w:jc w:val="left"/>
+            </w:pPr>
+            <w:r>
+              <w:rPr>
+                <w:rFonts w:ascii="Calibri" w:hAnsi="Calibri" w:eastAsia="Calibri"/>
+                <w:b w:val="0"/>
+                <w:color w:val="1A1A1A"/>
+                <w:sz w:val="18"/>
+              </w:rPr>
+              <w:t>ХОДЖИМАТОВ ФУРКАТЖОН МАХАМАДЖОНОВИЧ</w:t>
+            </w:r>
+          </w:p>
+        </w:tc>
+      </w:tr>
+      <w:tr>
+        <w:tc>
+          <w:tcPr>
+            <w:tcW w:type="dxa" w:w="1928"/>
+            <w:tcMar>
+              <w:top w:w="30" w:type="dxa"/>
+              <w:left w:w="40" w:type="dxa"/>
+              <w:bottom w:w="30" w:type="dxa"/>
+              <w:right w:w="40" w:type="dxa"/>
+            </w:tcMar>
+            <w:shd w:fill="F5F5F5" w:val="clear"/>
+          </w:tcPr>
+          <w:p>
+            <w:pPr>
+              <w:spacing w:after="0"/>
+              <w:jc w:val="left"/>
+            </w:pPr>
+            <w:r>
+              <w:rPr>
+                <w:rFonts w:ascii="Calibri" w:hAnsi="Calibri" w:eastAsia="Calibri"/>
+                <w:b/>
+                <w:color w:val="1A1A1A"/>
+                <w:sz w:val="18"/>
+              </w:rPr>
+              <w:t>Счёт</w:t>
+            </w:r>
+          </w:p>
+        </w:tc>
+        <w:tc>
+          <w:tcPr>
+            <w:tcW w:type="dxa" w:w="7257"/>
+            <w:tcMar>
+              <w:top w:w="30" w:type="dxa"/>
+              <w:left w:w="40" w:type="dxa"/>
+              <w:bottom w:w="30" w:type="dxa"/>
+              <w:right w:w="40" w:type="dxa"/>
+            </w:tcMar>
+            <w:shd w:fill="FAFAFA" w:val="clear"/>
+          </w:tcPr>
+          <w:p>
+            <w:pPr>
+              <w:spacing w:after="0"/>
+              <w:jc w:val="left"/>
+            </w:pPr>
+            <w:r>
+              <w:rPr>
+                <w:rFonts w:ascii="Calibri" w:hAnsi="Calibri" w:eastAsia="Calibri"/>
+                <w:b w:val="0"/>
+                <w:color w:val="1A1A1A"/>
+                <w:sz w:val="18"/>
+              </w:rPr>
+              <w:t>40820810338110973759</w:t>
+            </w:r>
+          </w:p>
+        </w:tc>
+      </w:tr>
+      <w:tr>
+        <w:tc>
+          <w:tcPr>
+            <w:tcW w:type="dxa" w:w="1928"/>
+            <w:tcMar>
+              <w:top w:w="30" w:type="dxa"/>
+              <w:left w:w="40" w:type="dxa"/>
+              <w:bottom w:w="30" w:type="dxa"/>
+              <w:right w:w="40" w:type="dxa"/>
+            </w:tcMar>
+            <w:shd w:fill="F5F5F5" w:val="clear"/>
+          </w:tcPr>
+          <w:p>
+            <w:pPr>
+              <w:spacing w:after="0"/>
+              <w:jc w:val="left"/>
+            </w:pPr>
+            <w:r>
+              <w:rPr>
+                <w:rFonts w:ascii="Calibri" w:hAnsi="Calibri" w:eastAsia="Calibri"/>
+                <w:b/>
+                <w:color w:val="1A1A1A"/>
+                <w:sz w:val="18"/>
+              </w:rPr>
+              <w:t>Банк</w:t>
+            </w:r>
+          </w:p>
+        </w:tc>
+        <w:tc>
+          <w:tcPr>
+            <w:tcW w:type="dxa" w:w="7257"/>
+            <w:tcMar>
+              <w:top w:w="30" w:type="dxa"/>
+              <w:left w:w="40" w:type="dxa"/>
+              <w:bottom w:w="30" w:type="dxa"/>
+              <w:right w:w="40" w:type="dxa"/>
+            </w:tcMar>
+          </w:tcPr>
+          <w:p>
+            <w:pPr>
+              <w:spacing w:after="0"/>
+              <w:jc w:val="left"/>
+            </w:pPr>
+            <w:r>
+              <w:rPr>
+                <w:rFonts w:ascii="Calibri" w:hAnsi="Calibri" w:eastAsia="Calibri"/>
+                <w:b w:val="0"/>
+                <w:color w:val="1A1A1A"/>
+                <w:sz w:val="18"/>
+              </w:rPr>
+              <w:t>ПАО Сбербанк</w:t>
+            </w:r>
+          </w:p>
+        </w:tc>
+      </w:tr>
+      <w:tr>
+        <w:tc>
+          <w:tcPr>
+            <w:tcW w:type="dxa" w:w="1928"/>
+            <w:tcMar>
+              <w:top w:w="30" w:type="dxa"/>
+              <w:left w:w="40" w:type="dxa"/>
+              <w:bottom w:w="30" w:type="dxa"/>
+              <w:right w:w="40" w:type="dxa"/>
+            </w:tcMar>
+            <w:shd w:fill="F5F5F5" w:val="clear"/>
+          </w:tcPr>
+          <w:p>
+            <w:pPr>
+              <w:spacing w:after="0"/>
+              <w:jc w:val="left"/>
+            </w:pPr>
+            <w:r>
+              <w:rPr>
+                <w:rFonts w:ascii="Calibri" w:hAnsi="Calibri" w:eastAsia="Calibri"/>
+                <w:b/>
+                <w:color w:val="1A1A1A"/>
+                <w:sz w:val="18"/>
+              </w:rPr>
+              <w:t>БИК</w:t>
+            </w:r>
+          </w:p>
+        </w:tc>
+        <w:tc>
+          <w:tcPr>
+            <w:tcW w:type="dxa" w:w="7257"/>
+            <w:tcMar>
+              <w:top w:w="30" w:type="dxa"/>
+              <w:left w:w="40" w:type="dxa"/>
+              <w:bottom w:w="30" w:type="dxa"/>
+              <w:right w:w="40" w:type="dxa"/>
+            </w:tcMar>
+            <w:shd w:fill="FAFAFA" w:val="clear"/>
+          </w:tcPr>
+          <w:p>
+            <w:pPr>
+              <w:spacing w:after="0"/>
+              <w:jc w:val="left"/>
+            </w:pPr>
+            <w:r>
+              <w:rPr>
+                <w:rFonts w:ascii="Calibri" w:hAnsi="Calibri" w:eastAsia="Calibri"/>
+                <w:b w:val="0"/>
+                <w:color w:val="1A1A1A"/>
+                <w:sz w:val="18"/>
+              </w:rPr>
+              <w:t>044525225</w:t>
+            </w:r>
+          </w:p>
+        </w:tc>
+      </w:tr>
+      <w:tr>
+        <w:tc>
+          <w:tcPr>
+            <w:tcW w:type="dxa" w:w="1928"/>
+            <w:tcMar>
+              <w:top w:w="30" w:type="dxa"/>
+              <w:left w:w="40" w:type="dxa"/>
+              <w:bottom w:w="30" w:type="dxa"/>
+              <w:right w:w="40" w:type="dxa"/>
+            </w:tcMar>
+            <w:shd w:fill="F5F5F5" w:val="clear"/>
+          </w:tcPr>
+          <w:p>
+            <w:pPr>
+              <w:spacing w:after="0"/>
+              <w:jc w:val="left"/>
+            </w:pPr>
+            <w:r>
+              <w:rPr>
+                <w:rFonts w:ascii="Calibri" w:hAnsi="Calibri" w:eastAsia="Calibri"/>
+                <w:b/>
+                <w:color w:val="1A1A1A"/>
+                <w:sz w:val="18"/>
+              </w:rPr>
+              <w:t>к/с</w:t>
+            </w:r>
+          </w:p>
+        </w:tc>
+        <w:tc>
+          <w:tcPr>
+            <w:tcW w:type="dxa" w:w="7257"/>
+            <w:tcMar>
+              <w:top w:w="30" w:type="dxa"/>
+              <w:left w:w="40" w:type="dxa"/>
+              <w:bottom w:w="30" w:type="dxa"/>
+              <w:right w:w="40" w:type="dxa"/>
+            </w:tcMar>
+          </w:tcPr>
+          <w:p>
+            <w:pPr>
+              <w:spacing w:after="0"/>
+              <w:jc w:val="left"/>
+            </w:pPr>
+            <w:r>
+              <w:rPr>
+                <w:rFonts w:ascii="Calibri" w:hAnsi="Calibri" w:eastAsia="Calibri"/>
+                <w:b w:val="0"/>
+                <w:color w:val="1A1A1A"/>
+                <w:sz w:val="18"/>
+              </w:rPr>
+              <w:t>30101810400000000225</w:t>
+            </w:r>
+          </w:p>
+        </w:tc>
+      </w:tr>
+      <w:tr>
+        <w:tc>
+          <w:tcPr>
+            <w:tcW w:type="dxa" w:w="1928"/>
+            <w:tcMar>
+              <w:top w:w="30" w:type="dxa"/>
+              <w:left w:w="40" w:type="dxa"/>
+              <w:bottom w:w="30" w:type="dxa"/>
+              <w:right w:w="40" w:type="dxa"/>
+            </w:tcMar>
+            <w:shd w:fill="F5F5F5" w:val="clear"/>
+          </w:tcPr>
+          <w:p>
+            <w:pPr>
+              <w:spacing w:after="0"/>
+              <w:jc w:val="left"/>
+            </w:pPr>
+            <w:r>
+              <w:rPr>
+                <w:rFonts w:ascii="Calibri" w:hAnsi="Calibri" w:eastAsia="Calibri"/>
+                <w:b/>
+                <w:color w:val="1A1A1A"/>
+                <w:sz w:val="18"/>
+              </w:rPr>
+              <w:t>Валюта</w:t>
+            </w:r>
+          </w:p>
+        </w:tc>
+        <w:tc>
+          <w:tcPr>
+            <w:tcW w:type="dxa" w:w="7257"/>
+            <w:tcMar>
+              <w:top w:w="30" w:type="dxa"/>
+              <w:left w:w="40" w:type="dxa"/>
+              <w:bottom w:w="30" w:type="dxa"/>
+              <w:right w:w="40" w:type="dxa"/>
+            </w:tcMar>
+            <w:shd w:fill="FAFAFA" w:val="clear"/>
+          </w:tcPr>
+          <w:p>
+            <w:pPr>
+              <w:spacing w:after="0"/>
+              <w:jc w:val="left"/>
+            </w:pPr>
+            <w:r>
+              <w:rPr>
+                <w:rFonts w:ascii="Calibri" w:hAnsi="Calibri" w:eastAsia="Calibri"/>
+                <w:b w:val="0"/>
+                <w:color w:val="1A1A1A"/>
+                <w:sz w:val="18"/>
+              </w:rPr>
+              <w:t>RUB</w:t>
+            </w:r>
+          </w:p>
+        </w:tc>
+      </w:tr>
+      <w:tr>
+        <w:tc>
+          <w:tcPr>
+            <w:tcW w:type="dxa" w:w="1928"/>
+            <w:tcMar>
+              <w:top w:w="30" w:type="dxa"/>
+              <w:left w:w="40" w:type="dxa"/>
+              <w:bottom w:w="30" w:type="dxa"/>
+              <w:right w:w="40" w:type="dxa"/>
+            </w:tcMar>
+            <w:shd w:fill="F5F5F5" w:val="clear"/>
+          </w:tcPr>
+          <w:p>
+            <w:pPr>
+              <w:spacing w:after="0"/>
+              <w:jc w:val="left"/>
+            </w:pPr>
+            <w:r>
+              <w:rPr>
+                <w:rFonts w:ascii="Calibri" w:hAnsi="Calibri" w:eastAsia="Calibri"/>
+                <w:b/>
+                <w:color w:val="1A1A1A"/>
+                <w:sz w:val="18"/>
+              </w:rPr>
+              <w:t>ИНН банка</w:t>
+            </w:r>
+          </w:p>
+        </w:tc>
+        <w:tc>
+          <w:tcPr>
+            <w:tcW w:type="dxa" w:w="7257"/>
+            <w:tcMar>
+              <w:top w:w="30" w:type="dxa"/>
+              <w:left w:w="40" w:type="dxa"/>
+              <w:bottom w:w="30" w:type="dxa"/>
+              <w:right w:w="40" w:type="dxa"/>
+            </w:tcMar>
+          </w:tcPr>
+          <w:p>
+            <w:pPr>
+              <w:spacing w:after="0"/>
+              <w:jc w:val="left"/>
+            </w:pPr>
+            <w:r>
+              <w:rPr>
+                <w:rFonts w:ascii="Calibri" w:hAnsi="Calibri" w:eastAsia="Calibri"/>
+                <w:b w:val="0"/>
+                <w:color w:val="1A1A1A"/>
+                <w:sz w:val="18"/>
+              </w:rPr>
+              <w:t>7707083893</w:t>
+            </w:r>
+          </w:p>
+        </w:tc>
+      </w:tr>
+      <w:tr>
+        <w:tc>
+          <w:tcPr>
+            <w:tcW w:type="dxa" w:w="1928"/>
+            <w:tcMar>
+              <w:top w:w="30" w:type="dxa"/>
+              <w:left w:w="40" w:type="dxa"/>
+              <w:bottom w:w="30" w:type="dxa"/>
+              <w:right w:w="40" w:type="dxa"/>
+            </w:tcMar>
+            <w:shd w:fill="F5F5F5" w:val="clear"/>
+          </w:tcPr>
+          <w:p>
+            <w:pPr>
+              <w:spacing w:after="0"/>
+              <w:jc w:val="left"/>
+            </w:pPr>
+            <w:r>
+              <w:rPr>
+                <w:rFonts w:ascii="Calibri" w:hAnsi="Calibri" w:eastAsia="Calibri"/>
+                <w:b/>
+                <w:color w:val="1A1A1A"/>
+                <w:sz w:val="18"/>
+              </w:rPr>
+              <w:t>КПП</w:t>
+            </w:r>
+          </w:p>
+        </w:tc>
+        <w:tc>
+          <w:tcPr>
+            <w:tcW w:type="dxa" w:w="7257"/>
+            <w:tcMar>
+              <w:top w:w="30" w:type="dxa"/>
+              <w:left w:w="40" w:type="dxa"/>
+              <w:bottom w:w="30" w:type="dxa"/>
+              <w:right w:w="40" w:type="dxa"/>
+            </w:tcMar>
+            <w:shd w:fill="FAFAFA" w:val="clear"/>
+          </w:tcPr>
+          <w:p>
+            <w:pPr>
+              <w:spacing w:after="0"/>
+              <w:jc w:val="left"/>
+            </w:pPr>
+            <w:r>
+              <w:rPr>
+                <w:rFonts w:ascii="Calibri" w:hAnsi="Calibri" w:eastAsia="Calibri"/>
+                <w:b w:val="0"/>
+                <w:color w:val="1A1A1A"/>
+                <w:sz w:val="18"/>
+              </w:rPr>
+              <w:t>773643001</w:t>
+            </w:r>
+          </w:p>
+        </w:tc>
+      </w:tr>
+      <w:tr>
+        <w:tc>
+          <w:tcPr>
+            <w:tcW w:type="dxa" w:w="1928"/>
+            <w:tcMar>
+              <w:top w:w="30" w:type="dxa"/>
+              <w:left w:w="40" w:type="dxa"/>
+              <w:bottom w:w="30" w:type="dxa"/>
+              <w:right w:w="40" w:type="dxa"/>
+            </w:tcMar>
+            <w:shd w:fill="F5F5F5" w:val="clear"/>
+          </w:tcPr>
+          <w:p>
+            <w:pPr>
+              <w:spacing w:after="0"/>
+              <w:jc w:val="left"/>
+            </w:pPr>
+            <w:r>
+              <w:rPr>
+                <w:rFonts w:ascii="Calibri" w:hAnsi="Calibri" w:eastAsia="Calibri"/>
+                <w:b/>
+                <w:color w:val="1A1A1A"/>
+                <w:sz w:val="18"/>
+              </w:rPr>
+              <w:t>ОКПО</w:t>
+            </w:r>
+          </w:p>
+        </w:tc>
+        <w:tc>
+          <w:tcPr>
+            <w:tcW w:type="dxa" w:w="7257"/>
+            <w:tcMar>
+              <w:top w:w="30" w:type="dxa"/>
+              <w:left w:w="40" w:type="dxa"/>
+              <w:bottom w:w="30" w:type="dxa"/>
+              <w:right w:w="40" w:type="dxa"/>
+            </w:tcMar>
+          </w:tcPr>
+          <w:p>
+            <w:pPr>
+              <w:spacing w:after="0"/>
+              <w:jc w:val="left"/>
+            </w:pPr>
+            <w:r>
+              <w:rPr>
+                <w:rFonts w:ascii="Calibri" w:hAnsi="Calibri" w:eastAsia="Calibri"/>
+                <w:b w:val="0"/>
+                <w:color w:val="1A1A1A"/>
+                <w:sz w:val="18"/>
+              </w:rPr>
+              <w:t>57972160</w:t>
+            </w:r>
+          </w:p>
+        </w:tc>
+      </w:tr>
+      <w:tr>
+        <w:tc>
+          <w:tcPr>
+            <w:tcW w:type="dxa" w:w="1928"/>
+            <w:tcMar>
+              <w:top w:w="30" w:type="dxa"/>
+              <w:left w:w="40" w:type="dxa"/>
+              <w:bottom w:w="30" w:type="dxa"/>
+              <w:right w:w="40" w:type="dxa"/>
+            </w:tcMar>
+            <w:shd w:fill="F5F5F5" w:val="clear"/>
+          </w:tcPr>
+          <w:p>
+            <w:pPr>
+              <w:spacing w:after="0"/>
+              <w:jc w:val="left"/>
+            </w:pPr>
+            <w:r>
+              <w:rPr>
+                <w:rFonts w:ascii="Calibri" w:hAnsi="Calibri" w:eastAsia="Calibri"/>
+                <w:b/>
+                <w:color w:val="1A1A1A"/>
+                <w:sz w:val="18"/>
+              </w:rPr>
+              <w:t>ОГРН</w:t>
+            </w:r>
+          </w:p>
+        </w:tc>
+        <w:tc>
+          <w:tcPr>
+            <w:tcW w:type="dxa" w:w="7257"/>
+            <w:tcMar>
+              <w:top w:w="30" w:type="dxa"/>
+              <w:left w:w="40" w:type="dxa"/>
+              <w:bottom w:w="30" w:type="dxa"/>
+              <w:right w:w="40" w:type="dxa"/>
+            </w:tcMar>
+            <w:shd w:fill="FAFAFA" w:val="clear"/>
+          </w:tcPr>
+          <w:p>
+            <w:pPr>
+              <w:spacing w:after="0"/>
+              <w:jc w:val="left"/>
+            </w:pPr>
+            <w:r>
+              <w:rPr>
+                <w:rFonts w:ascii="Calibri" w:hAnsi="Calibri" w:eastAsia="Calibri"/>
+                <w:b w:val="0"/>
+                <w:color w:val="1A1A1A"/>
+                <w:sz w:val="18"/>
+              </w:rPr>
+              <w:t>1027700132195</w:t>
+            </w:r>
+          </w:p>
+        </w:tc>
+      </w:tr>
+      <w:tr>
+        <w:tc>
+          <w:tcPr>
+            <w:tcW w:type="dxa" w:w="1928"/>
+            <w:tcMar>
+              <w:top w:w="30" w:type="dxa"/>
+              <w:left w:w="40" w:type="dxa"/>
+              <w:bottom w:w="30" w:type="dxa"/>
+              <w:right w:w="40" w:type="dxa"/>
+            </w:tcMar>
+            <w:shd w:fill="F5F5F5" w:val="clear"/>
+          </w:tcPr>
+          <w:p>
+            <w:pPr>
+              <w:spacing w:after="0"/>
+              <w:jc w:val="left"/>
+            </w:pPr>
+            <w:r>
+              <w:rPr>
+                <w:rFonts w:ascii="Calibri" w:hAnsi="Calibri" w:eastAsia="Calibri"/>
+                <w:b/>
+                <w:color w:val="1A1A1A"/>
+                <w:sz w:val="18"/>
+              </w:rPr>
+              <w:t>SWIFT</w:t>
+            </w:r>
+          </w:p>
+        </w:tc>
+        <w:tc>
+          <w:tcPr>
+            <w:tcW w:type="dxa" w:w="7257"/>
+            <w:tcMar>
+              <w:top w:w="30" w:type="dxa"/>
+              <w:left w:w="40" w:type="dxa"/>
+              <w:bottom w:w="30" w:type="dxa"/>
+              <w:right w:w="40" w:type="dxa"/>
+            </w:tcMar>
+          </w:tcPr>
+          <w:p>
+            <w:pPr>
+              <w:spacing w:after="0"/>
+              <w:jc w:val="left"/>
+            </w:pPr>
+            <w:r>
+              <w:rPr>
+                <w:rFonts w:ascii="Calibri" w:hAnsi="Calibri" w:eastAsia="Calibri"/>
+                <w:b w:val="0"/>
+                <w:color w:val="1A1A1A"/>
+                <w:sz w:val="18"/>
+              </w:rPr>
+              <w:t>SABRRUMM</w:t>
+            </w:r>
+          </w:p>
+        </w:tc>
+      </w:tr>
+      <w:tr>
+        <w:tc>
+          <w:tcPr>
+            <w:tcW w:type="dxa" w:w="1928"/>
+            <w:tcMar>
+              <w:top w:w="30" w:type="dxa"/>
+              <w:left w:w="40" w:type="dxa"/>
+              <w:bottom w:w="30" w:type="dxa"/>
+              <w:right w:w="40" w:type="dxa"/>
+            </w:tcMar>
+            <w:shd w:fill="F5F5F5" w:val="clear"/>
+          </w:tcPr>
+          <w:p>
+            <w:pPr>
+              <w:spacing w:after="0"/>
+              <w:jc w:val="left"/>
+            </w:pPr>
+            <w:r>
+              <w:rPr>
+                <w:rFonts w:ascii="Calibri" w:hAnsi="Calibri" w:eastAsia="Calibri"/>
+                <w:b/>
+                <w:color w:val="1A1A1A"/>
+                <w:sz w:val="18"/>
+              </w:rPr>
+              <w:t>Адрес банка</w:t>
+            </w:r>
+          </w:p>
+        </w:tc>
+        <w:tc>
+          <w:tcPr>
+            <w:tcW w:type="dxa" w:w="7257"/>
+            <w:tcMar>
+              <w:top w:w="30" w:type="dxa"/>
+              <w:left w:w="40" w:type="dxa"/>
+              <w:bottom w:w="30" w:type="dxa"/>
+              <w:right w:w="40" w:type="dxa"/>
+            </w:tcMar>
+            <w:shd w:fill="FAFAFA" w:val="clear"/>
+          </w:tcPr>
+          <w:p>
+            <w:pPr>
+              <w:spacing w:after="0"/>
+              <w:jc w:val="left"/>
+            </w:pPr>
+            <w:r>
+              <w:rPr>
+                <w:rFonts w:ascii="Calibri" w:hAnsi="Calibri" w:eastAsia="Calibri"/>
+                <w:b w:val="0"/>
+                <w:color w:val="1A1A1A"/>
+                <w:sz w:val="18"/>
+              </w:rPr>
+              <w:t>109544, МОСКВА, УЛ.Б.АНДРОНЬЕВСКАЯ,6</w:t>
+            </w:r>
+          </w:p>
+        </w:tc>
+      </w:tr>
+    </w:tbl>
+    <w:p>
+      <w:pPr>
+        <w:spacing w:before="80" w:after="80"/>
+        <w:jc w:val="left"/>
+      </w:pPr>
+      <w:r>
+        <w:rPr>
+          <w:rFonts w:ascii="Calibri" w:hAnsi="Calibri" w:eastAsia="Calibri"/>
+          <w:b w:val="0"/>
+          <w:color w:val="1A1A1A"/>
+          <w:sz w:val="20"/>
+        </w:rPr>
+        <w:t>Выплата — только безналично на указанный счёт.</w:t>
+      </w:r>
+    </w:p>
+    <w:p>
+      <w:pPr>
+        <w:spacing w:before="0" w:after="80"/>
         <w:jc w:val="both"/>
       </w:pPr>
       <w:r>
         <w:rPr>
           <w:rFonts w:ascii="Calibri" w:hAnsi="Calibri" w:eastAsia="Calibri"/>
           <w:b w:val="0"/>
-          <w:color w:val="333333"/>
-          <w:sz w:val="22"/>
-        </w:rPr>
-        <w:t>5.3. Реквизиты для перечисления заработной платы: валюта — RUB; получатель — ХОДЖИМАТОВ ФУРКАТЖОН МАХАМАДЖОНОВИЧ; номер счёта — 40820810338110973759; банк — ПАО Сбербанк; БИК — 044525225; корр. счёт — 30101810400000000225; ИНН банка — 7707083893; КПП — 773643001; ОКПО — 57972160; ОГРН — 1027700132195; SWIFT — SABRRUMM; почтовый адрес банка — 109544, МОСКВА, УЛ.Б.АНДРОНЬЕВСКАЯ,6. Выплата — только безналично на указанный счёт.</w:t>
-      </w:r>
-    </w:p>
-    <w:p>
-      <w:pPr>
-        <w:spacing w:after="80"/>
-        <w:jc w:val="both"/>
-      </w:pPr>
-      <w:r>
-        <w:rPr>
-          <w:rFonts w:ascii="Calibri" w:hAnsi="Calibri" w:eastAsia="Calibri"/>
-          <w:b w:val="0"/>
-          <w:color w:val="333333"/>
+          <w:color w:val="1A1A1A"/>
           <w:sz w:val="22"/>
         </w:rPr>
         <w:t>5.4. Сроки выплаты заработной платы: аванс — до 15-го числа текущего месяца; окончательный расчёт — до 27-го числа текущего месяца. При совпадении дня выплаты с выходным или нерабочим праздничным днём выплата производится в предшествующий рабочий день (ст. 136 ТК РФ).</w:t>
@@ -847,14 +1609,14 @@
     </w:p>
     <w:p>
       <w:pPr>
-        <w:spacing w:after="80"/>
+        <w:spacing w:before="0" w:after="80"/>
         <w:jc w:val="both"/>
       </w:pPr>
       <w:r>
         <w:rPr>
           <w:rFonts w:ascii="Calibri" w:hAnsi="Calibri" w:eastAsia="Calibri"/>
           <w:b w:val="0"/>
-          <w:color w:val="333333"/>
+          <w:color w:val="1A1A1A"/>
           <w:sz w:val="22"/>
         </w:rPr>
         <w:t>5.5. Работодатель является налоговым агентом по НДФЛ. Работник самостоятельно уплачивает фиксированные авансовые платежи по патенту. Исчисленный НДФЛ может быть уменьшен на сумму таких авансов после получения уведомления налогового органа и заявления Работника с документами об уплате (ст. 227.1 НК РФ).</w:t>
@@ -862,14 +1624,14 @@
     </w:p>
     <w:p>
       <w:pPr>
-        <w:spacing w:after="80"/>
+        <w:spacing w:before="0" w:after="80"/>
         <w:jc w:val="both"/>
       </w:pPr>
       <w:r>
         <w:rPr>
           <w:rFonts w:ascii="Calibri" w:hAnsi="Calibri" w:eastAsia="Calibri"/>
           <w:b w:val="0"/>
-          <w:color w:val="333333"/>
+          <w:color w:val="1A1A1A"/>
           <w:sz w:val="22"/>
         </w:rPr>
         <w:t>5.6. При истечении, аннулировании патента либо неоплате фиксированного авансового платежа Работодатель отстраняет Работника от работы в порядке ст. 327.5 ТК РФ и при наличии оснований расторгает Договор.</w:t>
@@ -894,14 +1656,14 @@
     </w:p>
     <w:p>
       <w:pPr>
-        <w:spacing w:after="80"/>
+        <w:spacing w:before="0" w:after="80"/>
         <w:jc w:val="both"/>
       </w:pPr>
       <w:r>
         <w:rPr>
           <w:rFonts w:ascii="Calibri" w:hAnsi="Calibri" w:eastAsia="Calibri"/>
           <w:b w:val="0"/>
-          <w:color w:val="333333"/>
+          <w:color w:val="1A1A1A"/>
           <w:sz w:val="22"/>
         </w:rPr>
         <w:t>6.1. Работодатель уведомляет территориальный орган МВД России о заключении и о расторжении Договора в срок не более 3 рабочих дней с даты соответствующего события (день события в срок не включается).</w:t>
@@ -909,14 +1671,14 @@
     </w:p>
     <w:p>
       <w:pPr>
-        <w:spacing w:after="80"/>
+        <w:spacing w:before="0" w:after="80"/>
         <w:jc w:val="both"/>
       </w:pPr>
       <w:r>
         <w:rPr>
           <w:rFonts w:ascii="Calibri" w:hAnsi="Calibri" w:eastAsia="Calibri"/>
           <w:b w:val="0"/>
-          <w:color w:val="333333"/>
+          <w:color w:val="1A1A1A"/>
           <w:sz w:val="22"/>
         </w:rPr>
         <w:t>6.2. Уведомление подаётся по форме, утверждённой приказом МВД России (до 01.09.2026 — приказ МВД от 30.07.2020 № 536 с изменениями; с 01.09.2026 — формы по приказу МВД от 12.05.2026 № 290), лично, почтой с описью вложения либо через портал Госуслуги.</w:t>
@@ -941,14 +1703,14 @@
     </w:p>
     <w:p>
       <w:pPr>
-        <w:spacing w:after="80"/>
+        <w:spacing w:before="0" w:after="80"/>
         <w:jc w:val="both"/>
       </w:pPr>
       <w:r>
         <w:rPr>
           <w:rFonts w:ascii="Calibri" w:hAnsi="Calibri" w:eastAsia="Calibri"/>
           <w:b w:val="0"/>
-          <w:color w:val="333333"/>
+          <w:color w:val="1A1A1A"/>
           <w:sz w:val="22"/>
         </w:rPr>
         <w:t>7.1. Договор может быть прекращён по основаниям, предусмотренным ТК РФ, в том числе: по соглашению сторон (ст. 78); по инициативе Работника (ст. 80) — письменное заявление не позднее чем за две недели; по инициативе Работодателя (ст. 81) при наличии законных оснований.</w:t>
@@ -956,14 +1718,14 @@
     </w:p>
     <w:p>
       <w:pPr>
-        <w:spacing w:after="80"/>
+        <w:spacing w:before="0" w:after="80"/>
         <w:jc w:val="both"/>
       </w:pPr>
       <w:r>
         <w:rPr>
           <w:rFonts w:ascii="Calibri" w:hAnsi="Calibri" w:eastAsia="Calibri"/>
           <w:b w:val="0"/>
-          <w:color w:val="333333"/>
+          <w:color w:val="1A1A1A"/>
           <w:sz w:val="22"/>
         </w:rPr>
         <w:t>7.2. В день прекращения работы Работодатель выдаёт трудовую книжку / сведения о трудовой деятельности, производит окончательный расчёт и в срок не более 3 рабочих дней уведомляет МВД о расторжении Договора.</w:t>
@@ -988,14 +1750,14 @@
     </w:p>
     <w:p>
       <w:pPr>
-        <w:spacing w:after="80"/>
+        <w:spacing w:before="0" w:after="80"/>
         <w:jc w:val="both"/>
       </w:pPr>
       <w:r>
         <w:rPr>
           <w:rFonts w:ascii="Calibri" w:hAnsi="Calibri" w:eastAsia="Calibri"/>
           <w:b w:val="0"/>
-          <w:color w:val="333333"/>
+          <w:color w:val="1A1A1A"/>
           <w:sz w:val="22"/>
         </w:rPr>
         <w:t>8.1. Работник даёт согласие на обработку персональных данных, необходимых для исполнения Договора, кадрового, налогового и миграционного учёта, в объёме и на срок, требуемые законом. Работодатель обеспечивает конфиденциальность и защиту персональных данных.</w:t>
@@ -1020,14 +1782,14 @@
     </w:p>
     <w:p>
       <w:pPr>
-        <w:spacing w:after="80"/>
+        <w:spacing w:before="0" w:after="80"/>
         <w:jc w:val="both"/>
       </w:pPr>
       <w:r>
         <w:rPr>
           <w:rFonts w:ascii="Calibri" w:hAnsi="Calibri" w:eastAsia="Calibri"/>
           <w:b w:val="0"/>
-          <w:color w:val="333333"/>
+          <w:color w:val="1A1A1A"/>
           <w:sz w:val="22"/>
         </w:rPr>
         <w:t>9.1. Договор составлен в двух экземплярах, имеющих одинаковую юридическую силу, по одному для каждой Стороны. Изменения оформляются дополнительными соглашениями в письменной форме.</w:t>
@@ -1035,14 +1797,14 @@
     </w:p>
     <w:p>
       <w:pPr>
-        <w:spacing w:after="80"/>
+        <w:spacing w:before="0" w:after="80"/>
         <w:jc w:val="both"/>
       </w:pPr>
       <w:r>
         <w:rPr>
           <w:rFonts w:ascii="Calibri" w:hAnsi="Calibri" w:eastAsia="Calibri"/>
           <w:b w:val="0"/>
-          <w:color w:val="333333"/>
+          <w:color w:val="1A1A1A"/>
           <w:sz w:val="22"/>
         </w:rPr>
         <w:t>9.2. Договор вступает в силу с 01.08.2026 и действует с даты начала работы (01.08.2026).</w:t>
@@ -1050,17 +1812,25 @@
     </w:p>
     <w:p>
       <w:pPr>
-        <w:spacing w:after="80"/>
+        <w:spacing w:before="0" w:after="80"/>
         <w:jc w:val="both"/>
       </w:pPr>
       <w:r>
         <w:rPr>
           <w:rFonts w:ascii="Calibri" w:hAnsi="Calibri" w:eastAsia="Calibri"/>
           <w:b w:val="0"/>
-          <w:color w:val="333333"/>
+          <w:color w:val="1A1A1A"/>
           <w:sz w:val="22"/>
         </w:rPr>
         <w:t>9.3. Во всём, что не урегулировано Договором, Стороны руководствуются ТК РФ, НК РФ, Федеральным законом № 115-ФЗ, Федеральным законом № 173-ФЗ и иными нормативными актами РФ.</w:t>
+      </w:r>
+    </w:p>
+    <w:p>
+      <w:pPr>
+        <w:spacing w:before="0" w:after="0"/>
+      </w:pPr>
+      <w:r>
+        <w:br w:type="page"/>
       </w:r>
     </w:p>
     <w:p>
@@ -1082,7 +1852,7 @@
     </w:p>
     <w:tbl>
       <w:tblPr>
-        <w:tblW w:type="dxa" w:w="6480810"/>
+        <w:tblW w:type="auto" w:w="0"/>
         <w:tblLook w:firstColumn="1" w:firstRow="1" w:lastColumn="0" w:lastRow="0" w:noHBand="0" w:noVBand="1" w:val="04A0"/>
         <w:tblBorders>
           <w:top w:val="nil" w:sz="0" w:space="0" w:color="auto"/>
@@ -1092,24 +1862,22 @@
           <w:insideH w:val="nil" w:sz="0" w:space="0" w:color="auto"/>
           <w:insideV w:val="nil" w:sz="0" w:space="0" w:color="auto"/>
         </w:tblBorders>
-        <w:tblLayout w:type="fixed"/>
       </w:tblPr>
       <w:tblGrid>
-        <w:gridCol w:w="5270"/>
-        <w:gridCol w:w="5270"/>
+        <w:gridCol w:w="4876"/>
+        <w:gridCol w:w="4876"/>
       </w:tblGrid>
       <w:tr>
         <w:tc>
           <w:tcPr>
-            <w:tcW w:type="dxa" w:w="5103"/>
+            <w:tcW w:type="dxa" w:w="4876"/>
             <w:tcMar>
               <w:top w:w="40" w:type="dxa"/>
-              <w:left w:w="40" w:type="dxa"/>
+              <w:left w:w="20" w:type="dxa"/>
               <w:bottom w:w="40" w:type="dxa"/>
               <w:right w:w="80" w:type="dxa"/>
             </w:tcMar>
           </w:tcPr>
-          <w:p/>
           <w:p>
             <w:pPr>
               <w:spacing w:before="0" w:after="120" w:line="252" w:lineRule="auto"/>
@@ -1117,22 +1885,31 @@
             </w:pPr>
             <w:r>
               <w:rPr>
-                <w:rFonts w:ascii="Times New Roman" w:hAnsi="Times New Roman" w:cs="Times New Roman" w:eastAsia="Times New Roman"/>
+                <w:rFonts w:ascii="Calibri" w:hAnsi="Calibri" w:eastAsia="Calibri"/>
                 <w:b/>
-                <w:sz w:val="20"/>
+                <w:color w:val="1A1A1A"/>
+                <w:sz w:val="22"/>
               </w:rPr>
               <w:t>РАБОТОДАТЕЛЬ</w:t>
             </w:r>
           </w:p>
           <w:tbl>
             <w:tblPr>
-              <w:tblStyle w:val="TableGrid"/>
               <w:tblW w:type="auto" w:w="0"/>
+              <w:jc w:val="left"/>
               <w:tblLook w:firstColumn="1" w:firstRow="1" w:lastColumn="0" w:lastRow="0" w:noHBand="0" w:noVBand="1" w:val="04A0"/>
+              <w:tblBorders>
+                <w:top w:val="single" w:sz="4" w:space="0" w:color="BBBBBB"/>
+                <w:left w:val="single" w:sz="4" w:space="0" w:color="BBBBBB"/>
+                <w:bottom w:val="single" w:sz="4" w:space="0" w:color="BBBBBB"/>
+                <w:right w:val="single" w:sz="4" w:space="0" w:color="BBBBBB"/>
+                <w:insideH w:val="single" w:sz="4" w:space="0" w:color="BBBBBB"/>
+                <w:insideV w:val="single" w:sz="4" w:space="0" w:color="BBBBBB"/>
+              </w:tblBorders>
             </w:tblPr>
             <w:tblGrid>
-              <w:gridCol w:w="2551"/>
-              <w:gridCol w:w="2551"/>
+              <w:gridCol w:w="2438"/>
+              <w:gridCol w:w="2438"/>
             </w:tblGrid>
             <w:tr>
               <w:tc>
@@ -1144,15 +1921,18 @@
                     <w:bottom w:w="30" w:type="dxa"/>
                     <w:right w:w="40" w:type="dxa"/>
                   </w:tcMar>
+                  <w:shd w:fill="F5F5F5" w:val="clear"/>
                 </w:tcPr>
                 <w:p>
                   <w:pPr>
-                    <w:spacing w:before="0" w:after="0"/>
+                    <w:spacing w:after="0"/>
+                    <w:jc w:val="left"/>
                   </w:pPr>
                   <w:r>
                     <w:rPr>
-                      <w:rFonts w:ascii="Times New Roman" w:hAnsi="Times New Roman" w:cs="Times New Roman" w:eastAsia="Times New Roman"/>
+                      <w:rFonts w:ascii="Calibri" w:hAnsi="Calibri" w:eastAsia="Calibri"/>
                       <w:b/>
+                      <w:color w:val="1A1A1A"/>
                       <w:sz w:val="16"/>
                     </w:rPr>
                     <w:t>Статус</w:t>
@@ -1161,7 +1941,7 @@
               </w:tc>
               <w:tc>
                 <w:tcPr>
-                  <w:tcW w:type="dxa" w:w="3629"/>
+                  <w:tcW w:type="dxa" w:w="3288"/>
                   <w:tcMar>
                     <w:top w:w="30" w:type="dxa"/>
                     <w:left w:w="40" w:type="dxa"/>
@@ -1171,15 +1951,17 @@
                 </w:tcPr>
                 <w:p>
                   <w:pPr>
-                    <w:spacing w:before="0" w:after="0"/>
+                    <w:spacing w:after="0"/>
+                    <w:jc w:val="left"/>
                   </w:pPr>
                   <w:r>
                     <w:rPr>
-                      <w:rFonts w:ascii="Times New Roman" w:hAnsi="Times New Roman" w:cs="Times New Roman" w:eastAsia="Times New Roman"/>
+                      <w:rFonts w:ascii="Calibri" w:hAnsi="Calibri" w:eastAsia="Calibri"/>
                       <w:b w:val="0"/>
+                      <w:color w:val="1A1A1A"/>
                       <w:sz w:val="16"/>
                     </w:rPr>
-                    <w:t>Индивидуальный предприниматель Сорванова Анна Александровна</w:t>
+                    <w:t>ИП Сорванова Анна Александровна</w:t>
                   </w:r>
                 </w:p>
               </w:tc>
@@ -1194,15 +1976,18 @@
                     <w:bottom w:w="30" w:type="dxa"/>
                     <w:right w:w="40" w:type="dxa"/>
                   </w:tcMar>
+                  <w:shd w:fill="F5F5F5" w:val="clear"/>
                 </w:tcPr>
                 <w:p>
                   <w:pPr>
-                    <w:spacing w:before="0" w:after="0"/>
+                    <w:spacing w:after="0"/>
+                    <w:jc w:val="left"/>
                   </w:pPr>
                   <w:r>
                     <w:rPr>
-                      <w:rFonts w:ascii="Times New Roman" w:hAnsi="Times New Roman" w:cs="Times New Roman" w:eastAsia="Times New Roman"/>
+                      <w:rFonts w:ascii="Calibri" w:hAnsi="Calibri" w:eastAsia="Calibri"/>
                       <w:b/>
+                      <w:color w:val="1A1A1A"/>
                       <w:sz w:val="16"/>
                     </w:rPr>
                     <w:t>ОГРНИП</w:t>
@@ -1211,22 +1996,25 @@
               </w:tc>
               <w:tc>
                 <w:tcPr>
-                  <w:tcW w:type="dxa" w:w="3629"/>
+                  <w:tcW w:type="dxa" w:w="3288"/>
                   <w:tcMar>
                     <w:top w:w="30" w:type="dxa"/>
                     <w:left w:w="40" w:type="dxa"/>
                     <w:bottom w:w="30" w:type="dxa"/>
                     <w:right w:w="40" w:type="dxa"/>
                   </w:tcMar>
+                  <w:shd w:fill="FAFAFA" w:val="clear"/>
                 </w:tcPr>
                 <w:p>
                   <w:pPr>
-                    <w:spacing w:before="0" w:after="0"/>
+                    <w:spacing w:after="0"/>
+                    <w:jc w:val="left"/>
                   </w:pPr>
                   <w:r>
                     <w:rPr>
-                      <w:rFonts w:ascii="Times New Roman" w:hAnsi="Times New Roman" w:cs="Times New Roman" w:eastAsia="Times New Roman"/>
+                      <w:rFonts w:ascii="Calibri" w:hAnsi="Calibri" w:eastAsia="Calibri"/>
                       <w:b w:val="0"/>
+                      <w:color w:val="1A1A1A"/>
                       <w:sz w:val="16"/>
                     </w:rPr>
                     <w:t>322774600583080</w:t>
@@ -1244,15 +2032,18 @@
                     <w:bottom w:w="30" w:type="dxa"/>
                     <w:right w:w="40" w:type="dxa"/>
                   </w:tcMar>
+                  <w:shd w:fill="F5F5F5" w:val="clear"/>
                 </w:tcPr>
                 <w:p>
                   <w:pPr>
-                    <w:spacing w:before="0" w:after="0"/>
+                    <w:spacing w:after="0"/>
+                    <w:jc w:val="left"/>
                   </w:pPr>
                   <w:r>
                     <w:rPr>
-                      <w:rFonts w:ascii="Times New Roman" w:hAnsi="Times New Roman" w:cs="Times New Roman" w:eastAsia="Times New Roman"/>
+                      <w:rFonts w:ascii="Calibri" w:hAnsi="Calibri" w:eastAsia="Calibri"/>
                       <w:b/>
+                      <w:color w:val="1A1A1A"/>
                       <w:sz w:val="16"/>
                     </w:rPr>
                     <w:t>ИНН</w:t>
@@ -1261,7 +2052,7 @@
               </w:tc>
               <w:tc>
                 <w:tcPr>
-                  <w:tcW w:type="dxa" w:w="3629"/>
+                  <w:tcW w:type="dxa" w:w="3288"/>
                   <w:tcMar>
                     <w:top w:w="30" w:type="dxa"/>
                     <w:left w:w="40" w:type="dxa"/>
@@ -1271,12 +2062,14 @@
                 </w:tcPr>
                 <w:p>
                   <w:pPr>
-                    <w:spacing w:before="0" w:after="0"/>
+                    <w:spacing w:after="0"/>
+                    <w:jc w:val="left"/>
                   </w:pPr>
                   <w:r>
                     <w:rPr>
-                      <w:rFonts w:ascii="Times New Roman" w:hAnsi="Times New Roman" w:cs="Times New Roman" w:eastAsia="Times New Roman"/>
+                      <w:rFonts w:ascii="Calibri" w:hAnsi="Calibri" w:eastAsia="Calibri"/>
                       <w:b w:val="0"/>
+                      <w:color w:val="1A1A1A"/>
                       <w:sz w:val="16"/>
                     </w:rPr>
                     <w:t>772973703990</w:t>
@@ -1294,15 +2087,18 @@
                     <w:bottom w:w="30" w:type="dxa"/>
                     <w:right w:w="40" w:type="dxa"/>
                   </w:tcMar>
+                  <w:shd w:fill="F5F5F5" w:val="clear"/>
                 </w:tcPr>
                 <w:p>
                   <w:pPr>
-                    <w:spacing w:before="0" w:after="0"/>
+                    <w:spacing w:after="0"/>
+                    <w:jc w:val="left"/>
                   </w:pPr>
                   <w:r>
                     <w:rPr>
-                      <w:rFonts w:ascii="Times New Roman" w:hAnsi="Times New Roman" w:cs="Times New Roman" w:eastAsia="Times New Roman"/>
+                      <w:rFonts w:ascii="Calibri" w:hAnsi="Calibri" w:eastAsia="Calibri"/>
                       <w:b/>
+                      <w:color w:val="1A1A1A"/>
                       <w:sz w:val="16"/>
                     </w:rPr>
                     <w:t>Адрес</w:t>
@@ -1311,22 +2107,25 @@
               </w:tc>
               <w:tc>
                 <w:tcPr>
-                  <w:tcW w:type="dxa" w:w="3629"/>
+                  <w:tcW w:type="dxa" w:w="3288"/>
                   <w:tcMar>
                     <w:top w:w="30" w:type="dxa"/>
                     <w:left w:w="40" w:type="dxa"/>
                     <w:bottom w:w="30" w:type="dxa"/>
                     <w:right w:w="40" w:type="dxa"/>
                   </w:tcMar>
+                  <w:shd w:fill="FAFAFA" w:val="clear"/>
                 </w:tcPr>
                 <w:p>
                   <w:pPr>
-                    <w:spacing w:before="0" w:after="0"/>
+                    <w:spacing w:after="0"/>
+                    <w:jc w:val="left"/>
                   </w:pPr>
                   <w:r>
                     <w:rPr>
-                      <w:rFonts w:ascii="Times New Roman" w:hAnsi="Times New Roman" w:cs="Times New Roman" w:eastAsia="Times New Roman"/>
+                      <w:rFonts w:ascii="Calibri" w:hAnsi="Calibri" w:eastAsia="Calibri"/>
                       <w:b w:val="0"/>
+                      <w:color w:val="1A1A1A"/>
                       <w:sz w:val="16"/>
                     </w:rPr>
                     <w:t>г. Москва, ул. Василия Ланового, д. 3, кв. 243</w:t>
@@ -1344,15 +2143,18 @@
                     <w:bottom w:w="30" w:type="dxa"/>
                     <w:right w:w="40" w:type="dxa"/>
                   </w:tcMar>
+                  <w:shd w:fill="F5F5F5" w:val="clear"/>
                 </w:tcPr>
                 <w:p>
                   <w:pPr>
-                    <w:spacing w:before="0" w:after="0"/>
+                    <w:spacing w:after="0"/>
+                    <w:jc w:val="left"/>
                   </w:pPr>
                   <w:r>
                     <w:rPr>
-                      <w:rFonts w:ascii="Times New Roman" w:hAnsi="Times New Roman" w:cs="Times New Roman" w:eastAsia="Times New Roman"/>
+                      <w:rFonts w:ascii="Calibri" w:hAnsi="Calibri" w:eastAsia="Calibri"/>
                       <w:b/>
+                      <w:color w:val="1A1A1A"/>
                       <w:sz w:val="16"/>
                     </w:rPr>
                     <w:t>р/с</w:t>
@@ -1361,7 +2163,7 @@
               </w:tc>
               <w:tc>
                 <w:tcPr>
-                  <w:tcW w:type="dxa" w:w="3629"/>
+                  <w:tcW w:type="dxa" w:w="3288"/>
                   <w:tcMar>
                     <w:top w:w="30" w:type="dxa"/>
                     <w:left w:w="40" w:type="dxa"/>
@@ -1371,12 +2173,14 @@
                 </w:tcPr>
                 <w:p>
                   <w:pPr>
-                    <w:spacing w:before="0" w:after="0"/>
+                    <w:spacing w:after="0"/>
+                    <w:jc w:val="left"/>
                   </w:pPr>
                   <w:r>
                     <w:rPr>
-                      <w:rFonts w:ascii="Times New Roman" w:hAnsi="Times New Roman" w:cs="Times New Roman" w:eastAsia="Times New Roman"/>
+                      <w:rFonts w:ascii="Calibri" w:hAnsi="Calibri" w:eastAsia="Calibri"/>
                       <w:b w:val="0"/>
+                      <w:color w:val="1A1A1A"/>
                       <w:sz w:val="16"/>
                     </w:rPr>
                     <w:t>40802810370010393644</w:t>
@@ -1394,15 +2198,18 @@
                     <w:bottom w:w="30" w:type="dxa"/>
                     <w:right w:w="40" w:type="dxa"/>
                   </w:tcMar>
+                  <w:shd w:fill="F5F5F5" w:val="clear"/>
                 </w:tcPr>
                 <w:p>
                   <w:pPr>
-                    <w:spacing w:before="0" w:after="0"/>
+                    <w:spacing w:after="0"/>
+                    <w:jc w:val="left"/>
                   </w:pPr>
                   <w:r>
                     <w:rPr>
-                      <w:rFonts w:ascii="Times New Roman" w:hAnsi="Times New Roman" w:cs="Times New Roman" w:eastAsia="Times New Roman"/>
+                      <w:rFonts w:ascii="Calibri" w:hAnsi="Calibri" w:eastAsia="Calibri"/>
                       <w:b/>
+                      <w:color w:val="1A1A1A"/>
                       <w:sz w:val="16"/>
                     </w:rPr>
                     <w:t>Банк</w:t>
@@ -1411,22 +2218,25 @@
               </w:tc>
               <w:tc>
                 <w:tcPr>
-                  <w:tcW w:type="dxa" w:w="3629"/>
+                  <w:tcW w:type="dxa" w:w="3288"/>
                   <w:tcMar>
                     <w:top w:w="30" w:type="dxa"/>
                     <w:left w:w="40" w:type="dxa"/>
                     <w:bottom w:w="30" w:type="dxa"/>
                     <w:right w:w="40" w:type="dxa"/>
                   </w:tcMar>
+                  <w:shd w:fill="FAFAFA" w:val="clear"/>
                 </w:tcPr>
                 <w:p>
                   <w:pPr>
-                    <w:spacing w:before="0" w:after="0"/>
+                    <w:spacing w:after="0"/>
+                    <w:jc w:val="left"/>
                   </w:pPr>
                   <w:r>
                     <w:rPr>
-                      <w:rFonts w:ascii="Times New Roman" w:hAnsi="Times New Roman" w:cs="Times New Roman" w:eastAsia="Times New Roman"/>
+                      <w:rFonts w:ascii="Calibri" w:hAnsi="Calibri" w:eastAsia="Calibri"/>
                       <w:b w:val="0"/>
+                      <w:color w:val="1A1A1A"/>
                       <w:sz w:val="16"/>
                     </w:rPr>
                     <w:t>МОСКОВСКИЙ ФИЛИАЛ АО КБ "МОДУЛЬБАНК"</w:t>
@@ -1444,15 +2254,18 @@
                     <w:bottom w:w="30" w:type="dxa"/>
                     <w:right w:w="40" w:type="dxa"/>
                   </w:tcMar>
+                  <w:shd w:fill="F5F5F5" w:val="clear"/>
                 </w:tcPr>
                 <w:p>
                   <w:pPr>
-                    <w:spacing w:before="0" w:after="0"/>
+                    <w:spacing w:after="0"/>
+                    <w:jc w:val="left"/>
                   </w:pPr>
                   <w:r>
                     <w:rPr>
-                      <w:rFonts w:ascii="Times New Roman" w:hAnsi="Times New Roman" w:cs="Times New Roman" w:eastAsia="Times New Roman"/>
+                      <w:rFonts w:ascii="Calibri" w:hAnsi="Calibri" w:eastAsia="Calibri"/>
                       <w:b/>
+                      <w:color w:val="1A1A1A"/>
                       <w:sz w:val="16"/>
                     </w:rPr>
                     <w:t>БИК</w:t>
@@ -1461,7 +2274,7 @@
               </w:tc>
               <w:tc>
                 <w:tcPr>
-                  <w:tcW w:type="dxa" w:w="3629"/>
+                  <w:tcW w:type="dxa" w:w="3288"/>
                   <w:tcMar>
                     <w:top w:w="30" w:type="dxa"/>
                     <w:left w:w="40" w:type="dxa"/>
@@ -1471,12 +2284,14 @@
                 </w:tcPr>
                 <w:p>
                   <w:pPr>
-                    <w:spacing w:before="0" w:after="0"/>
+                    <w:spacing w:after="0"/>
+                    <w:jc w:val="left"/>
                   </w:pPr>
                   <w:r>
                     <w:rPr>
-                      <w:rFonts w:ascii="Times New Roman" w:hAnsi="Times New Roman" w:cs="Times New Roman" w:eastAsia="Times New Roman"/>
+                      <w:rFonts w:ascii="Calibri" w:hAnsi="Calibri" w:eastAsia="Calibri"/>
                       <w:b w:val="0"/>
+                      <w:color w:val="1A1A1A"/>
                       <w:sz w:val="16"/>
                     </w:rPr>
                     <w:t>044525092</w:t>
@@ -1494,15 +2309,18 @@
                     <w:bottom w:w="30" w:type="dxa"/>
                     <w:right w:w="40" w:type="dxa"/>
                   </w:tcMar>
+                  <w:shd w:fill="F5F5F5" w:val="clear"/>
                 </w:tcPr>
                 <w:p>
                   <w:pPr>
-                    <w:spacing w:before="0" w:after="0"/>
+                    <w:spacing w:after="0"/>
+                    <w:jc w:val="left"/>
                   </w:pPr>
                   <w:r>
                     <w:rPr>
-                      <w:rFonts w:ascii="Times New Roman" w:hAnsi="Times New Roman" w:cs="Times New Roman" w:eastAsia="Times New Roman"/>
+                      <w:rFonts w:ascii="Calibri" w:hAnsi="Calibri" w:eastAsia="Calibri"/>
                       <w:b/>
+                      <w:color w:val="1A1A1A"/>
                       <w:sz w:val="16"/>
                     </w:rPr>
                     <w:t>к/с</w:t>
@@ -1511,22 +2329,25 @@
               </w:tc>
               <w:tc>
                 <w:tcPr>
-                  <w:tcW w:type="dxa" w:w="3629"/>
+                  <w:tcW w:type="dxa" w:w="3288"/>
                   <w:tcMar>
                     <w:top w:w="30" w:type="dxa"/>
                     <w:left w:w="40" w:type="dxa"/>
                     <w:bottom w:w="30" w:type="dxa"/>
                     <w:right w:w="40" w:type="dxa"/>
                   </w:tcMar>
+                  <w:shd w:fill="FAFAFA" w:val="clear"/>
                 </w:tcPr>
                 <w:p>
                   <w:pPr>
-                    <w:spacing w:before="0" w:after="0"/>
+                    <w:spacing w:after="0"/>
+                    <w:jc w:val="left"/>
                   </w:pPr>
                   <w:r>
                     <w:rPr>
-                      <w:rFonts w:ascii="Times New Roman" w:hAnsi="Times New Roman" w:cs="Times New Roman" w:eastAsia="Times New Roman"/>
+                      <w:rFonts w:ascii="Calibri" w:hAnsi="Calibri" w:eastAsia="Calibri"/>
                       <w:b w:val="0"/>
+                      <w:color w:val="1A1A1A"/>
                       <w:sz w:val="16"/>
                     </w:rPr>
                     <w:t>30101810645250000092</w:t>
@@ -1544,15 +2365,18 @@
                     <w:bottom w:w="30" w:type="dxa"/>
                     <w:right w:w="40" w:type="dxa"/>
                   </w:tcMar>
+                  <w:shd w:fill="F5F5F5" w:val="clear"/>
                 </w:tcPr>
                 <w:p>
                   <w:pPr>
-                    <w:spacing w:before="0" w:after="0"/>
+                    <w:spacing w:after="0"/>
+                    <w:jc w:val="left"/>
                   </w:pPr>
                   <w:r>
                     <w:rPr>
-                      <w:rFonts w:ascii="Times New Roman" w:hAnsi="Times New Roman" w:cs="Times New Roman" w:eastAsia="Times New Roman"/>
+                      <w:rFonts w:ascii="Calibri" w:hAnsi="Calibri" w:eastAsia="Calibri"/>
                       <w:b/>
+                      <w:color w:val="1A1A1A"/>
                       <w:sz w:val="16"/>
                     </w:rPr>
                     <w:t>E-mail</w:t>
@@ -1561,7 +2385,7 @@
               </w:tc>
               <w:tc>
                 <w:tcPr>
-                  <w:tcW w:type="dxa" w:w="3629"/>
+                  <w:tcW w:type="dxa" w:w="3288"/>
                   <w:tcMar>
                     <w:top w:w="30" w:type="dxa"/>
                     <w:left w:w="40" w:type="dxa"/>
@@ -1571,12 +2395,14 @@
                 </w:tcPr>
                 <w:p>
                   <w:pPr>
-                    <w:spacing w:before="0" w:after="0"/>
+                    <w:spacing w:after="0"/>
+                    <w:jc w:val="left"/>
                   </w:pPr>
                   <w:r>
                     <w:rPr>
-                      <w:rFonts w:ascii="Times New Roman" w:hAnsi="Times New Roman" w:cs="Times New Roman" w:eastAsia="Times New Roman"/>
+                      <w:rFonts w:ascii="Calibri" w:hAnsi="Calibri" w:eastAsia="Calibri"/>
                       <w:b w:val="0"/>
+                      <w:color w:val="1A1A1A"/>
                       <w:sz w:val="16"/>
                     </w:rPr>
                     <w:t>SORVANOVAAA@GMAIL.COM</w:t>
@@ -1588,12 +2414,14 @@
           <w:p/>
           <w:p>
             <w:pPr>
-              <w:spacing w:before="160" w:after="40" w:line="252" w:lineRule="auto"/>
+              <w:spacing w:before="200" w:after="40" w:line="252" w:lineRule="auto"/>
+              <w:jc w:val="left"/>
             </w:pPr>
             <w:r>
               <w:rPr>
-                <w:rFonts w:ascii="Times New Roman" w:hAnsi="Times New Roman" w:cs="Times New Roman" w:eastAsia="Times New Roman"/>
+                <w:rFonts w:ascii="Calibri" w:hAnsi="Calibri" w:eastAsia="Calibri"/>
                 <w:b w:val="0"/>
+                <w:color w:val="1A1A1A"/>
                 <w:sz w:val="16"/>
               </w:rPr>
               <w:t>_________________ / Сорванова А. А. /</w:t>
@@ -1602,11 +2430,13 @@
           <w:p>
             <w:pPr>
               <w:spacing w:before="0" w:after="0" w:line="252" w:lineRule="auto"/>
+              <w:jc w:val="left"/>
             </w:pPr>
             <w:r>
               <w:rPr>
-                <w:rFonts w:ascii="Times New Roman" w:hAnsi="Times New Roman" w:cs="Times New Roman" w:eastAsia="Times New Roman"/>
+                <w:rFonts w:ascii="Calibri" w:hAnsi="Calibri" w:eastAsia="Calibri"/>
                 <w:b w:val="0"/>
+                <w:color w:val="1A1A1A"/>
                 <w:sz w:val="16"/>
               </w:rPr>
               <w:t>М.П. (при наличии)     Дата: 01.08.2026</w:t>
@@ -1615,15 +2445,14 @@
         </w:tc>
         <w:tc>
           <w:tcPr>
-            <w:tcW w:type="dxa" w:w="5103"/>
+            <w:tcW w:type="dxa" w:w="4876"/>
             <w:tcMar>
               <w:top w:w="40" w:type="dxa"/>
               <w:left w:w="80" w:type="dxa"/>
               <w:bottom w:w="40" w:type="dxa"/>
-              <w:right w:w="40" w:type="dxa"/>
+              <w:right w:w="20" w:type="dxa"/>
             </w:tcMar>
           </w:tcPr>
-          <w:p/>
           <w:p>
             <w:pPr>
               <w:spacing w:before="0" w:after="120" w:line="252" w:lineRule="auto"/>
@@ -1631,22 +2460,31 @@
             </w:pPr>
             <w:r>
               <w:rPr>
-                <w:rFonts w:ascii="Times New Roman" w:hAnsi="Times New Roman" w:cs="Times New Roman" w:eastAsia="Times New Roman"/>
+                <w:rFonts w:ascii="Calibri" w:hAnsi="Calibri" w:eastAsia="Calibri"/>
                 <w:b/>
-                <w:sz w:val="20"/>
+                <w:color w:val="1A1A1A"/>
+                <w:sz w:val="22"/>
               </w:rPr>
               <w:t>РАБОТНИК</w:t>
             </w:r>
           </w:p>
           <w:tbl>
             <w:tblPr>
-              <w:tblStyle w:val="TableGrid"/>
               <w:tblW w:type="auto" w:w="0"/>
+              <w:jc w:val="left"/>
               <w:tblLook w:firstColumn="1" w:firstRow="1" w:lastColumn="0" w:lastRow="0" w:noHBand="0" w:noVBand="1" w:val="04A0"/>
+              <w:tblBorders>
+                <w:top w:val="single" w:sz="4" w:space="0" w:color="BBBBBB"/>
+                <w:left w:val="single" w:sz="4" w:space="0" w:color="BBBBBB"/>
+                <w:bottom w:val="single" w:sz="4" w:space="0" w:color="BBBBBB"/>
+                <w:right w:val="single" w:sz="4" w:space="0" w:color="BBBBBB"/>
+                <w:insideH w:val="single" w:sz="4" w:space="0" w:color="BBBBBB"/>
+                <w:insideV w:val="single" w:sz="4" w:space="0" w:color="BBBBBB"/>
+              </w:tblBorders>
             </w:tblPr>
             <w:tblGrid>
-              <w:gridCol w:w="2551"/>
-              <w:gridCol w:w="2551"/>
+              <w:gridCol w:w="2438"/>
+              <w:gridCol w:w="2438"/>
             </w:tblGrid>
             <w:tr>
               <w:tc>
@@ -1658,15 +2496,18 @@
                     <w:bottom w:w="30" w:type="dxa"/>
                     <w:right w:w="40" w:type="dxa"/>
                   </w:tcMar>
+                  <w:shd w:fill="F5F5F5" w:val="clear"/>
                 </w:tcPr>
                 <w:p>
                   <w:pPr>
-                    <w:spacing w:before="0" w:after="0"/>
+                    <w:spacing w:after="0"/>
+                    <w:jc w:val="left"/>
                   </w:pPr>
                   <w:r>
                     <w:rPr>
-                      <w:rFonts w:ascii="Times New Roman" w:hAnsi="Times New Roman" w:cs="Times New Roman" w:eastAsia="Times New Roman"/>
+                      <w:rFonts w:ascii="Calibri" w:hAnsi="Calibri" w:eastAsia="Calibri"/>
                       <w:b/>
+                      <w:color w:val="1A1A1A"/>
                       <w:sz w:val="16"/>
                     </w:rPr>
                     <w:t>ФИО</w:t>
@@ -1675,7 +2516,7 @@
               </w:tc>
               <w:tc>
                 <w:tcPr>
-                  <w:tcW w:type="dxa" w:w="3402"/>
+                  <w:tcW w:type="dxa" w:w="3061"/>
                   <w:tcMar>
                     <w:top w:w="30" w:type="dxa"/>
                     <w:left w:w="40" w:type="dxa"/>
@@ -1685,12 +2526,14 @@
                 </w:tcPr>
                 <w:p>
                   <w:pPr>
-                    <w:spacing w:before="0" w:after="0"/>
+                    <w:spacing w:after="0"/>
+                    <w:jc w:val="left"/>
                   </w:pPr>
                   <w:r>
                     <w:rPr>
-                      <w:rFonts w:ascii="Times New Roman" w:hAnsi="Times New Roman" w:cs="Times New Roman" w:eastAsia="Times New Roman"/>
+                      <w:rFonts w:ascii="Calibri" w:hAnsi="Calibri" w:eastAsia="Calibri"/>
                       <w:b w:val="0"/>
+                      <w:color w:val="1A1A1A"/>
                       <w:sz w:val="16"/>
                     </w:rPr>
                     <w:t>Ходжиматов Фуркатжон Махамаджонович</w:t>
@@ -1708,15 +2551,18 @@
                     <w:bottom w:w="30" w:type="dxa"/>
                     <w:right w:w="40" w:type="dxa"/>
                   </w:tcMar>
+                  <w:shd w:fill="F5F5F5" w:val="clear"/>
                 </w:tcPr>
                 <w:p>
                   <w:pPr>
-                    <w:spacing w:before="0" w:after="0"/>
+                    <w:spacing w:after="0"/>
+                    <w:jc w:val="left"/>
                   </w:pPr>
                   <w:r>
                     <w:rPr>
-                      <w:rFonts w:ascii="Times New Roman" w:hAnsi="Times New Roman" w:cs="Times New Roman" w:eastAsia="Times New Roman"/>
+                      <w:rFonts w:ascii="Calibri" w:hAnsi="Calibri" w:eastAsia="Calibri"/>
                       <w:b/>
+                      <w:color w:val="1A1A1A"/>
                       <w:sz w:val="16"/>
                     </w:rPr>
                     <w:t>Гражданство</w:t>
@@ -1725,22 +2571,25 @@
               </w:tc>
               <w:tc>
                 <w:tcPr>
-                  <w:tcW w:type="dxa" w:w="3402"/>
+                  <w:tcW w:type="dxa" w:w="3061"/>
                   <w:tcMar>
                     <w:top w:w="30" w:type="dxa"/>
                     <w:left w:w="40" w:type="dxa"/>
                     <w:bottom w:w="30" w:type="dxa"/>
                     <w:right w:w="40" w:type="dxa"/>
                   </w:tcMar>
+                  <w:shd w:fill="FAFAFA" w:val="clear"/>
                 </w:tcPr>
                 <w:p>
                   <w:pPr>
-                    <w:spacing w:before="0" w:after="0"/>
+                    <w:spacing w:after="0"/>
+                    <w:jc w:val="left"/>
                   </w:pPr>
                   <w:r>
                     <w:rPr>
-                      <w:rFonts w:ascii="Times New Roman" w:hAnsi="Times New Roman" w:cs="Times New Roman" w:eastAsia="Times New Roman"/>
+                      <w:rFonts w:ascii="Calibri" w:hAnsi="Calibri" w:eastAsia="Calibri"/>
                       <w:b w:val="0"/>
+                      <w:color w:val="1A1A1A"/>
                       <w:sz w:val="16"/>
                     </w:rPr>
                     <w:t>Республика Узбекистан</w:t>
@@ -1758,15 +2607,18 @@
                     <w:bottom w:w="30" w:type="dxa"/>
                     <w:right w:w="40" w:type="dxa"/>
                   </w:tcMar>
+                  <w:shd w:fill="F5F5F5" w:val="clear"/>
                 </w:tcPr>
                 <w:p>
                   <w:pPr>
-                    <w:spacing w:before="0" w:after="0"/>
+                    <w:spacing w:after="0"/>
+                    <w:jc w:val="left"/>
                   </w:pPr>
                   <w:r>
                     <w:rPr>
-                      <w:rFonts w:ascii="Times New Roman" w:hAnsi="Times New Roman" w:cs="Times New Roman" w:eastAsia="Times New Roman"/>
+                      <w:rFonts w:ascii="Calibri" w:hAnsi="Calibri" w:eastAsia="Calibri"/>
                       <w:b/>
+                      <w:color w:val="1A1A1A"/>
                       <w:sz w:val="16"/>
                     </w:rPr>
                     <w:t>Паспорт</w:t>
@@ -1775,7 +2627,7 @@
               </w:tc>
               <w:tc>
                 <w:tcPr>
-                  <w:tcW w:type="dxa" w:w="3402"/>
+                  <w:tcW w:type="dxa" w:w="3061"/>
                   <w:tcMar>
                     <w:top w:w="30" w:type="dxa"/>
                     <w:left w:w="40" w:type="dxa"/>
@@ -1785,15 +2637,17 @@
                 </w:tcPr>
                 <w:p>
                   <w:pPr>
-                    <w:spacing w:before="0" w:after="0"/>
+                    <w:spacing w:after="0"/>
+                    <w:jc w:val="left"/>
                   </w:pPr>
                   <w:r>
                     <w:rPr>
-                      <w:rFonts w:ascii="Times New Roman" w:hAnsi="Times New Roman" w:cs="Times New Roman" w:eastAsia="Times New Roman"/>
+                      <w:rFonts w:ascii="Calibri" w:hAnsi="Calibri" w:eastAsia="Calibri"/>
                       <w:b w:val="0"/>
+                      <w:color w:val="1A1A1A"/>
                       <w:sz w:val="16"/>
                     </w:rPr>
-                    <w:t>№ FA6253664, выдан 29.08.2022, MIA 18227 (Узбекистан), до 28.08.2027</w:t>
+                    <w:t>№ FA6253664, до 28.08.2027</w:t>
                   </w:r>
                 </w:p>
               </w:tc>
@@ -1808,39 +2662,45 @@
                     <w:bottom w:w="30" w:type="dxa"/>
                     <w:right w:w="40" w:type="dxa"/>
                   </w:tcMar>
+                  <w:shd w:fill="F5F5F5" w:val="clear"/>
                 </w:tcPr>
                 <w:p>
                   <w:pPr>
-                    <w:spacing w:before="0" w:after="0"/>
+                    <w:spacing w:after="0"/>
+                    <w:jc w:val="left"/>
                   </w:pPr>
                   <w:r>
                     <w:rPr>
-                      <w:rFonts w:ascii="Times New Roman" w:hAnsi="Times New Roman" w:cs="Times New Roman" w:eastAsia="Times New Roman"/>
+                      <w:rFonts w:ascii="Calibri" w:hAnsi="Calibri" w:eastAsia="Calibri"/>
                       <w:b/>
+                      <w:color w:val="1A1A1A"/>
                       <w:sz w:val="16"/>
                     </w:rPr>
-                    <w:t>Адрес пребывания</w:t>
+                    <w:t>Адрес</w:t>
                   </w:r>
                 </w:p>
               </w:tc>
               <w:tc>
                 <w:tcPr>
-                  <w:tcW w:type="dxa" w:w="3402"/>
+                  <w:tcW w:type="dxa" w:w="3061"/>
                   <w:tcMar>
                     <w:top w:w="30" w:type="dxa"/>
                     <w:left w:w="40" w:type="dxa"/>
                     <w:bottom w:w="30" w:type="dxa"/>
                     <w:right w:w="40" w:type="dxa"/>
                   </w:tcMar>
+                  <w:shd w:fill="FAFAFA" w:val="clear"/>
                 </w:tcPr>
                 <w:p>
                   <w:pPr>
-                    <w:spacing w:before="0" w:after="0"/>
+                    <w:spacing w:after="0"/>
+                    <w:jc w:val="left"/>
                   </w:pPr>
                   <w:r>
                     <w:rPr>
-                      <w:rFonts w:ascii="Times New Roman" w:hAnsi="Times New Roman" w:cs="Times New Roman" w:eastAsia="Times New Roman"/>
+                      <w:rFonts w:ascii="Calibri" w:hAnsi="Calibri" w:eastAsia="Calibri"/>
                       <w:b w:val="0"/>
+                      <w:color w:val="1A1A1A"/>
                       <w:sz w:val="16"/>
                     </w:rPr>
                     <w:t>г. Москва, поселение Вороновское, Варшавское ш. 64-й км, домовладение 1, строение 47</w:t>
@@ -1858,24 +2718,27 @@
                     <w:bottom w:w="30" w:type="dxa"/>
                     <w:right w:w="40" w:type="dxa"/>
                   </w:tcMar>
+                  <w:shd w:fill="F5F5F5" w:val="clear"/>
                 </w:tcPr>
                 <w:p>
                   <w:pPr>
-                    <w:spacing w:before="0" w:after="0"/>
+                    <w:spacing w:after="0"/>
+                    <w:jc w:val="left"/>
                   </w:pPr>
                   <w:r>
                     <w:rPr>
-                      <w:rFonts w:ascii="Times New Roman" w:hAnsi="Times New Roman" w:cs="Times New Roman" w:eastAsia="Times New Roman"/>
+                      <w:rFonts w:ascii="Calibri" w:hAnsi="Calibri" w:eastAsia="Calibri"/>
                       <w:b/>
+                      <w:color w:val="1A1A1A"/>
                       <w:sz w:val="16"/>
                     </w:rPr>
-                    <w:t>Миграционная карта</w:t>
+                    <w:t>Мигр. карта</w:t>
                   </w:r>
                 </w:p>
               </w:tc>
               <w:tc>
                 <w:tcPr>
-                  <w:tcW w:type="dxa" w:w="3402"/>
+                  <w:tcW w:type="dxa" w:w="3061"/>
                   <w:tcMar>
                     <w:top w:w="30" w:type="dxa"/>
                     <w:left w:w="40" w:type="dxa"/>
@@ -1885,12 +2748,14 @@
                 </w:tcPr>
                 <w:p>
                   <w:pPr>
-                    <w:spacing w:before="0" w:after="0"/>
+                    <w:spacing w:after="0"/>
+                    <w:jc w:val="left"/>
                   </w:pPr>
                   <w:r>
                     <w:rPr>
-                      <w:rFonts w:ascii="Times New Roman" w:hAnsi="Times New Roman" w:cs="Times New Roman" w:eastAsia="Times New Roman"/>
+                      <w:rFonts w:ascii="Calibri" w:hAnsi="Calibri" w:eastAsia="Calibri"/>
                       <w:b w:val="0"/>
+                      <w:color w:val="1A1A1A"/>
                       <w:sz w:val="16"/>
                     </w:rPr>
                     <w:t>серия 45 26 № 0767385</w:t>
@@ -1908,15 +2773,18 @@
                     <w:bottom w:w="30" w:type="dxa"/>
                     <w:right w:w="40" w:type="dxa"/>
                   </w:tcMar>
+                  <w:shd w:fill="F5F5F5" w:val="clear"/>
                 </w:tcPr>
                 <w:p>
                   <w:pPr>
-                    <w:spacing w:before="0" w:after="0"/>
+                    <w:spacing w:after="0"/>
+                    <w:jc w:val="left"/>
                   </w:pPr>
                   <w:r>
                     <w:rPr>
-                      <w:rFonts w:ascii="Times New Roman" w:hAnsi="Times New Roman" w:cs="Times New Roman" w:eastAsia="Times New Roman"/>
+                      <w:rFonts w:ascii="Calibri" w:hAnsi="Calibri" w:eastAsia="Calibri"/>
                       <w:b/>
+                      <w:color w:val="1A1A1A"/>
                       <w:sz w:val="16"/>
                     </w:rPr>
                     <w:t>Патент</w:t>
@@ -1925,25 +2793,28 @@
               </w:tc>
               <w:tc>
                 <w:tcPr>
-                  <w:tcW w:type="dxa" w:w="3402"/>
+                  <w:tcW w:type="dxa" w:w="3061"/>
                   <w:tcMar>
                     <w:top w:w="30" w:type="dxa"/>
                     <w:left w:w="40" w:type="dxa"/>
                     <w:bottom w:w="30" w:type="dxa"/>
                     <w:right w:w="40" w:type="dxa"/>
                   </w:tcMar>
+                  <w:shd w:fill="FAFAFA" w:val="clear"/>
                 </w:tcPr>
                 <w:p>
                   <w:pPr>
-                    <w:spacing w:before="0" w:after="0"/>
+                    <w:spacing w:after="0"/>
+                    <w:jc w:val="left"/>
                   </w:pPr>
                   <w:r>
                     <w:rPr>
-                      <w:rFonts w:ascii="Times New Roman" w:hAnsi="Times New Roman" w:cs="Times New Roman" w:eastAsia="Times New Roman"/>
+                      <w:rFonts w:ascii="Calibri" w:hAnsi="Calibri" w:eastAsia="Calibri"/>
                       <w:b w:val="0"/>
+                      <w:color w:val="1A1A1A"/>
                       <w:sz w:val="16"/>
                     </w:rPr>
-                    <w:t>серия 77 № 2600347821, профессия: Бармен, территория: г. Москва</w:t>
+                    <w:t>серия 77 № 2600347821, Бармен</w:t>
                   </w:r>
                 </w:p>
               </w:tc>
@@ -1958,15 +2829,18 @@
                     <w:bottom w:w="30" w:type="dxa"/>
                     <w:right w:w="40" w:type="dxa"/>
                   </w:tcMar>
+                  <w:shd w:fill="F5F5F5" w:val="clear"/>
                 </w:tcPr>
                 <w:p>
                   <w:pPr>
-                    <w:spacing w:before="0" w:after="0"/>
+                    <w:spacing w:after="0"/>
+                    <w:jc w:val="left"/>
                   </w:pPr>
                   <w:r>
                     <w:rPr>
-                      <w:rFonts w:ascii="Times New Roman" w:hAnsi="Times New Roman" w:cs="Times New Roman" w:eastAsia="Times New Roman"/>
+                      <w:rFonts w:ascii="Calibri" w:hAnsi="Calibri" w:eastAsia="Calibri"/>
                       <w:b/>
+                      <w:color w:val="1A1A1A"/>
                       <w:sz w:val="16"/>
                     </w:rPr>
                     <w:t>СНИЛС</w:t>
@@ -1975,7 +2849,7 @@
               </w:tc>
               <w:tc>
                 <w:tcPr>
-                  <w:tcW w:type="dxa" w:w="3402"/>
+                  <w:tcW w:type="dxa" w:w="3061"/>
                   <w:tcMar>
                     <w:top w:w="30" w:type="dxa"/>
                     <w:left w:w="40" w:type="dxa"/>
@@ -1985,12 +2859,14 @@
                 </w:tcPr>
                 <w:p>
                   <w:pPr>
-                    <w:spacing w:before="0" w:after="0"/>
+                    <w:spacing w:after="0"/>
+                    <w:jc w:val="left"/>
                   </w:pPr>
                   <w:r>
                     <w:rPr>
-                      <w:rFonts w:ascii="Times New Roman" w:hAnsi="Times New Roman" w:cs="Times New Roman" w:eastAsia="Times New Roman"/>
+                      <w:rFonts w:ascii="Calibri" w:hAnsi="Calibri" w:eastAsia="Calibri"/>
                       <w:b w:val="0"/>
+                      <w:color w:val="1A1A1A"/>
                       <w:sz w:val="16"/>
                     </w:rPr>
                     <w:t>229-173-224 63</w:t>
@@ -2008,15 +2884,18 @@
                     <w:bottom w:w="30" w:type="dxa"/>
                     <w:right w:w="40" w:type="dxa"/>
                   </w:tcMar>
+                  <w:shd w:fill="F5F5F5" w:val="clear"/>
                 </w:tcPr>
                 <w:p>
                   <w:pPr>
-                    <w:spacing w:before="0" w:after="0"/>
+                    <w:spacing w:after="0"/>
+                    <w:jc w:val="left"/>
                   </w:pPr>
                   <w:r>
                     <w:rPr>
-                      <w:rFonts w:ascii="Times New Roman" w:hAnsi="Times New Roman" w:cs="Times New Roman" w:eastAsia="Times New Roman"/>
+                      <w:rFonts w:ascii="Calibri" w:hAnsi="Calibri" w:eastAsia="Calibri"/>
                       <w:b/>
+                      <w:color w:val="1A1A1A"/>
                       <w:sz w:val="16"/>
                     </w:rPr>
                     <w:t>ИНН</w:t>
@@ -2025,22 +2904,25 @@
               </w:tc>
               <w:tc>
                 <w:tcPr>
-                  <w:tcW w:type="dxa" w:w="3402"/>
+                  <w:tcW w:type="dxa" w:w="3061"/>
                   <w:tcMar>
                     <w:top w:w="30" w:type="dxa"/>
                     <w:left w:w="40" w:type="dxa"/>
                     <w:bottom w:w="30" w:type="dxa"/>
                     <w:right w:w="40" w:type="dxa"/>
                   </w:tcMar>
+                  <w:shd w:fill="FAFAFA" w:val="clear"/>
                 </w:tcPr>
                 <w:p>
                   <w:pPr>
-                    <w:spacing w:before="0" w:after="0"/>
+                    <w:spacing w:after="0"/>
+                    <w:jc w:val="left"/>
                   </w:pPr>
                   <w:r>
                     <w:rPr>
-                      <w:rFonts w:ascii="Times New Roman" w:hAnsi="Times New Roman" w:cs="Times New Roman" w:eastAsia="Times New Roman"/>
+                      <w:rFonts w:ascii="Calibri" w:hAnsi="Calibri" w:eastAsia="Calibri"/>
                       <w:b w:val="0"/>
+                      <w:color w:val="1A1A1A"/>
                       <w:sz w:val="16"/>
                     </w:rPr>
                     <w:t>772430430429</w:t>
@@ -2058,15 +2940,18 @@
                     <w:bottom w:w="30" w:type="dxa"/>
                     <w:right w:w="40" w:type="dxa"/>
                   </w:tcMar>
+                  <w:shd w:fill="F5F5F5" w:val="clear"/>
                 </w:tcPr>
                 <w:p>
                   <w:pPr>
-                    <w:spacing w:before="0" w:after="0"/>
+                    <w:spacing w:after="0"/>
+                    <w:jc w:val="left"/>
                   </w:pPr>
                   <w:r>
                     <w:rPr>
-                      <w:rFonts w:ascii="Times New Roman" w:hAnsi="Times New Roman" w:cs="Times New Roman" w:eastAsia="Times New Roman"/>
+                      <w:rFonts w:ascii="Calibri" w:hAnsi="Calibri" w:eastAsia="Calibri"/>
                       <w:b/>
+                      <w:color w:val="1A1A1A"/>
                       <w:sz w:val="16"/>
                     </w:rPr>
                     <w:t>Телефон</w:t>
@@ -2075,7 +2960,7 @@
               </w:tc>
               <w:tc>
                 <w:tcPr>
-                  <w:tcW w:type="dxa" w:w="3402"/>
+                  <w:tcW w:type="dxa" w:w="3061"/>
                   <w:tcMar>
                     <w:top w:w="30" w:type="dxa"/>
                     <w:left w:w="40" w:type="dxa"/>
@@ -2085,12 +2970,14 @@
                 </w:tcPr>
                 <w:p>
                   <w:pPr>
-                    <w:spacing w:before="0" w:after="0"/>
+                    <w:spacing w:after="0"/>
+                    <w:jc w:val="left"/>
                   </w:pPr>
                   <w:r>
                     <w:rPr>
-                      <w:rFonts w:ascii="Times New Roman" w:hAnsi="Times New Roman" w:cs="Times New Roman" w:eastAsia="Times New Roman"/>
+                      <w:rFonts w:ascii="Calibri" w:hAnsi="Calibri" w:eastAsia="Calibri"/>
                       <w:b w:val="0"/>
+                      <w:color w:val="1A1A1A"/>
                       <w:sz w:val="16"/>
                     </w:rPr>
                     <w:t>8 (901) 797-57-53</w:t>
@@ -2108,24 +2995,83 @@
                     <w:bottom w:w="30" w:type="dxa"/>
                     <w:right w:w="40" w:type="dxa"/>
                   </w:tcMar>
+                  <w:shd w:fill="F5F5F5" w:val="clear"/>
                 </w:tcPr>
                 <w:p>
                   <w:pPr>
-                    <w:spacing w:before="0" w:after="0"/>
+                    <w:spacing w:after="0"/>
+                    <w:jc w:val="left"/>
                   </w:pPr>
                   <w:r>
                     <w:rPr>
-                      <w:rFonts w:ascii="Times New Roman" w:hAnsi="Times New Roman" w:cs="Times New Roman" w:eastAsia="Times New Roman"/>
+                      <w:rFonts w:ascii="Calibri" w:hAnsi="Calibri" w:eastAsia="Calibri"/>
                       <w:b/>
+                      <w:color w:val="1A1A1A"/>
                       <w:sz w:val="16"/>
                     </w:rPr>
-                    <w:t>Зарплатный счёт (безнал)</w:t>
+                    <w:t>Счёт (безнал)</w:t>
                   </w:r>
                 </w:p>
               </w:tc>
               <w:tc>
                 <w:tcPr>
-                  <w:tcW w:type="dxa" w:w="3402"/>
+                  <w:tcW w:type="dxa" w:w="3061"/>
+                  <w:tcMar>
+                    <w:top w:w="30" w:type="dxa"/>
+                    <w:left w:w="40" w:type="dxa"/>
+                    <w:bottom w:w="30" w:type="dxa"/>
+                    <w:right w:w="40" w:type="dxa"/>
+                  </w:tcMar>
+                  <w:shd w:fill="FAFAFA" w:val="clear"/>
+                </w:tcPr>
+                <w:p>
+                  <w:pPr>
+                    <w:spacing w:after="0"/>
+                    <w:jc w:val="left"/>
+                  </w:pPr>
+                  <w:r>
+                    <w:rPr>
+                      <w:rFonts w:ascii="Calibri" w:hAnsi="Calibri" w:eastAsia="Calibri"/>
+                      <w:b w:val="0"/>
+                      <w:color w:val="1A1A1A"/>
+                      <w:sz w:val="16"/>
+                    </w:rPr>
+                    <w:t>40820810338110973759</w:t>
+                  </w:r>
+                </w:p>
+              </w:tc>
+            </w:tr>
+            <w:tr>
+              <w:tc>
+                <w:tcPr>
+                  <w:tcW w:type="dxa" w:w="1474"/>
+                  <w:tcMar>
+                    <w:top w:w="30" w:type="dxa"/>
+                    <w:left w:w="40" w:type="dxa"/>
+                    <w:bottom w:w="30" w:type="dxa"/>
+                    <w:right w:w="40" w:type="dxa"/>
+                  </w:tcMar>
+                  <w:shd w:fill="F5F5F5" w:val="clear"/>
+                </w:tcPr>
+                <w:p>
+                  <w:pPr>
+                    <w:spacing w:after="0"/>
+                    <w:jc w:val="left"/>
+                  </w:pPr>
+                  <w:r>
+                    <w:rPr>
+                      <w:rFonts w:ascii="Calibri" w:hAnsi="Calibri" w:eastAsia="Calibri"/>
+                      <w:b/>
+                      <w:color w:val="1A1A1A"/>
+                      <w:sz w:val="16"/>
+                    </w:rPr>
+                    <w:t>Банк</w:t>
+                  </w:r>
+                </w:p>
+              </w:tc>
+              <w:tc>
+                <w:tcPr>
+                  <w:tcW w:type="dxa" w:w="3061"/>
                   <w:tcMar>
                     <w:top w:w="30" w:type="dxa"/>
                     <w:left w:w="40" w:type="dxa"/>
@@ -2135,15 +3081,17 @@
                 </w:tcPr>
                 <w:p>
                   <w:pPr>
-                    <w:spacing w:before="0" w:after="0"/>
+                    <w:spacing w:after="0"/>
+                    <w:jc w:val="left"/>
                   </w:pPr>
                   <w:r>
                     <w:rPr>
-                      <w:rFonts w:ascii="Times New Roman" w:hAnsi="Times New Roman" w:cs="Times New Roman" w:eastAsia="Times New Roman"/>
+                      <w:rFonts w:ascii="Calibri" w:hAnsi="Calibri" w:eastAsia="Calibri"/>
                       <w:b w:val="0"/>
+                      <w:color w:val="1A1A1A"/>
                       <w:sz w:val="16"/>
                     </w:rPr>
-                    <w:t>валюта RUB; получатель — ХОДЖИМАТОВ ФУРКАТЖОН МАХАМАДЖОНОВИЧ; счёт 40820810338110973759; банк — ПАО Сбербанк; БИК 044525225; к/с 30101810400000000225; ИНН банка 7707083893; КПП 773643001; ОКПО 57972160; ОГРН 1027700132195; SWIFT SABRRUMM; адрес банка — 109544, МОСКВА, УЛ.Б.АНДРОНЬЕВСКАЯ,6</w:t>
+                    <w:t>ПАО Сбербанк, БИК 044525225</w:t>
                   </w:r>
                 </w:p>
               </w:tc>
@@ -2152,12 +3100,14 @@
           <w:p/>
           <w:p>
             <w:pPr>
-              <w:spacing w:before="160" w:after="40" w:line="252" w:lineRule="auto"/>
+              <w:spacing w:before="200" w:after="40" w:line="252" w:lineRule="auto"/>
+              <w:jc w:val="left"/>
             </w:pPr>
             <w:r>
               <w:rPr>
-                <w:rFonts w:ascii="Times New Roman" w:hAnsi="Times New Roman" w:cs="Times New Roman" w:eastAsia="Times New Roman"/>
+                <w:rFonts w:ascii="Calibri" w:hAnsi="Calibri" w:eastAsia="Calibri"/>
                 <w:b w:val="0"/>
+                <w:color w:val="1A1A1A"/>
                 <w:sz w:val="16"/>
               </w:rPr>
               <w:t>Экземпляр Договора получил:</w:t>
@@ -2166,11 +3116,13 @@
           <w:p>
             <w:pPr>
               <w:spacing w:before="0" w:after="40" w:line="252" w:lineRule="auto"/>
+              <w:jc w:val="left"/>
             </w:pPr>
             <w:r>
               <w:rPr>
-                <w:rFonts w:ascii="Times New Roman" w:hAnsi="Times New Roman" w:cs="Times New Roman" w:eastAsia="Times New Roman"/>
+                <w:rFonts w:ascii="Calibri" w:hAnsi="Calibri" w:eastAsia="Calibri"/>
                 <w:b w:val="0"/>
+                <w:color w:val="1A1A1A"/>
                 <w:sz w:val="16"/>
               </w:rPr>
               <w:t>_________________ / Ходжиматов Ф. М. /</w:t>
@@ -2179,11 +3131,13 @@
           <w:p>
             <w:pPr>
               <w:spacing w:before="0" w:after="0" w:line="252" w:lineRule="auto"/>
+              <w:jc w:val="left"/>
             </w:pPr>
             <w:r>
               <w:rPr>
-                <w:rFonts w:ascii="Times New Roman" w:hAnsi="Times New Roman" w:cs="Times New Roman" w:eastAsia="Times New Roman"/>
+                <w:rFonts w:ascii="Calibri" w:hAnsi="Calibri" w:eastAsia="Calibri"/>
                 <w:b w:val="0"/>
+                <w:color w:val="1A1A1A"/>
                 <w:sz w:val="16"/>
               </w:rPr>
               <w:t>Дата: 01.08.2026</w:t>
@@ -2192,23 +3146,9 @@
         </w:tc>
       </w:tr>
     </w:tbl>
-    <w:p>
-      <w:pPr>
-        <w:spacing w:before="240"/>
-      </w:pPr>
-      <w:r>
-        <w:rPr>
-          <w:rFonts w:ascii="Calibri" w:hAnsi="Calibri" w:eastAsia="Calibri"/>
-          <w:b w:val="0"/>
-          <w:color w:val="666666"/>
-          <w:sz w:val="18"/>
-        </w:rPr>
-        <w:t>Перед подписанием сверить данные с оригиналами документов и бухгалтером. Документ не является индивидуальной юридической консультацией.</w:t>
-      </w:r>
-    </w:p>
     <w:sectPr>
       <w:pgSz w:w="11906" w:h="16838"/>
-      <w:pgMar w:top="850" w:right="850" w:bottom="850" w:left="850" w:header="720" w:footer="720" w:gutter="0"/>
+      <w:pgMar w:top="1020" w:right="1020" w:bottom="1020" w:left="1134" w:header="720" w:footer="720" w:gutter="0"/>
       <w:cols w:space="720"/>
       <w:docGrid w:linePitch="360"/>
     </w:sectPr>
@@ -2580,11 +3520,11 @@
     <w:qFormat/>
     <w:rsid w:val="00FC693F"/>
     <w:pPr>
-      <w:spacing w:lineRule="auto" w:line="276" w:after="120"/>
+      <w:spacing w:lineRule="auto" w:line="269" w:after="80"/>
     </w:pPr>
     <w:rPr>
       <w:rFonts w:ascii="Calibri" w:hAnsi="Calibri" w:eastAsia="Calibri"/>
-      <w:color w:val="333333"/>
+      <w:color w:val="1A1A1A"/>
       <w:sz w:val="22"/>
     </w:rPr>
   </w:style>

</xml_diff>

<commit_message>
Remove gray table cell shading from the employment contract.
All KV table cells now use white fill; regenerate DOCX/PDF and sync docs copies.
</commit_message>
<xml_diff>
--- a/docs/трудовой-договор/трудовой-договор-Ходжиматов-бессрочный-01.08.2026.docx
+++ b/docs/трудовой-договор/трудовой-договор-Ходжиматов-бессрочный-01.08.2026.docx
@@ -63,7 +63,7 @@
               <w:bottom w:w="30" w:type="dxa"/>
               <w:right w:w="40" w:type="dxa"/>
             </w:tcMar>
-            <w:shd w:fill="F5F5F5" w:val="clear"/>
+            <w:shd w:fill="FFFFFF" w:val="clear"/>
           </w:tcPr>
           <w:p>
             <w:pPr>
@@ -90,6 +90,7 @@
               <w:bottom w:w="30" w:type="dxa"/>
               <w:right w:w="40" w:type="dxa"/>
             </w:tcMar>
+            <w:shd w:fill="FFFFFF" w:val="clear"/>
           </w:tcPr>
           <w:p>
             <w:pPr>
@@ -118,7 +119,7 @@
               <w:bottom w:w="30" w:type="dxa"/>
               <w:right w:w="40" w:type="dxa"/>
             </w:tcMar>
-            <w:shd w:fill="F5F5F5" w:val="clear"/>
+            <w:shd w:fill="FFFFFF" w:val="clear"/>
           </w:tcPr>
           <w:p>
             <w:pPr>
@@ -145,7 +146,7 @@
               <w:bottom w:w="30" w:type="dxa"/>
               <w:right w:w="40" w:type="dxa"/>
             </w:tcMar>
-            <w:shd w:fill="FAFAFA" w:val="clear"/>
+            <w:shd w:fill="FFFFFF" w:val="clear"/>
           </w:tcPr>
           <w:p>
             <w:pPr>
@@ -174,7 +175,7 @@
               <w:bottom w:w="30" w:type="dxa"/>
               <w:right w:w="40" w:type="dxa"/>
             </w:tcMar>
-            <w:shd w:fill="F5F5F5" w:val="clear"/>
+            <w:shd w:fill="FFFFFF" w:val="clear"/>
           </w:tcPr>
           <w:p>
             <w:pPr>
@@ -201,6 +202,7 @@
               <w:bottom w:w="30" w:type="dxa"/>
               <w:right w:w="40" w:type="dxa"/>
             </w:tcMar>
+            <w:shd w:fill="FFFFFF" w:val="clear"/>
           </w:tcPr>
           <w:p>
             <w:pPr>
@@ -229,7 +231,7 @@
               <w:bottom w:w="30" w:type="dxa"/>
               <w:right w:w="40" w:type="dxa"/>
             </w:tcMar>
-            <w:shd w:fill="F5F5F5" w:val="clear"/>
+            <w:shd w:fill="FFFFFF" w:val="clear"/>
           </w:tcPr>
           <w:p>
             <w:pPr>
@@ -256,7 +258,7 @@
               <w:bottom w:w="30" w:type="dxa"/>
               <w:right w:w="40" w:type="dxa"/>
             </w:tcMar>
-            <w:shd w:fill="FAFAFA" w:val="clear"/>
+            <w:shd w:fill="FFFFFF" w:val="clear"/>
           </w:tcPr>
           <w:p>
             <w:pPr>
@@ -285,7 +287,7 @@
               <w:bottom w:w="30" w:type="dxa"/>
               <w:right w:w="40" w:type="dxa"/>
             </w:tcMar>
-            <w:shd w:fill="F5F5F5" w:val="clear"/>
+            <w:shd w:fill="FFFFFF" w:val="clear"/>
           </w:tcPr>
           <w:p>
             <w:pPr>
@@ -312,6 +314,7 @@
               <w:bottom w:w="30" w:type="dxa"/>
               <w:right w:w="40" w:type="dxa"/>
             </w:tcMar>
+            <w:shd w:fill="FFFFFF" w:val="clear"/>
           </w:tcPr>
           <w:p>
             <w:pPr>
@@ -340,7 +343,7 @@
               <w:bottom w:w="30" w:type="dxa"/>
               <w:right w:w="40" w:type="dxa"/>
             </w:tcMar>
-            <w:shd w:fill="F5F5F5" w:val="clear"/>
+            <w:shd w:fill="FFFFFF" w:val="clear"/>
           </w:tcPr>
           <w:p>
             <w:pPr>
@@ -367,7 +370,7 @@
               <w:bottom w:w="30" w:type="dxa"/>
               <w:right w:w="40" w:type="dxa"/>
             </w:tcMar>
-            <w:shd w:fill="FAFAFA" w:val="clear"/>
+            <w:shd w:fill="FFFFFF" w:val="clear"/>
           </w:tcPr>
           <w:p>
             <w:pPr>
@@ -920,7 +923,7 @@
               <w:bottom w:w="30" w:type="dxa"/>
               <w:right w:w="40" w:type="dxa"/>
             </w:tcMar>
-            <w:shd w:fill="F5F5F5" w:val="clear"/>
+            <w:shd w:fill="FFFFFF" w:val="clear"/>
           </w:tcPr>
           <w:p>
             <w:pPr>
@@ -947,6 +950,7 @@
               <w:bottom w:w="30" w:type="dxa"/>
               <w:right w:w="40" w:type="dxa"/>
             </w:tcMar>
+            <w:shd w:fill="FFFFFF" w:val="clear"/>
           </w:tcPr>
           <w:p>
             <w:pPr>
@@ -975,7 +979,7 @@
               <w:bottom w:w="30" w:type="dxa"/>
               <w:right w:w="40" w:type="dxa"/>
             </w:tcMar>
-            <w:shd w:fill="F5F5F5" w:val="clear"/>
+            <w:shd w:fill="FFFFFF" w:val="clear"/>
           </w:tcPr>
           <w:p>
             <w:pPr>
@@ -1002,7 +1006,7 @@
               <w:bottom w:w="30" w:type="dxa"/>
               <w:right w:w="40" w:type="dxa"/>
             </w:tcMar>
-            <w:shd w:fill="FAFAFA" w:val="clear"/>
+            <w:shd w:fill="FFFFFF" w:val="clear"/>
           </w:tcPr>
           <w:p>
             <w:pPr>
@@ -1031,7 +1035,7 @@
               <w:bottom w:w="30" w:type="dxa"/>
               <w:right w:w="40" w:type="dxa"/>
             </w:tcMar>
-            <w:shd w:fill="F5F5F5" w:val="clear"/>
+            <w:shd w:fill="FFFFFF" w:val="clear"/>
           </w:tcPr>
           <w:p>
             <w:pPr>
@@ -1058,6 +1062,7 @@
               <w:bottom w:w="30" w:type="dxa"/>
               <w:right w:w="40" w:type="dxa"/>
             </w:tcMar>
+            <w:shd w:fill="FFFFFF" w:val="clear"/>
           </w:tcPr>
           <w:p>
             <w:pPr>
@@ -1086,7 +1091,7 @@
               <w:bottom w:w="30" w:type="dxa"/>
               <w:right w:w="40" w:type="dxa"/>
             </w:tcMar>
-            <w:shd w:fill="F5F5F5" w:val="clear"/>
+            <w:shd w:fill="FFFFFF" w:val="clear"/>
           </w:tcPr>
           <w:p>
             <w:pPr>
@@ -1113,7 +1118,7 @@
               <w:bottom w:w="30" w:type="dxa"/>
               <w:right w:w="40" w:type="dxa"/>
             </w:tcMar>
-            <w:shd w:fill="FAFAFA" w:val="clear"/>
+            <w:shd w:fill="FFFFFF" w:val="clear"/>
           </w:tcPr>
           <w:p>
             <w:pPr>
@@ -1142,7 +1147,7 @@
               <w:bottom w:w="30" w:type="dxa"/>
               <w:right w:w="40" w:type="dxa"/>
             </w:tcMar>
-            <w:shd w:fill="F5F5F5" w:val="clear"/>
+            <w:shd w:fill="FFFFFF" w:val="clear"/>
           </w:tcPr>
           <w:p>
             <w:pPr>
@@ -1169,6 +1174,7 @@
               <w:bottom w:w="30" w:type="dxa"/>
               <w:right w:w="40" w:type="dxa"/>
             </w:tcMar>
+            <w:shd w:fill="FFFFFF" w:val="clear"/>
           </w:tcPr>
           <w:p>
             <w:pPr>
@@ -1197,7 +1203,7 @@
               <w:bottom w:w="30" w:type="dxa"/>
               <w:right w:w="40" w:type="dxa"/>
             </w:tcMar>
-            <w:shd w:fill="F5F5F5" w:val="clear"/>
+            <w:shd w:fill="FFFFFF" w:val="clear"/>
           </w:tcPr>
           <w:p>
             <w:pPr>
@@ -1224,7 +1230,7 @@
               <w:bottom w:w="30" w:type="dxa"/>
               <w:right w:w="40" w:type="dxa"/>
             </w:tcMar>
-            <w:shd w:fill="FAFAFA" w:val="clear"/>
+            <w:shd w:fill="FFFFFF" w:val="clear"/>
           </w:tcPr>
           <w:p>
             <w:pPr>
@@ -1253,7 +1259,7 @@
               <w:bottom w:w="30" w:type="dxa"/>
               <w:right w:w="40" w:type="dxa"/>
             </w:tcMar>
-            <w:shd w:fill="F5F5F5" w:val="clear"/>
+            <w:shd w:fill="FFFFFF" w:val="clear"/>
           </w:tcPr>
           <w:p>
             <w:pPr>
@@ -1280,6 +1286,7 @@
               <w:bottom w:w="30" w:type="dxa"/>
               <w:right w:w="40" w:type="dxa"/>
             </w:tcMar>
+            <w:shd w:fill="FFFFFF" w:val="clear"/>
           </w:tcPr>
           <w:p>
             <w:pPr>
@@ -1308,7 +1315,7 @@
               <w:bottom w:w="30" w:type="dxa"/>
               <w:right w:w="40" w:type="dxa"/>
             </w:tcMar>
-            <w:shd w:fill="F5F5F5" w:val="clear"/>
+            <w:shd w:fill="FFFFFF" w:val="clear"/>
           </w:tcPr>
           <w:p>
             <w:pPr>
@@ -1335,7 +1342,7 @@
               <w:bottom w:w="30" w:type="dxa"/>
               <w:right w:w="40" w:type="dxa"/>
             </w:tcMar>
-            <w:shd w:fill="FAFAFA" w:val="clear"/>
+            <w:shd w:fill="FFFFFF" w:val="clear"/>
           </w:tcPr>
           <w:p>
             <w:pPr>
@@ -1364,7 +1371,7 @@
               <w:bottom w:w="30" w:type="dxa"/>
               <w:right w:w="40" w:type="dxa"/>
             </w:tcMar>
-            <w:shd w:fill="F5F5F5" w:val="clear"/>
+            <w:shd w:fill="FFFFFF" w:val="clear"/>
           </w:tcPr>
           <w:p>
             <w:pPr>
@@ -1391,6 +1398,7 @@
               <w:bottom w:w="30" w:type="dxa"/>
               <w:right w:w="40" w:type="dxa"/>
             </w:tcMar>
+            <w:shd w:fill="FFFFFF" w:val="clear"/>
           </w:tcPr>
           <w:p>
             <w:pPr>
@@ -1419,7 +1427,7 @@
               <w:bottom w:w="30" w:type="dxa"/>
               <w:right w:w="40" w:type="dxa"/>
             </w:tcMar>
-            <w:shd w:fill="F5F5F5" w:val="clear"/>
+            <w:shd w:fill="FFFFFF" w:val="clear"/>
           </w:tcPr>
           <w:p>
             <w:pPr>
@@ -1446,7 +1454,7 @@
               <w:bottom w:w="30" w:type="dxa"/>
               <w:right w:w="40" w:type="dxa"/>
             </w:tcMar>
-            <w:shd w:fill="FAFAFA" w:val="clear"/>
+            <w:shd w:fill="FFFFFF" w:val="clear"/>
           </w:tcPr>
           <w:p>
             <w:pPr>
@@ -1475,7 +1483,7 @@
               <w:bottom w:w="30" w:type="dxa"/>
               <w:right w:w="40" w:type="dxa"/>
             </w:tcMar>
-            <w:shd w:fill="F5F5F5" w:val="clear"/>
+            <w:shd w:fill="FFFFFF" w:val="clear"/>
           </w:tcPr>
           <w:p>
             <w:pPr>
@@ -1502,6 +1510,7 @@
               <w:bottom w:w="30" w:type="dxa"/>
               <w:right w:w="40" w:type="dxa"/>
             </w:tcMar>
+            <w:shd w:fill="FFFFFF" w:val="clear"/>
           </w:tcPr>
           <w:p>
             <w:pPr>
@@ -1530,7 +1539,7 @@
               <w:bottom w:w="30" w:type="dxa"/>
               <w:right w:w="40" w:type="dxa"/>
             </w:tcMar>
-            <w:shd w:fill="F5F5F5" w:val="clear"/>
+            <w:shd w:fill="FFFFFF" w:val="clear"/>
           </w:tcPr>
           <w:p>
             <w:pPr>
@@ -1557,7 +1566,7 @@
               <w:bottom w:w="30" w:type="dxa"/>
               <w:right w:w="40" w:type="dxa"/>
             </w:tcMar>
-            <w:shd w:fill="FAFAFA" w:val="clear"/>
+            <w:shd w:fill="FFFFFF" w:val="clear"/>
           </w:tcPr>
           <w:p>
             <w:pPr>
@@ -1921,7 +1930,7 @@
                     <w:bottom w:w="30" w:type="dxa"/>
                     <w:right w:w="40" w:type="dxa"/>
                   </w:tcMar>
-                  <w:shd w:fill="F5F5F5" w:val="clear"/>
+                  <w:shd w:fill="FFFFFF" w:val="clear"/>
                 </w:tcPr>
                 <w:p>
                   <w:pPr>
@@ -1948,6 +1957,7 @@
                     <w:bottom w:w="30" w:type="dxa"/>
                     <w:right w:w="40" w:type="dxa"/>
                   </w:tcMar>
+                  <w:shd w:fill="FFFFFF" w:val="clear"/>
                 </w:tcPr>
                 <w:p>
                   <w:pPr>
@@ -1976,7 +1986,7 @@
                     <w:bottom w:w="30" w:type="dxa"/>
                     <w:right w:w="40" w:type="dxa"/>
                   </w:tcMar>
-                  <w:shd w:fill="F5F5F5" w:val="clear"/>
+                  <w:shd w:fill="FFFFFF" w:val="clear"/>
                 </w:tcPr>
                 <w:p>
                   <w:pPr>
@@ -2003,7 +2013,7 @@
                     <w:bottom w:w="30" w:type="dxa"/>
                     <w:right w:w="40" w:type="dxa"/>
                   </w:tcMar>
-                  <w:shd w:fill="FAFAFA" w:val="clear"/>
+                  <w:shd w:fill="FFFFFF" w:val="clear"/>
                 </w:tcPr>
                 <w:p>
                   <w:pPr>
@@ -2032,7 +2042,7 @@
                     <w:bottom w:w="30" w:type="dxa"/>
                     <w:right w:w="40" w:type="dxa"/>
                   </w:tcMar>
-                  <w:shd w:fill="F5F5F5" w:val="clear"/>
+                  <w:shd w:fill="FFFFFF" w:val="clear"/>
                 </w:tcPr>
                 <w:p>
                   <w:pPr>
@@ -2059,6 +2069,7 @@
                     <w:bottom w:w="30" w:type="dxa"/>
                     <w:right w:w="40" w:type="dxa"/>
                   </w:tcMar>
+                  <w:shd w:fill="FFFFFF" w:val="clear"/>
                 </w:tcPr>
                 <w:p>
                   <w:pPr>
@@ -2087,7 +2098,7 @@
                     <w:bottom w:w="30" w:type="dxa"/>
                     <w:right w:w="40" w:type="dxa"/>
                   </w:tcMar>
-                  <w:shd w:fill="F5F5F5" w:val="clear"/>
+                  <w:shd w:fill="FFFFFF" w:val="clear"/>
                 </w:tcPr>
                 <w:p>
                   <w:pPr>
@@ -2114,7 +2125,7 @@
                     <w:bottom w:w="30" w:type="dxa"/>
                     <w:right w:w="40" w:type="dxa"/>
                   </w:tcMar>
-                  <w:shd w:fill="FAFAFA" w:val="clear"/>
+                  <w:shd w:fill="FFFFFF" w:val="clear"/>
                 </w:tcPr>
                 <w:p>
                   <w:pPr>
@@ -2143,7 +2154,7 @@
                     <w:bottom w:w="30" w:type="dxa"/>
                     <w:right w:w="40" w:type="dxa"/>
                   </w:tcMar>
-                  <w:shd w:fill="F5F5F5" w:val="clear"/>
+                  <w:shd w:fill="FFFFFF" w:val="clear"/>
                 </w:tcPr>
                 <w:p>
                   <w:pPr>
@@ -2170,6 +2181,7 @@
                     <w:bottom w:w="30" w:type="dxa"/>
                     <w:right w:w="40" w:type="dxa"/>
                   </w:tcMar>
+                  <w:shd w:fill="FFFFFF" w:val="clear"/>
                 </w:tcPr>
                 <w:p>
                   <w:pPr>
@@ -2198,7 +2210,7 @@
                     <w:bottom w:w="30" w:type="dxa"/>
                     <w:right w:w="40" w:type="dxa"/>
                   </w:tcMar>
-                  <w:shd w:fill="F5F5F5" w:val="clear"/>
+                  <w:shd w:fill="FFFFFF" w:val="clear"/>
                 </w:tcPr>
                 <w:p>
                   <w:pPr>
@@ -2225,7 +2237,7 @@
                     <w:bottom w:w="30" w:type="dxa"/>
                     <w:right w:w="40" w:type="dxa"/>
                   </w:tcMar>
-                  <w:shd w:fill="FAFAFA" w:val="clear"/>
+                  <w:shd w:fill="FFFFFF" w:val="clear"/>
                 </w:tcPr>
                 <w:p>
                   <w:pPr>
@@ -2254,7 +2266,7 @@
                     <w:bottom w:w="30" w:type="dxa"/>
                     <w:right w:w="40" w:type="dxa"/>
                   </w:tcMar>
-                  <w:shd w:fill="F5F5F5" w:val="clear"/>
+                  <w:shd w:fill="FFFFFF" w:val="clear"/>
                 </w:tcPr>
                 <w:p>
                   <w:pPr>
@@ -2281,6 +2293,7 @@
                     <w:bottom w:w="30" w:type="dxa"/>
                     <w:right w:w="40" w:type="dxa"/>
                   </w:tcMar>
+                  <w:shd w:fill="FFFFFF" w:val="clear"/>
                 </w:tcPr>
                 <w:p>
                   <w:pPr>
@@ -2309,7 +2322,7 @@
                     <w:bottom w:w="30" w:type="dxa"/>
                     <w:right w:w="40" w:type="dxa"/>
                   </w:tcMar>
-                  <w:shd w:fill="F5F5F5" w:val="clear"/>
+                  <w:shd w:fill="FFFFFF" w:val="clear"/>
                 </w:tcPr>
                 <w:p>
                   <w:pPr>
@@ -2336,7 +2349,7 @@
                     <w:bottom w:w="30" w:type="dxa"/>
                     <w:right w:w="40" w:type="dxa"/>
                   </w:tcMar>
-                  <w:shd w:fill="FAFAFA" w:val="clear"/>
+                  <w:shd w:fill="FFFFFF" w:val="clear"/>
                 </w:tcPr>
                 <w:p>
                   <w:pPr>
@@ -2365,7 +2378,7 @@
                     <w:bottom w:w="30" w:type="dxa"/>
                     <w:right w:w="40" w:type="dxa"/>
                   </w:tcMar>
-                  <w:shd w:fill="F5F5F5" w:val="clear"/>
+                  <w:shd w:fill="FFFFFF" w:val="clear"/>
                 </w:tcPr>
                 <w:p>
                   <w:pPr>
@@ -2392,6 +2405,7 @@
                     <w:bottom w:w="30" w:type="dxa"/>
                     <w:right w:w="40" w:type="dxa"/>
                   </w:tcMar>
+                  <w:shd w:fill="FFFFFF" w:val="clear"/>
                 </w:tcPr>
                 <w:p>
                   <w:pPr>
@@ -2496,7 +2510,7 @@
                     <w:bottom w:w="30" w:type="dxa"/>
                     <w:right w:w="40" w:type="dxa"/>
                   </w:tcMar>
-                  <w:shd w:fill="F5F5F5" w:val="clear"/>
+                  <w:shd w:fill="FFFFFF" w:val="clear"/>
                 </w:tcPr>
                 <w:p>
                   <w:pPr>
@@ -2523,6 +2537,7 @@
                     <w:bottom w:w="30" w:type="dxa"/>
                     <w:right w:w="40" w:type="dxa"/>
                   </w:tcMar>
+                  <w:shd w:fill="FFFFFF" w:val="clear"/>
                 </w:tcPr>
                 <w:p>
                   <w:pPr>
@@ -2551,7 +2566,7 @@
                     <w:bottom w:w="30" w:type="dxa"/>
                     <w:right w:w="40" w:type="dxa"/>
                   </w:tcMar>
-                  <w:shd w:fill="F5F5F5" w:val="clear"/>
+                  <w:shd w:fill="FFFFFF" w:val="clear"/>
                 </w:tcPr>
                 <w:p>
                   <w:pPr>
@@ -2578,7 +2593,7 @@
                     <w:bottom w:w="30" w:type="dxa"/>
                     <w:right w:w="40" w:type="dxa"/>
                   </w:tcMar>
-                  <w:shd w:fill="FAFAFA" w:val="clear"/>
+                  <w:shd w:fill="FFFFFF" w:val="clear"/>
                 </w:tcPr>
                 <w:p>
                   <w:pPr>
@@ -2607,7 +2622,7 @@
                     <w:bottom w:w="30" w:type="dxa"/>
                     <w:right w:w="40" w:type="dxa"/>
                   </w:tcMar>
-                  <w:shd w:fill="F5F5F5" w:val="clear"/>
+                  <w:shd w:fill="FFFFFF" w:val="clear"/>
                 </w:tcPr>
                 <w:p>
                   <w:pPr>
@@ -2634,6 +2649,7 @@
                     <w:bottom w:w="30" w:type="dxa"/>
                     <w:right w:w="40" w:type="dxa"/>
                   </w:tcMar>
+                  <w:shd w:fill="FFFFFF" w:val="clear"/>
                 </w:tcPr>
                 <w:p>
                   <w:pPr>
@@ -2662,7 +2678,7 @@
                     <w:bottom w:w="30" w:type="dxa"/>
                     <w:right w:w="40" w:type="dxa"/>
                   </w:tcMar>
-                  <w:shd w:fill="F5F5F5" w:val="clear"/>
+                  <w:shd w:fill="FFFFFF" w:val="clear"/>
                 </w:tcPr>
                 <w:p>
                   <w:pPr>
@@ -2689,7 +2705,7 @@
                     <w:bottom w:w="30" w:type="dxa"/>
                     <w:right w:w="40" w:type="dxa"/>
                   </w:tcMar>
-                  <w:shd w:fill="FAFAFA" w:val="clear"/>
+                  <w:shd w:fill="FFFFFF" w:val="clear"/>
                 </w:tcPr>
                 <w:p>
                   <w:pPr>
@@ -2718,7 +2734,7 @@
                     <w:bottom w:w="30" w:type="dxa"/>
                     <w:right w:w="40" w:type="dxa"/>
                   </w:tcMar>
-                  <w:shd w:fill="F5F5F5" w:val="clear"/>
+                  <w:shd w:fill="FFFFFF" w:val="clear"/>
                 </w:tcPr>
                 <w:p>
                   <w:pPr>
@@ -2745,6 +2761,7 @@
                     <w:bottom w:w="30" w:type="dxa"/>
                     <w:right w:w="40" w:type="dxa"/>
                   </w:tcMar>
+                  <w:shd w:fill="FFFFFF" w:val="clear"/>
                 </w:tcPr>
                 <w:p>
                   <w:pPr>
@@ -2773,7 +2790,7 @@
                     <w:bottom w:w="30" w:type="dxa"/>
                     <w:right w:w="40" w:type="dxa"/>
                   </w:tcMar>
-                  <w:shd w:fill="F5F5F5" w:val="clear"/>
+                  <w:shd w:fill="FFFFFF" w:val="clear"/>
                 </w:tcPr>
                 <w:p>
                   <w:pPr>
@@ -2800,7 +2817,7 @@
                     <w:bottom w:w="30" w:type="dxa"/>
                     <w:right w:w="40" w:type="dxa"/>
                   </w:tcMar>
-                  <w:shd w:fill="FAFAFA" w:val="clear"/>
+                  <w:shd w:fill="FFFFFF" w:val="clear"/>
                 </w:tcPr>
                 <w:p>
                   <w:pPr>
@@ -2829,7 +2846,7 @@
                     <w:bottom w:w="30" w:type="dxa"/>
                     <w:right w:w="40" w:type="dxa"/>
                   </w:tcMar>
-                  <w:shd w:fill="F5F5F5" w:val="clear"/>
+                  <w:shd w:fill="FFFFFF" w:val="clear"/>
                 </w:tcPr>
                 <w:p>
                   <w:pPr>
@@ -2856,6 +2873,7 @@
                     <w:bottom w:w="30" w:type="dxa"/>
                     <w:right w:w="40" w:type="dxa"/>
                   </w:tcMar>
+                  <w:shd w:fill="FFFFFF" w:val="clear"/>
                 </w:tcPr>
                 <w:p>
                   <w:pPr>
@@ -2884,7 +2902,7 @@
                     <w:bottom w:w="30" w:type="dxa"/>
                     <w:right w:w="40" w:type="dxa"/>
                   </w:tcMar>
-                  <w:shd w:fill="F5F5F5" w:val="clear"/>
+                  <w:shd w:fill="FFFFFF" w:val="clear"/>
                 </w:tcPr>
                 <w:p>
                   <w:pPr>
@@ -2911,7 +2929,7 @@
                     <w:bottom w:w="30" w:type="dxa"/>
                     <w:right w:w="40" w:type="dxa"/>
                   </w:tcMar>
-                  <w:shd w:fill="FAFAFA" w:val="clear"/>
+                  <w:shd w:fill="FFFFFF" w:val="clear"/>
                 </w:tcPr>
                 <w:p>
                   <w:pPr>
@@ -2940,7 +2958,7 @@
                     <w:bottom w:w="30" w:type="dxa"/>
                     <w:right w:w="40" w:type="dxa"/>
                   </w:tcMar>
-                  <w:shd w:fill="F5F5F5" w:val="clear"/>
+                  <w:shd w:fill="FFFFFF" w:val="clear"/>
                 </w:tcPr>
                 <w:p>
                   <w:pPr>
@@ -2967,6 +2985,7 @@
                     <w:bottom w:w="30" w:type="dxa"/>
                     <w:right w:w="40" w:type="dxa"/>
                   </w:tcMar>
+                  <w:shd w:fill="FFFFFF" w:val="clear"/>
                 </w:tcPr>
                 <w:p>
                   <w:pPr>
@@ -2995,7 +3014,7 @@
                     <w:bottom w:w="30" w:type="dxa"/>
                     <w:right w:w="40" w:type="dxa"/>
                   </w:tcMar>
-                  <w:shd w:fill="F5F5F5" w:val="clear"/>
+                  <w:shd w:fill="FFFFFF" w:val="clear"/>
                 </w:tcPr>
                 <w:p>
                   <w:pPr>
@@ -3022,7 +3041,7 @@
                     <w:bottom w:w="30" w:type="dxa"/>
                     <w:right w:w="40" w:type="dxa"/>
                   </w:tcMar>
-                  <w:shd w:fill="FAFAFA" w:val="clear"/>
+                  <w:shd w:fill="FFFFFF" w:val="clear"/>
                 </w:tcPr>
                 <w:p>
                   <w:pPr>
@@ -3051,7 +3070,7 @@
                     <w:bottom w:w="30" w:type="dxa"/>
                     <w:right w:w="40" w:type="dxa"/>
                   </w:tcMar>
-                  <w:shd w:fill="F5F5F5" w:val="clear"/>
+                  <w:shd w:fill="FFFFFF" w:val="clear"/>
                 </w:tcPr>
                 <w:p>
                   <w:pPr>
@@ -3078,6 +3097,7 @@
                     <w:bottom w:w="30" w:type="dxa"/>
                     <w:right w:w="40" w:type="dxa"/>
                   </w:tcMar>
+                  <w:shd w:fill="FFFFFF" w:val="clear"/>
                 </w:tcPr>
                 <w:p>
                   <w:pPr>

</xml_diff>